<commit_message>
readd documents about demo and ,add MS with wiley's help
</commit_message>
<xml_diff>
--- a/demo介绍.docx
+++ b/demo介绍.docx
@@ -2,25 +2,6 @@
 <file path=word/document.xml><?xml version="1.0" encoding="utf-8"?>
 <w:document xmlns:wpc="http://schemas.microsoft.com/office/word/2010/wordprocessingCanvas" xmlns:cx="http://schemas.microsoft.com/office/drawing/2014/chartex" xmlns:cx1="http://schemas.microsoft.com/office/drawing/2015/9/8/chartex" xmlns:cx2="http://schemas.microsoft.com/office/drawing/2015/10/21/chartex" xmlns:cx3="http://schemas.microsoft.com/office/drawing/2016/5/9/chartex" xmlns:cx4="http://schemas.microsoft.com/office/drawing/2016/5/10/chartex" xmlns:cx5="http://schemas.microsoft.com/office/drawing/2016/5/11/chartex" xmlns:cx6="http://schemas.microsoft.com/office/drawing/2016/5/12/chartex" xmlns:cx7="http://schemas.microsoft.com/office/drawing/2016/5/13/chartex" xmlns:cx8="http://schemas.microsoft.com/office/drawing/2016/5/14/chartex" xmlns:mc="http://schemas.openxmlformats.org/markup-compatibility/2006" xmlns:aink="http://schemas.microsoft.com/office/drawing/2016/ink" xmlns:am3d="http://schemas.microsoft.com/office/drawing/2017/model3d" xmlns:o="urn:schemas-microsoft-com:office:office" xmlns:r="http://schemas.openxmlformats.org/officeDocument/2006/relationships" xmlns:m="http://schemas.openxmlformats.org/officeDocument/2006/math" xmlns:v="urn:schemas-microsoft-com:vml" xmlns:wp14="http://schemas.microsoft.com/office/word/2010/wordprocessingDrawing" xmlns:wp="http://schemas.openxmlformats.org/drawingml/2006/wordprocessingDrawing" xmlns:w10="urn:schemas-microsoft-com:office:word" xmlns:w="http://schemas.openxmlformats.org/wordprocessingml/2006/main" xmlns:w14="http://schemas.microsoft.com/office/word/2010/wordml" xmlns:w15="http://schemas.microsoft.com/office/word/2012/wordml" xmlns:w16cid="http://schemas.microsoft.com/office/word/2016/wordml/cid" xmlns:w16se="http://schemas.microsoft.com/office/word/2015/wordml/symex" xmlns:wpg="http://schemas.microsoft.com/office/word/2010/wordprocessingGroup" xmlns:wpi="http://schemas.microsoft.com/office/word/2010/wordprocessingInk" xmlns:wne="http://schemas.microsoft.com/office/word/2006/wordml" xmlns:wps="http://schemas.microsoft.com/office/word/2010/wordprocessingShape" mc:Ignorable="w14 w15 w16se w16cid wp14">
   <w:body>
-    <w:p>
-      <w:r>
-        <w:rPr>
-          <w:rFonts w:hint="eastAsia"/>
-        </w:rPr>
-        <w:t>即使是</w:t>
-      </w:r>
-      <w:r>
-        <w:t>AI</w:t>
-      </w:r>
-      <w:r>
-        <w:rPr>
-          <w:rFonts w:hint="eastAsia"/>
-        </w:rPr>
-        <w:t>测试这种想要直观的获得各种参数测试的结果，也是一种参数依赖型的试验。本系统可以方便此类工作！</w:t>
-      </w:r>
-      <w:bookmarkStart w:id="0" w:name="_GoBack"/>
-      <w:bookmarkEnd w:id="0"/>
-    </w:p>
     <w:p>
       <w:r>
         <w:rPr>
@@ -794,7 +775,6 @@
         <w:rPr>
           <w:noProof/>
         </w:rPr>
-        <w:lastRenderedPageBreak/>
         <w:drawing>
           <wp:inline distT="0" distB="0" distL="0" distR="0" wp14:anchorId="043D62C6" wp14:editId="4B721290">
             <wp:extent cx="3400000" cy="761905"/>
@@ -854,6 +834,7 @@
         <w:rPr>
           <w:noProof/>
         </w:rPr>
+        <w:lastRenderedPageBreak/>
         <w:drawing>
           <wp:inline distT="0" distB="0" distL="0" distR="0" wp14:anchorId="2C881730" wp14:editId="544C0F1A">
             <wp:extent cx="3200000" cy="704762"/>
@@ -2779,6 +2760,73 @@
           <w:szCs w:val="21"/>
         </w:rPr>
         <w:t>磁盘管理，资源管理，数据报表自动批量生成等。。。</w:t>
+      </w:r>
+      <w:bookmarkStart w:id="0" w:name="_GoBack"/>
+      <w:bookmarkEnd w:id="0"/>
+    </w:p>
+    <w:p>
+      <w:pPr>
+        <w:rPr>
+          <w:rFonts w:asciiTheme="minorEastAsia" w:hAnsiTheme="minorEastAsia" w:cs="Times New Roman" w:hint="eastAsia"/>
+          <w:color w:val="000000" w:themeColor="text1"/>
+          <w:szCs w:val="21"/>
+        </w:rPr>
+      </w:pPr>
+      <w:r>
+        <w:rPr>
+          <w:rFonts w:asciiTheme="minorEastAsia" w:hAnsiTheme="minorEastAsia" w:cs="Times New Roman" w:hint="eastAsia"/>
+          <w:noProof/>
+          <w:color w:val="000000" w:themeColor="text1"/>
+          <w:szCs w:val="21"/>
+        </w:rPr>
+        <w:drawing>
+          <wp:inline distT="0" distB="0" distL="0" distR="0">
+            <wp:extent cx="5274310" cy="4286250"/>
+            <wp:effectExtent l="0" t="0" r="2540" b="0"/>
+            <wp:docPr id="3" name="图片 3"/>
+            <wp:cNvGraphicFramePr>
+              <a:graphicFrameLocks xmlns:a="http://schemas.openxmlformats.org/drawingml/2006/main" noChangeAspect="1"/>
+            </wp:cNvGraphicFramePr>
+            <a:graphic xmlns:a="http://schemas.openxmlformats.org/drawingml/2006/main">
+              <a:graphicData uri="http://schemas.openxmlformats.org/drawingml/2006/picture">
+                <pic:pic xmlns:pic="http://schemas.openxmlformats.org/drawingml/2006/picture">
+                  <pic:nvPicPr>
+                    <pic:cNvPr id="3" name="web.jpg"/>
+                    <pic:cNvPicPr/>
+                  </pic:nvPicPr>
+                  <pic:blipFill rotWithShape="1">
+                    <a:blip r:embed="rId22" cstate="print">
+                      <a:extLst>
+                        <a:ext uri="{28A0092B-C50C-407E-A947-70E740481C1C}">
+                          <a14:useLocalDpi xmlns:a14="http://schemas.microsoft.com/office/drawing/2010/main" val="0"/>
+                        </a:ext>
+                      </a:extLst>
+                    </a:blip>
+                    <a:srcRect b="42548"/>
+                    <a:stretch/>
+                  </pic:blipFill>
+                  <pic:spPr bwMode="auto">
+                    <a:xfrm>
+                      <a:off x="0" y="0"/>
+                      <a:ext cx="5274310" cy="4286250"/>
+                    </a:xfrm>
+                    <a:prstGeom prst="rect">
+                      <a:avLst/>
+                    </a:prstGeom>
+                    <a:ln>
+                      <a:noFill/>
+                    </a:ln>
+                    <a:extLst>
+                      <a:ext uri="{53640926-AAD7-44D8-BBD7-CCE9431645EC}">
+                        <a14:shadowObscured xmlns:a14="http://schemas.microsoft.com/office/drawing/2010/main"/>
+                      </a:ext>
+                    </a:extLst>
+                  </pic:spPr>
+                </pic:pic>
+              </a:graphicData>
+            </a:graphic>
+          </wp:inline>
+        </w:drawing>
       </w:r>
     </w:p>
     <w:sectPr>
@@ -3296,7 +3344,7 @@
     <w:link w:val="a7"/>
     <w:uiPriority w:val="99"/>
     <w:unhideWhenUsed/>
-    <w:rsid w:val="001B04C2"/>
+    <w:rsid w:val="008A44B4"/>
     <w:pPr>
       <w:pBdr>
         <w:bottom w:val="single" w:sz="6" w:space="1" w:color="auto"/>
@@ -3318,7 +3366,7 @@
     <w:basedOn w:val="a0"/>
     <w:link w:val="a6"/>
     <w:uiPriority w:val="99"/>
-    <w:rsid w:val="001B04C2"/>
+    <w:rsid w:val="008A44B4"/>
     <w:rPr>
       <w:sz w:val="18"/>
       <w:szCs w:val="18"/>
@@ -3330,7 +3378,7 @@
     <w:link w:val="a9"/>
     <w:uiPriority w:val="99"/>
     <w:unhideWhenUsed/>
-    <w:rsid w:val="001B04C2"/>
+    <w:rsid w:val="008A44B4"/>
     <w:pPr>
       <w:tabs>
         <w:tab w:val="center" w:pos="4153"/>
@@ -3349,7 +3397,7 @@
     <w:basedOn w:val="a0"/>
     <w:link w:val="a8"/>
     <w:uiPriority w:val="99"/>
-    <w:rsid w:val="001B04C2"/>
+    <w:rsid w:val="008A44B4"/>
     <w:rPr>
       <w:sz w:val="18"/>
       <w:szCs w:val="18"/>

</xml_diff>

<commit_message>
coverletter science-ME.docx -> coverletter science-EE.docx and ready to ME again add resubmit fold containing new modified MS
</commit_message>
<xml_diff>
--- a/demo介绍.docx
+++ b/demo介绍.docx
@@ -2,6 +2,99 @@
 <file path=word/document.xml><?xml version="1.0" encoding="utf-8"?>
 <w:document xmlns:wpc="http://schemas.microsoft.com/office/word/2010/wordprocessingCanvas" xmlns:cx="http://schemas.microsoft.com/office/drawing/2014/chartex" xmlns:cx1="http://schemas.microsoft.com/office/drawing/2015/9/8/chartex" xmlns:cx2="http://schemas.microsoft.com/office/drawing/2015/10/21/chartex" xmlns:cx3="http://schemas.microsoft.com/office/drawing/2016/5/9/chartex" xmlns:cx4="http://schemas.microsoft.com/office/drawing/2016/5/10/chartex" xmlns:cx5="http://schemas.microsoft.com/office/drawing/2016/5/11/chartex" xmlns:cx6="http://schemas.microsoft.com/office/drawing/2016/5/12/chartex" xmlns:cx7="http://schemas.microsoft.com/office/drawing/2016/5/13/chartex" xmlns:cx8="http://schemas.microsoft.com/office/drawing/2016/5/14/chartex" xmlns:mc="http://schemas.openxmlformats.org/markup-compatibility/2006" xmlns:aink="http://schemas.microsoft.com/office/drawing/2016/ink" xmlns:am3d="http://schemas.microsoft.com/office/drawing/2017/model3d" xmlns:o="urn:schemas-microsoft-com:office:office" xmlns:r="http://schemas.openxmlformats.org/officeDocument/2006/relationships" xmlns:m="http://schemas.openxmlformats.org/officeDocument/2006/math" xmlns:v="urn:schemas-microsoft-com:vml" xmlns:wp14="http://schemas.microsoft.com/office/word/2010/wordprocessingDrawing" xmlns:wp="http://schemas.openxmlformats.org/drawingml/2006/wordprocessingDrawing" xmlns:w10="urn:schemas-microsoft-com:office:word" xmlns:w="http://schemas.openxmlformats.org/wordprocessingml/2006/main" xmlns:w14="http://schemas.microsoft.com/office/word/2010/wordml" xmlns:w15="http://schemas.microsoft.com/office/word/2012/wordml" xmlns:w16cid="http://schemas.microsoft.com/office/word/2016/wordml/cid" xmlns:w16se="http://schemas.microsoft.com/office/word/2015/wordml/symex" xmlns:wpg="http://schemas.microsoft.com/office/word/2010/wordprocessingGroup" xmlns:wpi="http://schemas.microsoft.com/office/word/2010/wordprocessingInk" xmlns:wne="http://schemas.microsoft.com/office/word/2006/wordml" xmlns:wps="http://schemas.microsoft.com/office/word/2010/wordprocessingShape" mc:Ignorable="w14 w15 w16se w16cid wp14">
   <w:body>
+    <w:p>
+      <w:r>
+        <w:rPr>
+          <w:rFonts w:hint="eastAsia"/>
+        </w:rPr>
+        <w:t>本人</w:t>
+      </w:r>
+      <w:r>
+        <w:rPr>
+          <w:rFonts w:hint="eastAsia"/>
+        </w:rPr>
+        <w:t>空余时间做了一个生物信息自动化分析系统的</w:t>
+      </w:r>
+      <w:r>
+        <w:t>demo，就是在</w:t>
+      </w:r>
+      <w:r>
+        <w:rPr>
+          <w:rFonts w:hint="eastAsia"/>
+        </w:rPr>
+        <w:t>本人</w:t>
+      </w:r>
+      <w:r>
+        <w:t>从一开始做二代测序数据分析就认为需要有的这么一个东西，在博士论文里面略有提及。现在把这个东西的demo做出来，一是觉得它也许能为实验室或者产业化方面做一点贡献，也是想</w:t>
+      </w:r>
+      <w:proofErr w:type="gramStart"/>
+      <w:r>
+        <w:t>把之前</w:t>
+      </w:r>
+      <w:proofErr w:type="gramEnd"/>
+      <w:r>
+        <w:t>设想的做了一半的东西具体进一步的整理和实现一下，做一个收尾结束。个人觉得这个东西可以对很多生物信息数据分析工作有贡献</w:t>
+      </w:r>
+      <w:r>
+        <w:rPr>
+          <w:rFonts w:hint="eastAsia"/>
+        </w:rPr>
+        <w:t>或者是改进</w:t>
+      </w:r>
+      <w:r>
+        <w:t>一些工作方式，能够加速研究，所以</w:t>
+      </w:r>
+      <w:r>
+        <w:rPr>
+          <w:rFonts w:hint="eastAsia"/>
+        </w:rPr>
+        <w:t>介绍一下</w:t>
+      </w:r>
+      <w:r>
+        <w:t>有这么个东西，这么个思路，可以做这样的事情，可以</w:t>
+      </w:r>
+      <w:r>
+        <w:rPr>
+          <w:rFonts w:hint="eastAsia"/>
+        </w:rPr>
+        <w:t>这样做事情。</w:t>
+      </w:r>
+    </w:p>
+    <w:p>
+      <w:r>
+        <w:rPr>
+          <w:rFonts w:hint="eastAsia"/>
+        </w:rPr>
+        <w:t>简单介绍一下它现在</w:t>
+      </w:r>
+      <w:bookmarkStart w:id="0" w:name="_GoBack"/>
+      <w:bookmarkEnd w:id="0"/>
+      <w:r>
+        <w:rPr>
+          <w:rFonts w:hint="eastAsia"/>
+        </w:rPr>
+        <w:t>非常初步的功能：</w:t>
+      </w:r>
+    </w:p>
+    <w:p>
+      <w:r>
+        <w:rPr>
+          <w:rFonts w:hint="eastAsia"/>
+        </w:rPr>
+        <w:t>写了一个功能介绍文档</w:t>
+      </w:r>
+      <w:r>
+        <w:t xml:space="preserve"> 在 https://github.com/vitogump/life/tree/mergetocompass 中 下载lifeWebBasedSystemUserGuide.pptx文件有个非常粗</w:t>
+      </w:r>
+    </w:p>
+    <w:p>
+      <w:r>
+        <w:rPr>
+          <w:rFonts w:hint="eastAsia"/>
+        </w:rPr>
+        <w:t>糙的介绍：</w:t>
+      </w:r>
+    </w:p>
     <w:p>
       <w:r>
         <w:rPr>
@@ -197,7 +290,7 @@
                     </pic:cNvPicPr>
                   </pic:nvPicPr>
                   <pic:blipFill>
-                    <a:blip r:embed="rId6" cstate="print">
+                    <a:blip r:embed="rId7" cstate="print">
                       <a:extLst>
                         <a:ext uri="{28A0092B-C50C-407E-A947-70E740481C1C}">
                           <a14:useLocalDpi xmlns:a14="http://schemas.microsoft.com/office/drawing/2010/main" val="0"/>
@@ -247,7 +340,7 @@
                     </pic:cNvPicPr>
                   </pic:nvPicPr>
                   <pic:blipFill>
-                    <a:blip r:embed="rId7" cstate="print">
+                    <a:blip r:embed="rId8" cstate="print">
                       <a:extLst>
                         <a:ext uri="{28A0092B-C50C-407E-A947-70E740481C1C}">
                           <a14:useLocalDpi xmlns:a14="http://schemas.microsoft.com/office/drawing/2010/main" val="0"/>
@@ -371,7 +464,7 @@
                     <pic:cNvPicPr/>
                   </pic:nvPicPr>
                   <pic:blipFill>
-                    <a:blip r:embed="rId8">
+                    <a:blip r:embed="rId9">
                       <a:extLst>
                         <a:ext uri="{28A0092B-C50C-407E-A947-70E740481C1C}">
                           <a14:useLocalDpi xmlns:a14="http://schemas.microsoft.com/office/drawing/2010/main" val="0"/>
@@ -526,7 +619,7 @@
                     <pic:cNvPicPr/>
                   </pic:nvPicPr>
                   <pic:blipFill>
-                    <a:blip r:embed="rId9">
+                    <a:blip r:embed="rId10">
                       <a:extLst>
                         <a:ext uri="{28A0092B-C50C-407E-A947-70E740481C1C}">
                           <a14:useLocalDpi xmlns:a14="http://schemas.microsoft.com/office/drawing/2010/main" val="0"/>
@@ -597,7 +690,7 @@
                     <pic:cNvPicPr/>
                   </pic:nvPicPr>
                   <pic:blipFill>
-                    <a:blip r:embed="rId10">
+                    <a:blip r:embed="rId11">
                       <a:extLst>
                         <a:ext uri="{28A0092B-C50C-407E-A947-70E740481C1C}">
                           <a14:useLocalDpi xmlns:a14="http://schemas.microsoft.com/office/drawing/2010/main" val="0"/>
@@ -700,86 +793,12 @@
           <w:rFonts w:ascii="楷体" w:eastAsia="楷体" w:hAnsi="楷体"/>
           <w:noProof/>
         </w:rPr>
+        <w:lastRenderedPageBreak/>
         <w:drawing>
           <wp:inline distT="0" distB="0" distL="0" distR="0" wp14:anchorId="26930665" wp14:editId="6513D451">
             <wp:extent cx="3114286" cy="238095"/>
             <wp:effectExtent l="0" t="0" r="0" b="0"/>
             <wp:docPr id="16" name="图片 16"/>
-            <wp:cNvGraphicFramePr>
-              <a:graphicFrameLocks xmlns:a="http://schemas.openxmlformats.org/drawingml/2006/main" noChangeAspect="1"/>
-            </wp:cNvGraphicFramePr>
-            <a:graphic xmlns:a="http://schemas.openxmlformats.org/drawingml/2006/main">
-              <a:graphicData uri="http://schemas.openxmlformats.org/drawingml/2006/picture">
-                <pic:pic xmlns:pic="http://schemas.openxmlformats.org/drawingml/2006/picture">
-                  <pic:nvPicPr>
-                    <pic:cNvPr id="1" name=""/>
-                    <pic:cNvPicPr/>
-                  </pic:nvPicPr>
-                  <pic:blipFill>
-                    <a:blip r:embed="rId11"/>
-                    <a:stretch>
-                      <a:fillRect/>
-                    </a:stretch>
-                  </pic:blipFill>
-                  <pic:spPr>
-                    <a:xfrm>
-                      <a:off x="0" y="0"/>
-                      <a:ext cx="3114286" cy="238095"/>
-                    </a:xfrm>
-                    <a:prstGeom prst="rect">
-                      <a:avLst/>
-                    </a:prstGeom>
-                  </pic:spPr>
-                </pic:pic>
-              </a:graphicData>
-            </a:graphic>
-          </wp:inline>
-        </w:drawing>
-      </w:r>
-    </w:p>
-    <w:p>
-      <w:pPr>
-        <w:rPr>
-          <w:rFonts w:ascii="楷体" w:eastAsia="楷体" w:hAnsi="楷体"/>
-          <w:sz w:val="24"/>
-          <w:szCs w:val="24"/>
-        </w:rPr>
-      </w:pPr>
-      <w:r>
-        <w:rPr>
-          <w:rFonts w:ascii="楷体" w:eastAsia="楷体" w:hAnsi="楷体" w:hint="eastAsia"/>
-          <w:sz w:val="24"/>
-          <w:szCs w:val="24"/>
-        </w:rPr>
-        <w:t>要求这个目录下的后缀为 1.fq.gz 和 2.fq.gz的文件 作为输入，并且脚本中用-</w:t>
-      </w:r>
-      <w:r>
-        <w:rPr>
-          <w:rFonts w:ascii="楷体" w:eastAsia="楷体" w:hAnsi="楷体"/>
-          <w:sz w:val="24"/>
-          <w:szCs w:val="24"/>
-        </w:rPr>
-        <w:t xml:space="preserve">1 -2 </w:t>
-      </w:r>
-      <w:r>
-        <w:rPr>
-          <w:rFonts w:ascii="楷体" w:eastAsia="楷体" w:hAnsi="楷体" w:hint="eastAsia"/>
-          <w:sz w:val="24"/>
-          <w:szCs w:val="24"/>
-        </w:rPr>
-        <w:t>两个选项来接受对应的输入：</w:t>
-      </w:r>
-    </w:p>
-    <w:p>
-      <w:r>
-        <w:rPr>
-          <w:noProof/>
-        </w:rPr>
-        <w:drawing>
-          <wp:inline distT="0" distB="0" distL="0" distR="0" wp14:anchorId="043D62C6" wp14:editId="4B721290">
-            <wp:extent cx="3400000" cy="761905"/>
-            <wp:effectExtent l="0" t="0" r="0" b="635"/>
-            <wp:docPr id="17" name="图片 17"/>
             <wp:cNvGraphicFramePr>
               <a:graphicFrameLocks xmlns:a="http://schemas.openxmlformats.org/drawingml/2006/main" noChangeAspect="1"/>
             </wp:cNvGraphicFramePr>
@@ -799,6 +818,81 @@
                   <pic:spPr>
                     <a:xfrm>
                       <a:off x="0" y="0"/>
+                      <a:ext cx="3114286" cy="238095"/>
+                    </a:xfrm>
+                    <a:prstGeom prst="rect">
+                      <a:avLst/>
+                    </a:prstGeom>
+                  </pic:spPr>
+                </pic:pic>
+              </a:graphicData>
+            </a:graphic>
+          </wp:inline>
+        </w:drawing>
+      </w:r>
+    </w:p>
+    <w:p>
+      <w:pPr>
+        <w:rPr>
+          <w:rFonts w:ascii="楷体" w:eastAsia="楷体" w:hAnsi="楷体"/>
+          <w:sz w:val="24"/>
+          <w:szCs w:val="24"/>
+        </w:rPr>
+      </w:pPr>
+      <w:r>
+        <w:rPr>
+          <w:rFonts w:ascii="楷体" w:eastAsia="楷体" w:hAnsi="楷体" w:hint="eastAsia"/>
+          <w:sz w:val="24"/>
+          <w:szCs w:val="24"/>
+        </w:rPr>
+        <w:t>要求这个目录下的后缀为 1.fq.gz 和 2.fq.gz的文件 作为输入，并且脚本中用-</w:t>
+      </w:r>
+      <w:r>
+        <w:rPr>
+          <w:rFonts w:ascii="楷体" w:eastAsia="楷体" w:hAnsi="楷体"/>
+          <w:sz w:val="24"/>
+          <w:szCs w:val="24"/>
+        </w:rPr>
+        <w:t xml:space="preserve">1 -2 </w:t>
+      </w:r>
+      <w:r>
+        <w:rPr>
+          <w:rFonts w:ascii="楷体" w:eastAsia="楷体" w:hAnsi="楷体" w:hint="eastAsia"/>
+          <w:sz w:val="24"/>
+          <w:szCs w:val="24"/>
+        </w:rPr>
+        <w:t>两个选项来接受对应的输入：</w:t>
+      </w:r>
+    </w:p>
+    <w:p>
+      <w:r>
+        <w:rPr>
+          <w:noProof/>
+        </w:rPr>
+        <w:drawing>
+          <wp:inline distT="0" distB="0" distL="0" distR="0" wp14:anchorId="043D62C6" wp14:editId="4B721290">
+            <wp:extent cx="3400000" cy="761905"/>
+            <wp:effectExtent l="0" t="0" r="0" b="635"/>
+            <wp:docPr id="17" name="图片 17"/>
+            <wp:cNvGraphicFramePr>
+              <a:graphicFrameLocks xmlns:a="http://schemas.openxmlformats.org/drawingml/2006/main" noChangeAspect="1"/>
+            </wp:cNvGraphicFramePr>
+            <a:graphic xmlns:a="http://schemas.openxmlformats.org/drawingml/2006/main">
+              <a:graphicData uri="http://schemas.openxmlformats.org/drawingml/2006/picture">
+                <pic:pic xmlns:pic="http://schemas.openxmlformats.org/drawingml/2006/picture">
+                  <pic:nvPicPr>
+                    <pic:cNvPr id="1" name=""/>
+                    <pic:cNvPicPr/>
+                  </pic:nvPicPr>
+                  <pic:blipFill>
+                    <a:blip r:embed="rId13"/>
+                    <a:stretch>
+                      <a:fillRect/>
+                    </a:stretch>
+                  </pic:blipFill>
+                  <pic:spPr>
+                    <a:xfrm>
+                      <a:off x="0" y="0"/>
                       <a:ext cx="3400000" cy="761905"/>
                     </a:xfrm>
                     <a:prstGeom prst="rect">
@@ -834,7 +928,6 @@
         <w:rPr>
           <w:noProof/>
         </w:rPr>
-        <w:lastRenderedPageBreak/>
         <w:drawing>
           <wp:inline distT="0" distB="0" distL="0" distR="0" wp14:anchorId="2C881730" wp14:editId="544C0F1A">
             <wp:extent cx="3200000" cy="704762"/>
@@ -851,7 +944,7 @@
                     <pic:cNvPicPr/>
                   </pic:nvPicPr>
                   <pic:blipFill>
-                    <a:blip r:embed="rId13"/>
+                    <a:blip r:embed="rId14"/>
                     <a:stretch>
                       <a:fillRect/>
                     </a:stretch>
@@ -1050,7 +1143,7 @@
                     <pic:cNvPicPr/>
                   </pic:nvPicPr>
                   <pic:blipFill>
-                    <a:blip r:embed="rId14"/>
+                    <a:blip r:embed="rId15"/>
                     <a:stretch>
                       <a:fillRect/>
                     </a:stretch>
@@ -1670,7 +1763,15 @@
           <w:rFonts w:ascii="楷体" w:eastAsia="楷体" w:hAnsi="楷体" w:hint="eastAsia"/>
           <w:noProof/>
         </w:rPr>
-        <w:t>二级子目录或者二级子目录下没有满足要求的输入，将自动跳过</w:t>
+        <w:t>二级子</w:t>
+      </w:r>
+      <w:r>
+        <w:rPr>
+          <w:rFonts w:ascii="楷体" w:eastAsia="楷体" w:hAnsi="楷体" w:hint="eastAsia"/>
+          <w:noProof/>
+        </w:rPr>
+        <w:lastRenderedPageBreak/>
+        <w:t>目录或者二级子目录下没有满足要求的输入，将自动跳过</w:t>
       </w:r>
       <w:r>
         <w:rPr>
@@ -1724,139 +1825,11 @@
         <w:rPr>
           <w:noProof/>
         </w:rPr>
-        <w:lastRenderedPageBreak/>
         <w:drawing>
           <wp:inline distT="0" distB="0" distL="0" distR="0" wp14:anchorId="571A26A9" wp14:editId="425B3A53">
             <wp:extent cx="3200000" cy="2371429"/>
             <wp:effectExtent l="0" t="0" r="635" b="0"/>
             <wp:docPr id="49" name="图片 49"/>
-            <wp:cNvGraphicFramePr>
-              <a:graphicFrameLocks xmlns:a="http://schemas.openxmlformats.org/drawingml/2006/main" noChangeAspect="1"/>
-            </wp:cNvGraphicFramePr>
-            <a:graphic xmlns:a="http://schemas.openxmlformats.org/drawingml/2006/main">
-              <a:graphicData uri="http://schemas.openxmlformats.org/drawingml/2006/picture">
-                <pic:pic xmlns:pic="http://schemas.openxmlformats.org/drawingml/2006/picture">
-                  <pic:nvPicPr>
-                    <pic:cNvPr id="1" name=""/>
-                    <pic:cNvPicPr/>
-                  </pic:nvPicPr>
-                  <pic:blipFill>
-                    <a:blip r:embed="rId15"/>
-                    <a:stretch>
-                      <a:fillRect/>
-                    </a:stretch>
-                  </pic:blipFill>
-                  <pic:spPr>
-                    <a:xfrm>
-                      <a:off x="0" y="0"/>
-                      <a:ext cx="3200000" cy="2371429"/>
-                    </a:xfrm>
-                    <a:prstGeom prst="rect">
-                      <a:avLst/>
-                    </a:prstGeom>
-                  </pic:spPr>
-                </pic:pic>
-              </a:graphicData>
-            </a:graphic>
-          </wp:inline>
-        </w:drawing>
-      </w:r>
-    </w:p>
-    <w:p>
-      <w:pPr>
-        <w:rPr>
-          <w:rFonts w:ascii="Times New Roman" w:eastAsia="楷体" w:hAnsi="Times New Roman" w:cs="Times New Roman"/>
-          <w:color w:val="000000" w:themeColor="text1"/>
-          <w:sz w:val="24"/>
-          <w:szCs w:val="24"/>
-        </w:rPr>
-      </w:pPr>
-      <w:proofErr w:type="gramStart"/>
-      <w:r>
-        <w:rPr>
-          <w:rFonts w:ascii="Times New Roman" w:eastAsia="楷体" w:hAnsi="Times New Roman" w:cs="Times New Roman" w:hint="eastAsia"/>
-          <w:color w:val="000000" w:themeColor="text1"/>
-          <w:sz w:val="24"/>
-          <w:szCs w:val="24"/>
-        </w:rPr>
-        <w:t>勾选</w:t>
-      </w:r>
-      <w:proofErr w:type="gramEnd"/>
-      <w:r>
-        <w:rPr>
-          <w:rFonts w:ascii="Times New Roman" w:eastAsia="楷体" w:hAnsi="Times New Roman" w:cs="Times New Roman" w:hint="eastAsia"/>
-          <w:color w:val="000000" w:themeColor="text1"/>
-          <w:sz w:val="24"/>
-          <w:szCs w:val="24"/>
-        </w:rPr>
-        <w:t xml:space="preserve"> </w:t>
-      </w:r>
-      <w:r>
-        <w:rPr>
-          <w:rFonts w:ascii="Times New Roman" w:eastAsia="楷体" w:hAnsi="Times New Roman" w:cs="Times New Roman" w:hint="eastAsia"/>
-          <w:color w:val="000000" w:themeColor="text1"/>
-          <w:sz w:val="24"/>
-          <w:szCs w:val="24"/>
-        </w:rPr>
-        <w:t>是否需要筛选数据</w:t>
-      </w:r>
-      <w:r>
-        <w:rPr>
-          <w:rFonts w:ascii="Times New Roman" w:eastAsia="楷体" w:hAnsi="Times New Roman" w:cs="Times New Roman" w:hint="eastAsia"/>
-          <w:color w:val="000000" w:themeColor="text1"/>
-          <w:sz w:val="24"/>
-          <w:szCs w:val="24"/>
-        </w:rPr>
-        <w:t xml:space="preserve"> </w:t>
-      </w:r>
-      <w:r>
-        <w:rPr>
-          <w:rFonts w:ascii="Times New Roman" w:eastAsia="楷体" w:hAnsi="Times New Roman" w:cs="Times New Roman" w:hint="eastAsia"/>
-          <w:color w:val="000000" w:themeColor="text1"/>
-          <w:sz w:val="24"/>
-          <w:szCs w:val="24"/>
-        </w:rPr>
-        <w:t>并且</w:t>
-      </w:r>
-      <w:proofErr w:type="gramStart"/>
-      <w:r>
-        <w:rPr>
-          <w:rFonts w:ascii="Times New Roman" w:eastAsia="楷体" w:hAnsi="Times New Roman" w:cs="Times New Roman" w:hint="eastAsia"/>
-          <w:color w:val="000000" w:themeColor="text1"/>
-          <w:sz w:val="24"/>
-          <w:szCs w:val="24"/>
-        </w:rPr>
-        <w:t>最如</w:t>
-      </w:r>
-      <w:proofErr w:type="gramEnd"/>
-      <w:r>
-        <w:rPr>
-          <w:rFonts w:ascii="Times New Roman" w:eastAsia="楷体" w:hAnsi="Times New Roman" w:cs="Times New Roman" w:hint="eastAsia"/>
-          <w:color w:val="000000" w:themeColor="text1"/>
-          <w:sz w:val="24"/>
-          <w:szCs w:val="24"/>
-        </w:rPr>
-        <w:t>下输入。对二级子目录的筛选类似，筛选跟多只需点击“添加”按钮再填入需要筛选的目录名。</w:t>
-      </w:r>
-    </w:p>
-    <w:p>
-      <w:pPr>
-        <w:rPr>
-          <w:rFonts w:ascii="Times New Roman" w:eastAsia="楷体" w:hAnsi="Times New Roman" w:cs="Times New Roman"/>
-          <w:color w:val="000000" w:themeColor="text1"/>
-          <w:sz w:val="24"/>
-          <w:szCs w:val="24"/>
-        </w:rPr>
-      </w:pPr>
-      <w:r>
-        <w:rPr>
-          <w:noProof/>
-        </w:rPr>
-        <w:drawing>
-          <wp:inline distT="0" distB="0" distL="0" distR="0" wp14:anchorId="470B4225" wp14:editId="7EB75CF5">
-            <wp:extent cx="4695238" cy="809524"/>
-            <wp:effectExtent l="0" t="0" r="0" b="0"/>
-            <wp:docPr id="50" name="图片 50"/>
             <wp:cNvGraphicFramePr>
               <a:graphicFrameLocks xmlns:a="http://schemas.openxmlformats.org/drawingml/2006/main" noChangeAspect="1"/>
             </wp:cNvGraphicFramePr>
@@ -1876,7 +1849,7 @@
                   <pic:spPr>
                     <a:xfrm>
                       <a:off x="0" y="0"/>
-                      <a:ext cx="4695238" cy="809524"/>
+                      <a:ext cx="3200000" cy="2371429"/>
                     </a:xfrm>
                     <a:prstGeom prst="rect">
                       <a:avLst/>
@@ -1898,6 +1871,7 @@
           <w:szCs w:val="24"/>
         </w:rPr>
       </w:pPr>
+      <w:proofErr w:type="gramStart"/>
       <w:r>
         <w:rPr>
           <w:rFonts w:ascii="Times New Roman" w:eastAsia="楷体" w:hAnsi="Times New Roman" w:cs="Times New Roman" w:hint="eastAsia"/>
@@ -1905,8 +1879,9 @@
           <w:sz w:val="24"/>
           <w:szCs w:val="24"/>
         </w:rPr>
-        <w:t>点击提交，就会在在服务器指定位置生成脚本，并且自动执行，每次执行多少个脚本可以在上图</w:t>
-      </w:r>
+        <w:t>勾选</w:t>
+      </w:r>
+      <w:proofErr w:type="gramEnd"/>
       <w:r>
         <w:rPr>
           <w:rFonts w:ascii="Times New Roman" w:eastAsia="楷体" w:hAnsi="Times New Roman" w:cs="Times New Roman" w:hint="eastAsia"/>
@@ -1923,7 +1898,7 @@
           <w:sz w:val="24"/>
           <w:szCs w:val="24"/>
         </w:rPr>
-        <w:t>线程数中</w:t>
+        <w:t>是否需要筛选数据</w:t>
       </w:r>
       <w:r>
         <w:rPr>
@@ -1941,7 +1916,27 @@
           <w:sz w:val="24"/>
           <w:szCs w:val="24"/>
         </w:rPr>
-        <w:t>设置。</w:t>
+        <w:t>并且</w:t>
+      </w:r>
+      <w:proofErr w:type="gramStart"/>
+      <w:r>
+        <w:rPr>
+          <w:rFonts w:ascii="Times New Roman" w:eastAsia="楷体" w:hAnsi="Times New Roman" w:cs="Times New Roman" w:hint="eastAsia"/>
+          <w:color w:val="000000" w:themeColor="text1"/>
+          <w:sz w:val="24"/>
+          <w:szCs w:val="24"/>
+        </w:rPr>
+        <w:t>最如</w:t>
+      </w:r>
+      <w:proofErr w:type="gramEnd"/>
+      <w:r>
+        <w:rPr>
+          <w:rFonts w:ascii="Times New Roman" w:eastAsia="楷体" w:hAnsi="Times New Roman" w:cs="Times New Roman" w:hint="eastAsia"/>
+          <w:color w:val="000000" w:themeColor="text1"/>
+          <w:sz w:val="24"/>
+          <w:szCs w:val="24"/>
+        </w:rPr>
+        <w:t>下输入。对二级子目录的筛选类似，筛选跟多只需点击“添加”按钮再填入需要筛选的目录名。</w:t>
       </w:r>
     </w:p>
     <w:p>
@@ -1958,10 +1953,10 @@
           <w:noProof/>
         </w:rPr>
         <w:drawing>
-          <wp:inline distT="0" distB="0" distL="0" distR="0" wp14:anchorId="095B2577" wp14:editId="0A8B8011">
-            <wp:extent cx="5274310" cy="1725930"/>
-            <wp:effectExtent l="0" t="0" r="2540" b="7620"/>
-            <wp:docPr id="53" name="图片 53"/>
+          <wp:inline distT="0" distB="0" distL="0" distR="0" wp14:anchorId="470B4225" wp14:editId="7EB75CF5">
+            <wp:extent cx="4695238" cy="809524"/>
+            <wp:effectExtent l="0" t="0" r="0" b="0"/>
+            <wp:docPr id="50" name="图片 50"/>
             <wp:cNvGraphicFramePr>
               <a:graphicFrameLocks xmlns:a="http://schemas.openxmlformats.org/drawingml/2006/main" noChangeAspect="1"/>
             </wp:cNvGraphicFramePr>
@@ -1981,7 +1976,7 @@
                   <pic:spPr>
                     <a:xfrm>
                       <a:off x="0" y="0"/>
-                      <a:ext cx="5274310" cy="1725930"/>
+                      <a:ext cx="4695238" cy="809524"/>
                     </a:xfrm>
                     <a:prstGeom prst="rect">
                       <a:avLst/>
@@ -2010,7 +2005,7 @@
           <w:sz w:val="24"/>
           <w:szCs w:val="24"/>
         </w:rPr>
-        <w:t>这个时候请耐心等待网页跳转（因为是个</w:t>
+        <w:t>点击提交，就会在在服务器指定位置生成脚本，并且自动执行，每次执行多少个脚本可以在上图</w:t>
       </w:r>
       <w:r>
         <w:rPr>
@@ -2019,16 +2014,7 @@
           <w:sz w:val="24"/>
           <w:szCs w:val="24"/>
         </w:rPr>
-        <w:t>d</w:t>
-      </w:r>
-      <w:r>
-        <w:rPr>
-          <w:rFonts w:ascii="Times New Roman" w:eastAsia="楷体" w:hAnsi="Times New Roman" w:cs="Times New Roman"/>
-          <w:color w:val="000000" w:themeColor="text1"/>
-          <w:sz w:val="24"/>
-          <w:szCs w:val="24"/>
-        </w:rPr>
-        <w:t>emo</w:t>
+        <w:t xml:space="preserve"> </w:t>
       </w:r>
       <w:r>
         <w:rPr>
@@ -2037,7 +2023,7 @@
           <w:sz w:val="24"/>
           <w:szCs w:val="24"/>
         </w:rPr>
-        <w:t>所以很慢）。跳转到如下页面显示运行情况，</w:t>
+        <w:t>线程数中</w:t>
       </w:r>
       <w:r>
         <w:rPr>
@@ -2046,7 +2032,7 @@
           <w:sz w:val="24"/>
           <w:szCs w:val="24"/>
         </w:rPr>
-        <w:t>1</w:t>
+        <w:t xml:space="preserve"> </w:t>
       </w:r>
       <w:r>
         <w:rPr>
@@ -2055,79 +2041,7 @@
           <w:sz w:val="24"/>
           <w:szCs w:val="24"/>
         </w:rPr>
-        <w:t>表示正在运行，</w:t>
-      </w:r>
-      <w:r>
-        <w:rPr>
-          <w:rFonts w:ascii="Times New Roman" w:eastAsia="楷体" w:hAnsi="Times New Roman" w:cs="Times New Roman" w:hint="eastAsia"/>
-          <w:color w:val="000000" w:themeColor="text1"/>
-          <w:sz w:val="24"/>
-          <w:szCs w:val="24"/>
-        </w:rPr>
-        <w:t>0</w:t>
-      </w:r>
-      <w:r>
-        <w:rPr>
-          <w:rFonts w:ascii="Times New Roman" w:eastAsia="楷体" w:hAnsi="Times New Roman" w:cs="Times New Roman" w:hint="eastAsia"/>
-          <w:color w:val="000000" w:themeColor="text1"/>
-          <w:sz w:val="24"/>
-          <w:szCs w:val="24"/>
-        </w:rPr>
-        <w:t>表示尚未开始运行。。。</w:t>
-      </w:r>
-      <w:r>
-        <w:rPr>
-          <w:rFonts w:ascii="Times New Roman" w:eastAsia="楷体" w:hAnsi="Times New Roman" w:cs="Times New Roman" w:hint="eastAsia"/>
-          <w:color w:val="000000" w:themeColor="text1"/>
-          <w:sz w:val="24"/>
-          <w:szCs w:val="24"/>
-        </w:rPr>
-        <w:t xml:space="preserve"> </w:t>
-      </w:r>
-      <w:r>
-        <w:rPr>
-          <w:rFonts w:ascii="Times New Roman" w:eastAsia="楷体" w:hAnsi="Times New Roman" w:cs="Times New Roman" w:hint="eastAsia"/>
-          <w:color w:val="000000" w:themeColor="text1"/>
-          <w:sz w:val="24"/>
-          <w:szCs w:val="24"/>
-        </w:rPr>
-        <w:t>可以做些别的事情</w:t>
-      </w:r>
-      <w:r>
-        <w:rPr>
-          <w:rFonts w:ascii="Times New Roman" w:eastAsia="楷体" w:hAnsi="Times New Roman" w:cs="Times New Roman" w:hint="eastAsia"/>
-          <w:color w:val="000000" w:themeColor="text1"/>
-          <w:sz w:val="24"/>
-          <w:szCs w:val="24"/>
-        </w:rPr>
-        <w:t>。系统会检测任务执行完自动提交没有执行的脚本。而且参数以及输出、输入，</w:t>
-      </w:r>
-      <w:r>
-        <w:rPr>
-          <w:rFonts w:ascii="Times New Roman" w:eastAsia="楷体" w:hAnsi="Times New Roman" w:cs="Times New Roman" w:hint="eastAsia"/>
-          <w:color w:val="000000" w:themeColor="text1"/>
-          <w:sz w:val="24"/>
-          <w:szCs w:val="24"/>
-        </w:rPr>
-        <w:t>l</w:t>
-      </w:r>
-      <w:r>
-        <w:rPr>
-          <w:rFonts w:ascii="Times New Roman" w:eastAsia="楷体" w:hAnsi="Times New Roman" w:cs="Times New Roman"/>
-          <w:color w:val="000000" w:themeColor="text1"/>
-          <w:sz w:val="24"/>
-          <w:szCs w:val="24"/>
-        </w:rPr>
-        <w:t>og</w:t>
-      </w:r>
-      <w:r>
-        <w:rPr>
-          <w:rFonts w:ascii="Times New Roman" w:eastAsia="楷体" w:hAnsi="Times New Roman" w:cs="Times New Roman" w:hint="eastAsia"/>
-          <w:color w:val="000000" w:themeColor="text1"/>
-          <w:sz w:val="24"/>
-          <w:szCs w:val="24"/>
-        </w:rPr>
-        <w:t>等信息都已经录入数据库了，随着产品功能的扩展，这些信息将来都会以适当的方式从网页展示出来，甚至是数据报表。</w:t>
+        <w:t>设置。</w:t>
       </w:r>
     </w:p>
     <w:p>
@@ -2143,12 +2057,11 @@
         <w:rPr>
           <w:noProof/>
         </w:rPr>
-        <w:lastRenderedPageBreak/>
         <w:drawing>
-          <wp:inline distT="0" distB="0" distL="0" distR="0" wp14:anchorId="79E7F524" wp14:editId="6F8C2F52">
-            <wp:extent cx="5274310" cy="2660650"/>
-            <wp:effectExtent l="0" t="0" r="2540" b="6350"/>
-            <wp:docPr id="54" name="图片 54"/>
+          <wp:inline distT="0" distB="0" distL="0" distR="0" wp14:anchorId="095B2577" wp14:editId="0A8B8011">
+            <wp:extent cx="5274310" cy="1725930"/>
+            <wp:effectExtent l="0" t="0" r="2540" b="7620"/>
+            <wp:docPr id="53" name="图片 53"/>
             <wp:cNvGraphicFramePr>
               <a:graphicFrameLocks xmlns:a="http://schemas.openxmlformats.org/drawingml/2006/main" noChangeAspect="1"/>
             </wp:cNvGraphicFramePr>
@@ -2168,7 +2081,7 @@
                   <pic:spPr>
                     <a:xfrm>
                       <a:off x="0" y="0"/>
-                      <a:ext cx="5274310" cy="2660650"/>
+                      <a:ext cx="5274310" cy="1725930"/>
                     </a:xfrm>
                     <a:prstGeom prst="rect">
                       <a:avLst/>
@@ -2184,142 +2097,137 @@
     <w:p>
       <w:pPr>
         <w:rPr>
-          <w:rFonts w:asciiTheme="minorEastAsia" w:hAnsiTheme="minorEastAsia" w:cs="Times New Roman"/>
-          <w:color w:val="000000" w:themeColor="text1"/>
-          <w:szCs w:val="21"/>
-        </w:rPr>
-      </w:pPr>
-      <w:r>
-        <w:rPr>
-          <w:rFonts w:asciiTheme="minorEastAsia" w:hAnsiTheme="minorEastAsia" w:cs="Times New Roman" w:hint="eastAsia"/>
-          <w:color w:val="000000" w:themeColor="text1"/>
-          <w:szCs w:val="21"/>
-        </w:rPr>
-        <w:t>后面的排序，去</w:t>
-      </w:r>
-      <w:proofErr w:type="spellStart"/>
-      <w:r>
-        <w:rPr>
-          <w:rFonts w:asciiTheme="minorEastAsia" w:hAnsiTheme="minorEastAsia" w:cs="Times New Roman" w:hint="eastAsia"/>
-          <w:color w:val="000000" w:themeColor="text1"/>
-          <w:szCs w:val="21"/>
-        </w:rPr>
-        <w:t>p</w:t>
-      </w:r>
-      <w:r>
-        <w:rPr>
-          <w:rFonts w:asciiTheme="minorEastAsia" w:hAnsiTheme="minorEastAsia" w:cs="Times New Roman"/>
-          <w:color w:val="000000" w:themeColor="text1"/>
-          <w:szCs w:val="21"/>
-        </w:rPr>
-        <w:t>cr</w:t>
-      </w:r>
-      <w:proofErr w:type="spellEnd"/>
-      <w:r>
-        <w:rPr>
-          <w:rFonts w:asciiTheme="minorEastAsia" w:hAnsiTheme="minorEastAsia" w:cs="Times New Roman" w:hint="eastAsia"/>
-          <w:color w:val="000000" w:themeColor="text1"/>
-          <w:szCs w:val="21"/>
-        </w:rPr>
-        <w:t>重复，r</w:t>
-      </w:r>
-      <w:r>
-        <w:rPr>
-          <w:rFonts w:asciiTheme="minorEastAsia" w:hAnsiTheme="minorEastAsia" w:cs="Times New Roman"/>
-          <w:color w:val="000000" w:themeColor="text1"/>
-          <w:szCs w:val="21"/>
-        </w:rPr>
-        <w:t>ealignment</w:t>
-      </w:r>
-      <w:r>
-        <w:rPr>
-          <w:rFonts w:asciiTheme="minorEastAsia" w:hAnsiTheme="minorEastAsia" w:cs="Times New Roman" w:hint="eastAsia"/>
-          <w:color w:val="000000" w:themeColor="text1"/>
-          <w:szCs w:val="21"/>
-        </w:rPr>
-        <w:t>，删除多比对r</w:t>
-      </w:r>
-      <w:r>
-        <w:rPr>
-          <w:rFonts w:asciiTheme="minorEastAsia" w:hAnsiTheme="minorEastAsia" w:cs="Times New Roman"/>
-          <w:color w:val="000000" w:themeColor="text1"/>
-          <w:szCs w:val="21"/>
-        </w:rPr>
-        <w:t>eads</w:t>
-      </w:r>
-      <w:r>
-        <w:rPr>
-          <w:rFonts w:asciiTheme="minorEastAsia" w:hAnsiTheme="minorEastAsia" w:cs="Times New Roman" w:hint="eastAsia"/>
-          <w:color w:val="000000" w:themeColor="text1"/>
-          <w:szCs w:val="21"/>
-        </w:rPr>
-        <w:t>等。皆可用类似的方法运行。任何新的软件，甚至是自己写的脚本，只要在服务器可以用命令行条用，都可以通过w</w:t>
-      </w:r>
-      <w:r>
-        <w:rPr>
-          <w:rFonts w:asciiTheme="minorEastAsia" w:hAnsiTheme="minorEastAsia" w:cs="Times New Roman"/>
-          <w:color w:val="000000" w:themeColor="text1"/>
-          <w:szCs w:val="21"/>
-        </w:rPr>
-        <w:t>eb</w:t>
-      </w:r>
-      <w:r>
-        <w:rPr>
-          <w:rFonts w:asciiTheme="minorEastAsia" w:hAnsiTheme="minorEastAsia" w:cs="Times New Roman" w:hint="eastAsia"/>
-          <w:color w:val="000000" w:themeColor="text1"/>
-          <w:szCs w:val="21"/>
-        </w:rPr>
-        <w:t>端调运，选择</w:t>
-      </w:r>
-      <w:proofErr w:type="spellStart"/>
-      <w:r>
-        <w:rPr>
-          <w:rFonts w:asciiTheme="minorEastAsia" w:hAnsiTheme="minorEastAsia" w:cs="Times New Roman" w:hint="eastAsia"/>
-          <w:color w:val="000000" w:themeColor="text1"/>
-          <w:szCs w:val="21"/>
-        </w:rPr>
-        <w:t>L</w:t>
-      </w:r>
-      <w:r>
-        <w:rPr>
-          <w:rFonts w:asciiTheme="minorEastAsia" w:hAnsiTheme="minorEastAsia" w:cs="Times New Roman"/>
-          <w:color w:val="000000" w:themeColor="text1"/>
-          <w:szCs w:val="21"/>
-        </w:rPr>
-        <w:t>inuxCommand</w:t>
-      </w:r>
-      <w:proofErr w:type="spellEnd"/>
-      <w:r>
-        <w:rPr>
-          <w:rFonts w:asciiTheme="minorEastAsia" w:hAnsiTheme="minorEastAsia" w:cs="Times New Roman"/>
-          <w:color w:val="000000" w:themeColor="text1"/>
-          <w:szCs w:val="21"/>
+          <w:rFonts w:ascii="Times New Roman" w:eastAsia="楷体" w:hAnsi="Times New Roman" w:cs="Times New Roman"/>
+          <w:color w:val="000000" w:themeColor="text1"/>
+          <w:sz w:val="24"/>
+          <w:szCs w:val="24"/>
+        </w:rPr>
+      </w:pPr>
+      <w:r>
+        <w:rPr>
+          <w:rFonts w:ascii="Times New Roman" w:eastAsia="楷体" w:hAnsi="Times New Roman" w:cs="Times New Roman" w:hint="eastAsia"/>
+          <w:color w:val="000000" w:themeColor="text1"/>
+          <w:sz w:val="24"/>
+          <w:szCs w:val="24"/>
+        </w:rPr>
+        <w:t>这个时候请耐心等待网页跳转（因为是个</w:t>
+      </w:r>
+      <w:r>
+        <w:rPr>
+          <w:rFonts w:ascii="Times New Roman" w:eastAsia="楷体" w:hAnsi="Times New Roman" w:cs="Times New Roman" w:hint="eastAsia"/>
+          <w:color w:val="000000" w:themeColor="text1"/>
+          <w:sz w:val="24"/>
+          <w:szCs w:val="24"/>
+        </w:rPr>
+        <w:t>d</w:t>
+      </w:r>
+      <w:r>
+        <w:rPr>
+          <w:rFonts w:ascii="Times New Roman" w:eastAsia="楷体" w:hAnsi="Times New Roman" w:cs="Times New Roman"/>
+          <w:color w:val="000000" w:themeColor="text1"/>
+          <w:sz w:val="24"/>
+          <w:szCs w:val="24"/>
+        </w:rPr>
+        <w:t>emo</w:t>
+      </w:r>
+      <w:r>
+        <w:rPr>
+          <w:rFonts w:ascii="Times New Roman" w:eastAsia="楷体" w:hAnsi="Times New Roman" w:cs="Times New Roman" w:hint="eastAsia"/>
+          <w:color w:val="000000" w:themeColor="text1"/>
+          <w:sz w:val="24"/>
+          <w:szCs w:val="24"/>
+        </w:rPr>
+        <w:t>所以很慢）。跳转到如下页面显示运行情况，</w:t>
+      </w:r>
+      <w:r>
+        <w:rPr>
+          <w:rFonts w:ascii="Times New Roman" w:eastAsia="楷体" w:hAnsi="Times New Roman" w:cs="Times New Roman" w:hint="eastAsia"/>
+          <w:color w:val="000000" w:themeColor="text1"/>
+          <w:sz w:val="24"/>
+          <w:szCs w:val="24"/>
+        </w:rPr>
+        <w:t>1</w:t>
+      </w:r>
+      <w:r>
+        <w:rPr>
+          <w:rFonts w:ascii="Times New Roman" w:eastAsia="楷体" w:hAnsi="Times New Roman" w:cs="Times New Roman" w:hint="eastAsia"/>
+          <w:color w:val="000000" w:themeColor="text1"/>
+          <w:sz w:val="24"/>
+          <w:szCs w:val="24"/>
+        </w:rPr>
+        <w:t>表示正在运行，</w:t>
+      </w:r>
+      <w:r>
+        <w:rPr>
+          <w:rFonts w:ascii="Times New Roman" w:eastAsia="楷体" w:hAnsi="Times New Roman" w:cs="Times New Roman" w:hint="eastAsia"/>
+          <w:color w:val="000000" w:themeColor="text1"/>
+          <w:sz w:val="24"/>
+          <w:szCs w:val="24"/>
+        </w:rPr>
+        <w:t>0</w:t>
+      </w:r>
+      <w:r>
+        <w:rPr>
+          <w:rFonts w:ascii="Times New Roman" w:eastAsia="楷体" w:hAnsi="Times New Roman" w:cs="Times New Roman" w:hint="eastAsia"/>
+          <w:color w:val="000000" w:themeColor="text1"/>
+          <w:sz w:val="24"/>
+          <w:szCs w:val="24"/>
+        </w:rPr>
+        <w:t>表示尚未开始运行。。。</w:t>
+      </w:r>
+      <w:r>
+        <w:rPr>
+          <w:rFonts w:ascii="Times New Roman" w:eastAsia="楷体" w:hAnsi="Times New Roman" w:cs="Times New Roman" w:hint="eastAsia"/>
+          <w:color w:val="000000" w:themeColor="text1"/>
+          <w:sz w:val="24"/>
+          <w:szCs w:val="24"/>
         </w:rPr>
         <w:t xml:space="preserve"> </w:t>
       </w:r>
       <w:r>
         <w:rPr>
-          <w:rFonts w:asciiTheme="minorEastAsia" w:hAnsiTheme="minorEastAsia" w:cs="Times New Roman" w:hint="eastAsia"/>
-          <w:color w:val="000000" w:themeColor="text1"/>
-          <w:szCs w:val="21"/>
-        </w:rPr>
-        <w:t>就会弹出一个文本框，输入调用软件的命令（目前还没开发出来），比如：p</w:t>
-      </w:r>
-      <w:r>
-        <w:rPr>
-          <w:rFonts w:asciiTheme="minorEastAsia" w:hAnsiTheme="minorEastAsia" w:cs="Times New Roman"/>
-          <w:color w:val="000000" w:themeColor="text1"/>
-          <w:szCs w:val="21"/>
-        </w:rPr>
-        <w:t xml:space="preserve">ython myscript.py </w:t>
-      </w:r>
-      <w:r>
-        <w:rPr>
-          <w:rFonts w:asciiTheme="minorEastAsia" w:hAnsiTheme="minorEastAsia" w:cs="Times New Roman" w:hint="eastAsia"/>
-          <w:color w:val="000000" w:themeColor="text1"/>
-          <w:szCs w:val="21"/>
-        </w:rPr>
-        <w:t>然后后面有输入就填输入，有输入填输出，有参数就填参数，没有就空着。就可以运行了。</w:t>
+          <w:rFonts w:ascii="Times New Roman" w:eastAsia="楷体" w:hAnsi="Times New Roman" w:cs="Times New Roman" w:hint="eastAsia"/>
+          <w:color w:val="000000" w:themeColor="text1"/>
+          <w:sz w:val="24"/>
+          <w:szCs w:val="24"/>
+        </w:rPr>
+        <w:t>可以做些别的事情</w:t>
+      </w:r>
+      <w:r>
+        <w:rPr>
+          <w:rFonts w:ascii="Times New Roman" w:eastAsia="楷体" w:hAnsi="Times New Roman" w:cs="Times New Roman" w:hint="eastAsia"/>
+          <w:color w:val="000000" w:themeColor="text1"/>
+          <w:sz w:val="24"/>
+          <w:szCs w:val="24"/>
+        </w:rPr>
+        <w:t>。系统会检测任务执行完自动提交没有执行的脚本。而且参数以及输出、输入，</w:t>
+      </w:r>
+      <w:r>
+        <w:rPr>
+          <w:rFonts w:ascii="Times New Roman" w:eastAsia="楷体" w:hAnsi="Times New Roman" w:cs="Times New Roman" w:hint="eastAsia"/>
+          <w:color w:val="000000" w:themeColor="text1"/>
+          <w:sz w:val="24"/>
+          <w:szCs w:val="24"/>
+        </w:rPr>
+        <w:t>l</w:t>
+      </w:r>
+      <w:r>
+        <w:rPr>
+          <w:rFonts w:ascii="Times New Roman" w:eastAsia="楷体" w:hAnsi="Times New Roman" w:cs="Times New Roman"/>
+          <w:color w:val="000000" w:themeColor="text1"/>
+          <w:sz w:val="24"/>
+          <w:szCs w:val="24"/>
+        </w:rPr>
+        <w:t>og</w:t>
+      </w:r>
+      <w:r>
+        <w:rPr>
+          <w:rFonts w:ascii="Times New Roman" w:eastAsia="楷体" w:hAnsi="Times New Roman" w:cs="Times New Roman" w:hint="eastAsia"/>
+          <w:color w:val="000000" w:themeColor="text1"/>
+          <w:sz w:val="24"/>
+          <w:szCs w:val="24"/>
+        </w:rPr>
+        <w:t>等信息都已经录入数据库了，随着产品功能的扩展，这些信息将来都会以适当的方式从网页展示出来，甚至是数据报表。</w:t>
       </w:r>
     </w:p>
     <w:p>
@@ -2335,11 +2243,12 @@
         <w:rPr>
           <w:noProof/>
         </w:rPr>
+        <w:lastRenderedPageBreak/>
         <w:drawing>
-          <wp:inline distT="0" distB="0" distL="0" distR="0" wp14:anchorId="422E16A1" wp14:editId="2E14634B">
-            <wp:extent cx="3295238" cy="838095"/>
-            <wp:effectExtent l="0" t="0" r="635" b="635"/>
-            <wp:docPr id="55" name="图片 55"/>
+          <wp:inline distT="0" distB="0" distL="0" distR="0" wp14:anchorId="79E7F524" wp14:editId="6F8C2F52">
+            <wp:extent cx="5274310" cy="2660650"/>
+            <wp:effectExtent l="0" t="0" r="2540" b="6350"/>
+            <wp:docPr id="54" name="图片 54"/>
             <wp:cNvGraphicFramePr>
               <a:graphicFrameLocks xmlns:a="http://schemas.openxmlformats.org/drawingml/2006/main" noChangeAspect="1"/>
             </wp:cNvGraphicFramePr>
@@ -2359,7 +2268,7 @@
                   <pic:spPr>
                     <a:xfrm>
                       <a:off x="0" y="0"/>
-                      <a:ext cx="3295238" cy="838095"/>
+                      <a:ext cx="5274310" cy="2660650"/>
                     </a:xfrm>
                     <a:prstGeom prst="rect">
                       <a:avLst/>
@@ -2386,23 +2295,81 @@
           <w:color w:val="000000" w:themeColor="text1"/>
           <w:szCs w:val="21"/>
         </w:rPr>
-        <w:t>这里只是提供</w:t>
-      </w:r>
+        <w:t>后面的排序，去</w:t>
+      </w:r>
+      <w:proofErr w:type="spellStart"/>
       <w:r>
         <w:rPr>
           <w:rFonts w:asciiTheme="minorEastAsia" w:hAnsiTheme="minorEastAsia" w:cs="Times New Roman" w:hint="eastAsia"/>
           <w:color w:val="000000" w:themeColor="text1"/>
           <w:szCs w:val="21"/>
         </w:rPr>
-        <w:t>了</w:t>
-      </w:r>
+        <w:t>p</w:t>
+      </w:r>
+      <w:r>
+        <w:rPr>
+          <w:rFonts w:asciiTheme="minorEastAsia" w:hAnsiTheme="minorEastAsia" w:cs="Times New Roman"/>
+          <w:color w:val="000000" w:themeColor="text1"/>
+          <w:szCs w:val="21"/>
+        </w:rPr>
+        <w:t>cr</w:t>
+      </w:r>
+      <w:proofErr w:type="spellEnd"/>
       <w:r>
         <w:rPr>
           <w:rFonts w:asciiTheme="minorEastAsia" w:hAnsiTheme="minorEastAsia" w:cs="Times New Roman" w:hint="eastAsia"/>
           <w:color w:val="000000" w:themeColor="text1"/>
           <w:szCs w:val="21"/>
         </w:rPr>
-        <w:t>一种模式，去告诉系统 输入是什么， 输出是什么，软件以及参数是什么。作用于那些数据。这个规则可以套用目前大多数的分析，甚至是</w:t>
+        <w:t>重复，r</w:t>
+      </w:r>
+      <w:r>
+        <w:rPr>
+          <w:rFonts w:asciiTheme="minorEastAsia" w:hAnsiTheme="minorEastAsia" w:cs="Times New Roman"/>
+          <w:color w:val="000000" w:themeColor="text1"/>
+          <w:szCs w:val="21"/>
+        </w:rPr>
+        <w:t>ealignment</w:t>
+      </w:r>
+      <w:r>
+        <w:rPr>
+          <w:rFonts w:asciiTheme="minorEastAsia" w:hAnsiTheme="minorEastAsia" w:cs="Times New Roman" w:hint="eastAsia"/>
+          <w:color w:val="000000" w:themeColor="text1"/>
+          <w:szCs w:val="21"/>
+        </w:rPr>
+        <w:t>，删除多比对r</w:t>
+      </w:r>
+      <w:r>
+        <w:rPr>
+          <w:rFonts w:asciiTheme="minorEastAsia" w:hAnsiTheme="minorEastAsia" w:cs="Times New Roman"/>
+          <w:color w:val="000000" w:themeColor="text1"/>
+          <w:szCs w:val="21"/>
+        </w:rPr>
+        <w:t>eads</w:t>
+      </w:r>
+      <w:r>
+        <w:rPr>
+          <w:rFonts w:asciiTheme="minorEastAsia" w:hAnsiTheme="minorEastAsia" w:cs="Times New Roman" w:hint="eastAsia"/>
+          <w:color w:val="000000" w:themeColor="text1"/>
+          <w:szCs w:val="21"/>
+        </w:rPr>
+        <w:t>等。皆可用类似的方法运行。任何新的软件，甚至是自己写的脚本，只要在服务器可以用命令行条用，都可以通过w</w:t>
+      </w:r>
+      <w:r>
+        <w:rPr>
+          <w:rFonts w:asciiTheme="minorEastAsia" w:hAnsiTheme="minorEastAsia" w:cs="Times New Roman"/>
+          <w:color w:val="000000" w:themeColor="text1"/>
+          <w:szCs w:val="21"/>
+        </w:rPr>
+        <w:t>eb</w:t>
+      </w:r>
+      <w:r>
+        <w:rPr>
+          <w:rFonts w:asciiTheme="minorEastAsia" w:hAnsiTheme="minorEastAsia" w:cs="Times New Roman" w:hint="eastAsia"/>
+          <w:color w:val="000000" w:themeColor="text1"/>
+          <w:szCs w:val="21"/>
+        </w:rPr>
+        <w:t>端调运，选择</w:t>
       </w:r>
       <w:proofErr w:type="spellStart"/>
       <w:r>
@@ -2411,7 +2378,7 @@
           <w:color w:val="000000" w:themeColor="text1"/>
           <w:szCs w:val="21"/>
         </w:rPr>
-        <w:t>a</w:t>
+        <w:t>L</w:t>
       </w:r>
       <w:r>
         <w:rPr>
@@ -2419,7 +2386,7 @@
           <w:color w:val="000000" w:themeColor="text1"/>
           <w:szCs w:val="21"/>
         </w:rPr>
-        <w:t>wk</w:t>
+        <w:t>inuxCommand</w:t>
       </w:r>
       <w:proofErr w:type="spellEnd"/>
       <w:r>
@@ -2428,7 +2395,7 @@
           <w:color w:val="000000" w:themeColor="text1"/>
           <w:szCs w:val="21"/>
         </w:rPr>
-        <w:t xml:space="preserve"> sed</w:t>
+        <w:t xml:space="preserve"> </w:t>
       </w:r>
       <w:r>
         <w:rPr>
@@ -2436,7 +2403,7 @@
           <w:color w:val="000000" w:themeColor="text1"/>
           <w:szCs w:val="21"/>
         </w:rPr>
-        <w:t>等s</w:t>
+        <w:t>就会弹出一个文本框，输入调用软件的命令（目前还没开发出来），比如：p</w:t>
       </w:r>
       <w:r>
         <w:rPr>
@@ -2444,7 +2411,7 @@
           <w:color w:val="000000" w:themeColor="text1"/>
           <w:szCs w:val="21"/>
         </w:rPr>
-        <w:t>hell</w:t>
+        <w:t xml:space="preserve">ython myscript.py </w:t>
       </w:r>
       <w:r>
         <w:rPr>
@@ -2452,101 +2419,27 @@
           <w:color w:val="000000" w:themeColor="text1"/>
           <w:szCs w:val="21"/>
         </w:rPr>
-        <w:t>脚本，但是现在没法在网页上实时刷新输出，以后可以扩展功能。</w:t>
-      </w:r>
-    </w:p>
-    <w:p>
-      <w:pPr>
-        <w:rPr>
-          <w:rFonts w:asciiTheme="minorEastAsia" w:hAnsiTheme="minorEastAsia" w:cs="Times New Roman"/>
-          <w:color w:val="000000" w:themeColor="text1"/>
-          <w:szCs w:val="21"/>
-        </w:rPr>
-      </w:pPr>
-      <w:r>
-        <w:rPr>
-          <w:rFonts w:asciiTheme="minorEastAsia" w:hAnsiTheme="minorEastAsia" w:cs="Times New Roman" w:hint="eastAsia"/>
-          <w:color w:val="000000" w:themeColor="text1"/>
-          <w:szCs w:val="21"/>
-        </w:rPr>
-        <w:t>使用这样系统现在看起来规则有点复杂，未来会越来越友好，而且有一些显而易见的好处。比如给数据的管理提供了一个框架，防止错误操作等。机械性重复操作可以交给没有资深分析经验的人，只要有一两个有经验的人可以随时监控脚本是否正确，输出是否满意，如果想调参数，</w:t>
-      </w:r>
-      <w:r>
-        <w:rPr>
-          <w:rFonts w:asciiTheme="minorEastAsia" w:hAnsiTheme="minorEastAsia" w:cs="Times New Roman" w:hint="eastAsia"/>
-          <w:color w:val="000000" w:themeColor="text1"/>
-          <w:szCs w:val="21"/>
-        </w:rPr>
-        <w:t>也很方便，而且系统会自动记录和参数对应的生成数据，以防实验参数太多，不知道那个数据对应那个参数，那个输入对应那个输出等问题。。。</w:t>
-      </w:r>
-    </w:p>
-    <w:p>
-      <w:pPr>
-        <w:rPr>
-          <w:rFonts w:asciiTheme="minorEastAsia" w:hAnsiTheme="minorEastAsia" w:cs="Times New Roman"/>
-          <w:color w:val="000000" w:themeColor="text1"/>
-          <w:szCs w:val="21"/>
-        </w:rPr>
-      </w:pPr>
-      <w:r>
-        <w:rPr>
-          <w:rFonts w:asciiTheme="minorEastAsia" w:hAnsiTheme="minorEastAsia" w:cs="Times New Roman" w:hint="eastAsia"/>
-          <w:color w:val="000000" w:themeColor="text1"/>
-          <w:szCs w:val="21"/>
-        </w:rPr>
-        <w:t>在举两个例子，比如生成</w:t>
-      </w:r>
-      <w:proofErr w:type="spellStart"/>
-      <w:r>
-        <w:rPr>
-          <w:rFonts w:asciiTheme="minorEastAsia" w:hAnsiTheme="minorEastAsia" w:cs="Times New Roman" w:hint="eastAsia"/>
-          <w:color w:val="000000" w:themeColor="text1"/>
-          <w:szCs w:val="21"/>
-        </w:rPr>
-        <w:t>v</w:t>
-      </w:r>
-      <w:r>
-        <w:rPr>
-          <w:rFonts w:asciiTheme="minorEastAsia" w:hAnsiTheme="minorEastAsia" w:cs="Times New Roman"/>
-          <w:color w:val="000000" w:themeColor="text1"/>
-          <w:szCs w:val="21"/>
-        </w:rPr>
-        <w:t>cf</w:t>
-      </w:r>
-      <w:proofErr w:type="spellEnd"/>
-      <w:r>
-        <w:rPr>
-          <w:rFonts w:asciiTheme="minorEastAsia" w:hAnsiTheme="minorEastAsia" w:cs="Times New Roman" w:hint="eastAsia"/>
-          <w:color w:val="000000" w:themeColor="text1"/>
-          <w:szCs w:val="21"/>
-        </w:rPr>
-        <w:t>，那么多b</w:t>
-      </w:r>
-      <w:r>
-        <w:rPr>
-          <w:rFonts w:asciiTheme="minorEastAsia" w:hAnsiTheme="minorEastAsia" w:cs="Times New Roman"/>
-          <w:color w:val="000000" w:themeColor="text1"/>
-          <w:szCs w:val="21"/>
-        </w:rPr>
-        <w:t>am</w:t>
-      </w:r>
-      <w:r>
-        <w:rPr>
-          <w:rFonts w:asciiTheme="minorEastAsia" w:hAnsiTheme="minorEastAsia" w:cs="Times New Roman" w:hint="eastAsia"/>
-          <w:color w:val="000000" w:themeColor="text1"/>
-          <w:szCs w:val="21"/>
-        </w:rPr>
-        <w:t>，不需要手工的往里面敲，可以设</w:t>
-      </w:r>
+        <w:t>然后后面有输入就填输入，有输入填输出，有参数就填参数，没有就空着。就可以运行了。</w:t>
+      </w:r>
+    </w:p>
+    <w:p>
+      <w:pPr>
+        <w:rPr>
+          <w:rFonts w:ascii="Times New Roman" w:eastAsia="楷体" w:hAnsi="Times New Roman" w:cs="Times New Roman"/>
+          <w:color w:val="000000" w:themeColor="text1"/>
+          <w:sz w:val="24"/>
+          <w:szCs w:val="24"/>
+        </w:rPr>
+      </w:pPr>
       <w:r>
         <w:rPr>
           <w:noProof/>
         </w:rPr>
         <w:drawing>
-          <wp:inline distT="0" distB="0" distL="0" distR="0" wp14:anchorId="03E1A631" wp14:editId="33C235DF">
-            <wp:extent cx="3114286" cy="228571"/>
-            <wp:effectExtent l="0" t="0" r="0" b="635"/>
-            <wp:docPr id="57" name="图片 57"/>
+          <wp:inline distT="0" distB="0" distL="0" distR="0" wp14:anchorId="422E16A1" wp14:editId="2E14634B">
+            <wp:extent cx="3295238" cy="838095"/>
+            <wp:effectExtent l="0" t="0" r="635" b="635"/>
+            <wp:docPr id="55" name="图片 55"/>
             <wp:cNvGraphicFramePr>
               <a:graphicFrameLocks xmlns:a="http://schemas.openxmlformats.org/drawingml/2006/main" noChangeAspect="1"/>
             </wp:cNvGraphicFramePr>
@@ -2566,7 +2459,7 @@
                   <pic:spPr>
                     <a:xfrm>
                       <a:off x="0" y="0"/>
-                      <a:ext cx="3114286" cy="228571"/>
+                      <a:ext cx="3295238" cy="838095"/>
                     </a:xfrm>
                     <a:prstGeom prst="rect">
                       <a:avLst/>
@@ -2593,7 +2486,32 @@
           <w:color w:val="000000" w:themeColor="text1"/>
           <w:szCs w:val="21"/>
         </w:rPr>
-        <w:t>就会收集所有b</w:t>
+        <w:t>这里只是提供</w:t>
+      </w:r>
+      <w:r>
+        <w:rPr>
+          <w:rFonts w:asciiTheme="minorEastAsia" w:hAnsiTheme="minorEastAsia" w:cs="Times New Roman" w:hint="eastAsia"/>
+          <w:color w:val="000000" w:themeColor="text1"/>
+          <w:szCs w:val="21"/>
+        </w:rPr>
+        <w:t>了</w:t>
+      </w:r>
+      <w:r>
+        <w:rPr>
+          <w:rFonts w:asciiTheme="minorEastAsia" w:hAnsiTheme="minorEastAsia" w:cs="Times New Roman" w:hint="eastAsia"/>
+          <w:color w:val="000000" w:themeColor="text1"/>
+          <w:szCs w:val="21"/>
+        </w:rPr>
+        <w:t>一种模式，去告诉系统 输入是什么， 输出是什么，软件以及参数是什么。作用于那些数据。这个规则可以套用目前大多数的分析，甚至是</w:t>
+      </w:r>
+      <w:proofErr w:type="spellStart"/>
+      <w:r>
+        <w:rPr>
+          <w:rFonts w:asciiTheme="minorEastAsia" w:hAnsiTheme="minorEastAsia" w:cs="Times New Roman" w:hint="eastAsia"/>
+          <w:color w:val="000000" w:themeColor="text1"/>
+          <w:szCs w:val="21"/>
+        </w:rPr>
+        <w:t>a</w:t>
       </w:r>
       <w:r>
         <w:rPr>
@@ -2601,6 +2519,115 @@
           <w:color w:val="000000" w:themeColor="text1"/>
           <w:szCs w:val="21"/>
         </w:rPr>
+        <w:t>wk</w:t>
+      </w:r>
+      <w:proofErr w:type="spellEnd"/>
+      <w:r>
+        <w:rPr>
+          <w:rFonts w:asciiTheme="minorEastAsia" w:hAnsiTheme="minorEastAsia" w:cs="Times New Roman"/>
+          <w:color w:val="000000" w:themeColor="text1"/>
+          <w:szCs w:val="21"/>
+        </w:rPr>
+        <w:t xml:space="preserve"> sed</w:t>
+      </w:r>
+      <w:r>
+        <w:rPr>
+          <w:rFonts w:asciiTheme="minorEastAsia" w:hAnsiTheme="minorEastAsia" w:cs="Times New Roman" w:hint="eastAsia"/>
+          <w:color w:val="000000" w:themeColor="text1"/>
+          <w:szCs w:val="21"/>
+        </w:rPr>
+        <w:t>等s</w:t>
+      </w:r>
+      <w:r>
+        <w:rPr>
+          <w:rFonts w:asciiTheme="minorEastAsia" w:hAnsiTheme="minorEastAsia" w:cs="Times New Roman"/>
+          <w:color w:val="000000" w:themeColor="text1"/>
+          <w:szCs w:val="21"/>
+        </w:rPr>
+        <w:t>hell</w:t>
+      </w:r>
+      <w:r>
+        <w:rPr>
+          <w:rFonts w:asciiTheme="minorEastAsia" w:hAnsiTheme="minorEastAsia" w:cs="Times New Roman" w:hint="eastAsia"/>
+          <w:color w:val="000000" w:themeColor="text1"/>
+          <w:szCs w:val="21"/>
+        </w:rPr>
+        <w:t>脚本，但是现在没法在网页上实时刷新输出，以后可以扩展功能。</w:t>
+      </w:r>
+    </w:p>
+    <w:p>
+      <w:pPr>
+        <w:rPr>
+          <w:rFonts w:asciiTheme="minorEastAsia" w:hAnsiTheme="minorEastAsia" w:cs="Times New Roman"/>
+          <w:color w:val="000000" w:themeColor="text1"/>
+          <w:szCs w:val="21"/>
+        </w:rPr>
+      </w:pPr>
+      <w:r>
+        <w:rPr>
+          <w:rFonts w:asciiTheme="minorEastAsia" w:hAnsiTheme="minorEastAsia" w:cs="Times New Roman" w:hint="eastAsia"/>
+          <w:color w:val="000000" w:themeColor="text1"/>
+          <w:szCs w:val="21"/>
+        </w:rPr>
+        <w:t>使用这样系统现在看起来规则有点复杂，未来会越来越友好，而且有一些显而易见的好处。比如给数据的管理提供了一个框架，防止错误操作等。机械性重复操作可以交给没有资深分析经验的人，只要有一两个有经验的人可以随时监控脚本是否正确，输出是否满意，如果想调参数，</w:t>
+      </w:r>
+      <w:r>
+        <w:rPr>
+          <w:rFonts w:asciiTheme="minorEastAsia" w:hAnsiTheme="minorEastAsia" w:cs="Times New Roman" w:hint="eastAsia"/>
+          <w:color w:val="000000" w:themeColor="text1"/>
+          <w:szCs w:val="21"/>
+        </w:rPr>
+        <w:t>也很方便，而且系统会自动记录和参数对应的生成数据，以防实验参数太多，不知道那个数据对应那个参数，那个输入对应那个输出等问题。。。</w:t>
+      </w:r>
+    </w:p>
+    <w:p>
+      <w:pPr>
+        <w:rPr>
+          <w:rFonts w:asciiTheme="minorEastAsia" w:hAnsiTheme="minorEastAsia" w:cs="Times New Roman"/>
+          <w:color w:val="000000" w:themeColor="text1"/>
+          <w:szCs w:val="21"/>
+        </w:rPr>
+      </w:pPr>
+      <w:r>
+        <w:rPr>
+          <w:rFonts w:asciiTheme="minorEastAsia" w:hAnsiTheme="minorEastAsia" w:cs="Times New Roman" w:hint="eastAsia"/>
+          <w:color w:val="000000" w:themeColor="text1"/>
+          <w:szCs w:val="21"/>
+        </w:rPr>
+        <w:t>在举两个例子，比如生成</w:t>
+      </w:r>
+      <w:proofErr w:type="spellStart"/>
+      <w:r>
+        <w:rPr>
+          <w:rFonts w:asciiTheme="minorEastAsia" w:hAnsiTheme="minorEastAsia" w:cs="Times New Roman" w:hint="eastAsia"/>
+          <w:color w:val="000000" w:themeColor="text1"/>
+          <w:szCs w:val="21"/>
+        </w:rPr>
+        <w:t>v</w:t>
+      </w:r>
+      <w:r>
+        <w:rPr>
+          <w:rFonts w:asciiTheme="minorEastAsia" w:hAnsiTheme="minorEastAsia" w:cs="Times New Roman"/>
+          <w:color w:val="000000" w:themeColor="text1"/>
+          <w:szCs w:val="21"/>
+        </w:rPr>
+        <w:t>cf</w:t>
+      </w:r>
+      <w:proofErr w:type="spellEnd"/>
+      <w:r>
+        <w:rPr>
+          <w:rFonts w:asciiTheme="minorEastAsia" w:hAnsiTheme="minorEastAsia" w:cs="Times New Roman" w:hint="eastAsia"/>
+          <w:color w:val="000000" w:themeColor="text1"/>
+          <w:szCs w:val="21"/>
+        </w:rPr>
+        <w:t>，那么多b</w:t>
+      </w:r>
+      <w:r>
+        <w:rPr>
+          <w:rFonts w:asciiTheme="minorEastAsia" w:hAnsiTheme="minorEastAsia" w:cs="Times New Roman"/>
+          <w:color w:val="000000" w:themeColor="text1"/>
+          <w:szCs w:val="21"/>
+        </w:rPr>
         <w:t>am</w:t>
       </w:r>
       <w:r>
@@ -2609,76 +2636,17 @@
           <w:color w:val="000000" w:themeColor="text1"/>
           <w:szCs w:val="21"/>
         </w:rPr>
-        <w:t>，如果只想将m</w:t>
-      </w:r>
-      <w:r>
-        <w:rPr>
-          <w:rFonts w:asciiTheme="minorEastAsia" w:hAnsiTheme="minorEastAsia" w:cs="Times New Roman"/>
-          <w:color w:val="000000" w:themeColor="text1"/>
-          <w:szCs w:val="21"/>
-        </w:rPr>
-        <w:t>allard</w:t>
-      </w:r>
-      <w:r>
-        <w:rPr>
-          <w:rFonts w:asciiTheme="minorEastAsia" w:hAnsiTheme="minorEastAsia" w:cs="Times New Roman" w:hint="eastAsia"/>
-          <w:color w:val="000000" w:themeColor="text1"/>
-          <w:szCs w:val="21"/>
-        </w:rPr>
-        <w:t>，s</w:t>
-      </w:r>
-      <w:r>
-        <w:rPr>
-          <w:rFonts w:asciiTheme="minorEastAsia" w:hAnsiTheme="minorEastAsia" w:cs="Times New Roman"/>
-          <w:color w:val="000000" w:themeColor="text1"/>
-          <w:szCs w:val="21"/>
-        </w:rPr>
-        <w:t>pot-billed</w:t>
-      </w:r>
-      <w:r>
-        <w:rPr>
-          <w:rFonts w:asciiTheme="minorEastAsia" w:hAnsiTheme="minorEastAsia" w:cs="Times New Roman" w:hint="eastAsia"/>
-          <w:color w:val="000000" w:themeColor="text1"/>
-          <w:szCs w:val="21"/>
-        </w:rPr>
-        <w:t>两个群体的个体混合生成</w:t>
-      </w:r>
-      <w:proofErr w:type="spellStart"/>
-      <w:r>
-        <w:rPr>
-          <w:rFonts w:asciiTheme="minorEastAsia" w:hAnsiTheme="minorEastAsia" w:cs="Times New Roman"/>
-          <w:color w:val="000000" w:themeColor="text1"/>
-          <w:szCs w:val="21"/>
-        </w:rPr>
-        <w:t>vcf</w:t>
-      </w:r>
-      <w:proofErr w:type="spellEnd"/>
-      <w:r>
-        <w:rPr>
-          <w:rFonts w:asciiTheme="minorEastAsia" w:hAnsiTheme="minorEastAsia" w:cs="Times New Roman" w:hint="eastAsia"/>
-          <w:color w:val="000000" w:themeColor="text1"/>
-          <w:szCs w:val="21"/>
-        </w:rPr>
-        <w:t>，可以在</w:t>
-      </w:r>
-    </w:p>
-    <w:p>
-      <w:pPr>
-        <w:rPr>
-          <w:rFonts w:asciiTheme="minorEastAsia" w:hAnsiTheme="minorEastAsia" w:cs="Times New Roman"/>
-          <w:color w:val="000000" w:themeColor="text1"/>
-          <w:szCs w:val="21"/>
-        </w:rPr>
-      </w:pPr>
+        <w:t>，不需要手工的往里面敲，可以设</w:t>
+      </w:r>
       <w:r>
         <w:rPr>
           <w:noProof/>
         </w:rPr>
         <w:drawing>
-          <wp:inline distT="0" distB="0" distL="0" distR="0" wp14:anchorId="5E319703" wp14:editId="46B22CF1">
-            <wp:extent cx="2571750" cy="1442511"/>
-            <wp:effectExtent l="0" t="0" r="0" b="5715"/>
-            <wp:docPr id="58" name="图片 58"/>
+          <wp:inline distT="0" distB="0" distL="0" distR="0" wp14:anchorId="03E1A631" wp14:editId="33C235DF">
+            <wp:extent cx="3114286" cy="228571"/>
+            <wp:effectExtent l="0" t="0" r="0" b="635"/>
+            <wp:docPr id="57" name="图片 57"/>
             <wp:cNvGraphicFramePr>
               <a:graphicFrameLocks xmlns:a="http://schemas.openxmlformats.org/drawingml/2006/main" noChangeAspect="1"/>
             </wp:cNvGraphicFramePr>
@@ -2698,6 +2666,138 @@
                   <pic:spPr>
                     <a:xfrm>
                       <a:off x="0" y="0"/>
+                      <a:ext cx="3114286" cy="228571"/>
+                    </a:xfrm>
+                    <a:prstGeom prst="rect">
+                      <a:avLst/>
+                    </a:prstGeom>
+                  </pic:spPr>
+                </pic:pic>
+              </a:graphicData>
+            </a:graphic>
+          </wp:inline>
+        </w:drawing>
+      </w:r>
+    </w:p>
+    <w:p>
+      <w:pPr>
+        <w:rPr>
+          <w:rFonts w:asciiTheme="minorEastAsia" w:hAnsiTheme="minorEastAsia" w:cs="Times New Roman"/>
+          <w:color w:val="000000" w:themeColor="text1"/>
+          <w:szCs w:val="21"/>
+        </w:rPr>
+      </w:pPr>
+      <w:r>
+        <w:rPr>
+          <w:rFonts w:asciiTheme="minorEastAsia" w:hAnsiTheme="minorEastAsia" w:cs="Times New Roman" w:hint="eastAsia"/>
+          <w:color w:val="000000" w:themeColor="text1"/>
+          <w:szCs w:val="21"/>
+        </w:rPr>
+        <w:t>就会收集所有b</w:t>
+      </w:r>
+      <w:r>
+        <w:rPr>
+          <w:rFonts w:asciiTheme="minorEastAsia" w:hAnsiTheme="minorEastAsia" w:cs="Times New Roman"/>
+          <w:color w:val="000000" w:themeColor="text1"/>
+          <w:szCs w:val="21"/>
+        </w:rPr>
+        <w:t>am</w:t>
+      </w:r>
+      <w:r>
+        <w:rPr>
+          <w:rFonts w:asciiTheme="minorEastAsia" w:hAnsiTheme="minorEastAsia" w:cs="Times New Roman" w:hint="eastAsia"/>
+          <w:color w:val="000000" w:themeColor="text1"/>
+          <w:szCs w:val="21"/>
+        </w:rPr>
+        <w:t>，如果只想将m</w:t>
+      </w:r>
+      <w:r>
+        <w:rPr>
+          <w:rFonts w:asciiTheme="minorEastAsia" w:hAnsiTheme="minorEastAsia" w:cs="Times New Roman"/>
+          <w:color w:val="000000" w:themeColor="text1"/>
+          <w:szCs w:val="21"/>
+        </w:rPr>
+        <w:t>allard</w:t>
+      </w:r>
+      <w:r>
+        <w:rPr>
+          <w:rFonts w:asciiTheme="minorEastAsia" w:hAnsiTheme="minorEastAsia" w:cs="Times New Roman" w:hint="eastAsia"/>
+          <w:color w:val="000000" w:themeColor="text1"/>
+          <w:szCs w:val="21"/>
+        </w:rPr>
+        <w:t>，s</w:t>
+      </w:r>
+      <w:r>
+        <w:rPr>
+          <w:rFonts w:asciiTheme="minorEastAsia" w:hAnsiTheme="minorEastAsia" w:cs="Times New Roman"/>
+          <w:color w:val="000000" w:themeColor="text1"/>
+          <w:szCs w:val="21"/>
+        </w:rPr>
+        <w:t>pot-billed</w:t>
+      </w:r>
+      <w:r>
+        <w:rPr>
+          <w:rFonts w:asciiTheme="minorEastAsia" w:hAnsiTheme="minorEastAsia" w:cs="Times New Roman" w:hint="eastAsia"/>
+          <w:color w:val="000000" w:themeColor="text1"/>
+          <w:szCs w:val="21"/>
+        </w:rPr>
+        <w:t>两个群体的个体混合生成</w:t>
+      </w:r>
+      <w:proofErr w:type="spellStart"/>
+      <w:r>
+        <w:rPr>
+          <w:rFonts w:asciiTheme="minorEastAsia" w:hAnsiTheme="minorEastAsia" w:cs="Times New Roman"/>
+          <w:color w:val="000000" w:themeColor="text1"/>
+          <w:szCs w:val="21"/>
+        </w:rPr>
+        <w:t>vcf</w:t>
+      </w:r>
+      <w:proofErr w:type="spellEnd"/>
+      <w:r>
+        <w:rPr>
+          <w:rFonts w:asciiTheme="minorEastAsia" w:hAnsiTheme="minorEastAsia" w:cs="Times New Roman" w:hint="eastAsia"/>
+          <w:color w:val="000000" w:themeColor="text1"/>
+          <w:szCs w:val="21"/>
+        </w:rPr>
+        <w:t>，可以在</w:t>
+      </w:r>
+    </w:p>
+    <w:p>
+      <w:pPr>
+        <w:rPr>
+          <w:rFonts w:asciiTheme="minorEastAsia" w:hAnsiTheme="minorEastAsia" w:cs="Times New Roman"/>
+          <w:color w:val="000000" w:themeColor="text1"/>
+          <w:szCs w:val="21"/>
+        </w:rPr>
+      </w:pPr>
+      <w:r>
+        <w:rPr>
+          <w:noProof/>
+        </w:rPr>
+        <w:drawing>
+          <wp:inline distT="0" distB="0" distL="0" distR="0" wp14:anchorId="5E319703" wp14:editId="46B22CF1">
+            <wp:extent cx="2571750" cy="1442511"/>
+            <wp:effectExtent l="0" t="0" r="0" b="5715"/>
+            <wp:docPr id="58" name="图片 58"/>
+            <wp:cNvGraphicFramePr>
+              <a:graphicFrameLocks xmlns:a="http://schemas.openxmlformats.org/drawingml/2006/main" noChangeAspect="1"/>
+            </wp:cNvGraphicFramePr>
+            <a:graphic xmlns:a="http://schemas.openxmlformats.org/drawingml/2006/main">
+              <a:graphicData uri="http://schemas.openxmlformats.org/drawingml/2006/picture">
+                <pic:pic xmlns:pic="http://schemas.openxmlformats.org/drawingml/2006/picture">
+                  <pic:nvPicPr>
+                    <pic:cNvPr id="1" name=""/>
+                    <pic:cNvPicPr/>
+                  </pic:nvPicPr>
+                  <pic:blipFill>
+                    <a:blip r:embed="rId22"/>
+                    <a:stretch>
+                      <a:fillRect/>
+                    </a:stretch>
+                  </pic:blipFill>
+                  <pic:spPr>
+                    <a:xfrm>
+                      <a:off x="0" y="0"/>
                       <a:ext cx="2584883" cy="1449877"/>
                     </a:xfrm>
                     <a:prstGeom prst="rect">
@@ -2761,13 +2861,39 @@
         </w:rPr>
         <w:t>磁盘管理，资源管理，数据报表自动批量生成等。。。</w:t>
       </w:r>
-      <w:bookmarkStart w:id="0" w:name="_GoBack"/>
-      <w:bookmarkEnd w:id="0"/>
-    </w:p>
-    <w:p>
-      <w:pPr>
+    </w:p>
+    <w:p>
+      <w:pPr>
+        <w:rPr>
+          <w:rFonts w:asciiTheme="minorEastAsia" w:hAnsiTheme="minorEastAsia" w:cs="Times New Roman"/>
+          <w:color w:val="000000" w:themeColor="text1"/>
+          <w:szCs w:val="21"/>
+        </w:rPr>
+      </w:pPr>
+      <w:r>
         <w:rPr>
           <w:rFonts w:asciiTheme="minorEastAsia" w:hAnsiTheme="minorEastAsia" w:cs="Times New Roman" w:hint="eastAsia"/>
+          <w:color w:val="000000" w:themeColor="text1"/>
+          <w:szCs w:val="21"/>
+        </w:rPr>
+        <w:t>近期在学习</w:t>
+      </w:r>
+      <w:r>
+        <w:rPr>
+          <w:rFonts w:asciiTheme="minorEastAsia" w:hAnsiTheme="minorEastAsia" w:cs="Times New Roman"/>
+          <w:color w:val="000000" w:themeColor="text1"/>
+          <w:szCs w:val="21"/>
+        </w:rPr>
+        <w:t>AI发现这个系统还非常适合用在AI的工程应用，可以很方便且直观的测试不同的参数的分析结果，并且这个架构也方便组织软件方面的工程师来解决生物上的问题。将生命科学的问题分解到工程和数学，让大家可以有组织的贡献力量。</w:t>
+      </w:r>
+    </w:p>
+    <w:p>
+      <w:pPr>
+        <w:pBdr>
+          <w:bottom w:val="double" w:sz="6" w:space="1" w:color="auto"/>
+        </w:pBdr>
+        <w:rPr>
+          <w:rFonts w:asciiTheme="minorEastAsia" w:hAnsiTheme="minorEastAsia" w:cs="Times New Roman"/>
           <w:color w:val="000000" w:themeColor="text1"/>
           <w:szCs w:val="21"/>
         </w:rPr>
@@ -2795,7 +2921,7 @@
                     <pic:cNvPicPr/>
                   </pic:nvPicPr>
                   <pic:blipFill rotWithShape="1">
-                    <a:blip r:embed="rId22" cstate="print">
+                    <a:blip r:embed="rId23" cstate="print">
                       <a:extLst>
                         <a:ext uri="{28A0092B-C50C-407E-A947-70E740481C1C}">
                           <a14:useLocalDpi xmlns:a14="http://schemas.microsoft.com/office/drawing/2010/main" val="0"/>
@@ -2829,6 +2955,578 @@
         </w:drawing>
       </w:r>
     </w:p>
+    <w:p>
+      <w:pPr>
+        <w:spacing w:line="360" w:lineRule="exact"/>
+        <w:rPr>
+          <w:rFonts w:ascii="Times New Roman" w:eastAsia="宋体" w:hAnsi="Times New Roman" w:cs="Times New Roman"/>
+          <w:color w:val="000000"/>
+          <w:szCs w:val="21"/>
+        </w:rPr>
+      </w:pPr>
+      <w:r>
+        <w:rPr>
+          <w:rFonts w:ascii="Times New Roman" w:eastAsia="宋体" w:hAnsi="Times New Roman" w:cs="Times New Roman" w:hint="eastAsia"/>
+          <w:color w:val="000000"/>
+          <w:szCs w:val="21"/>
+        </w:rPr>
+        <w:t>本</w:t>
+      </w:r>
+      <w:r>
+        <w:rPr>
+          <w:rFonts w:ascii="Times New Roman" w:eastAsia="宋体" w:hAnsi="Times New Roman" w:cs="Times New Roman" w:hint="eastAsia"/>
+          <w:color w:val="000000"/>
+          <w:szCs w:val="21"/>
+        </w:rPr>
+        <w:t>d</w:t>
+      </w:r>
+      <w:r>
+        <w:rPr>
+          <w:rFonts w:ascii="Times New Roman" w:eastAsia="宋体" w:hAnsi="Times New Roman" w:cs="Times New Roman"/>
+          <w:color w:val="000000"/>
+          <w:szCs w:val="21"/>
+        </w:rPr>
+        <w:t>emo</w:t>
+      </w:r>
+      <w:r>
+        <w:rPr>
+          <w:rFonts w:ascii="Times New Roman" w:eastAsia="宋体" w:hAnsi="Times New Roman" w:cs="Times New Roman" w:hint="eastAsia"/>
+          <w:color w:val="000000"/>
+          <w:szCs w:val="21"/>
+        </w:rPr>
+        <w:t>的主要思想见本人博士论文，借鉴了当前生物数据分析领域的科学实践以及本人的科研实践：</w:t>
+      </w:r>
+    </w:p>
+    <w:p>
+      <w:pPr>
+        <w:spacing w:line="360" w:lineRule="exact"/>
+        <w:rPr>
+          <w:rFonts w:eastAsia="宋体"/>
+        </w:rPr>
+      </w:pPr>
+      <w:r>
+        <w:rPr>
+          <w:rFonts w:ascii="Times New Roman" w:eastAsia="宋体" w:hAnsi="Times New Roman" w:cs="Times New Roman" w:hint="eastAsia"/>
+          <w:color w:val="000000"/>
+          <w:szCs w:val="21"/>
+        </w:rPr>
+        <w:t>“</w:t>
+      </w:r>
+      <w:r>
+        <w:rPr>
+          <w:rFonts w:eastAsia="宋体"/>
+        </w:rPr>
+        <w:t>大数据处理及存取方面提出了一些具有普遍意义的观点</w:t>
+      </w:r>
+      <w:r>
+        <w:rPr>
+          <w:rFonts w:eastAsia="宋体"/>
+        </w:rPr>
+        <w:t xml:space="preserve">, </w:t>
+      </w:r>
+      <w:r>
+        <w:rPr>
+          <w:rFonts w:eastAsia="宋体"/>
+        </w:rPr>
+        <w:t>他们认为：</w:t>
+      </w:r>
+    </w:p>
+    <w:p>
+      <w:pPr>
+        <w:pStyle w:val="1"/>
+        <w:numPr>
+          <w:ilvl w:val="0"/>
+          <w:numId w:val="1"/>
+        </w:numPr>
+        <w:spacing w:line="360" w:lineRule="exact"/>
+        <w:ind w:left="420" w:firstLineChars="0"/>
+        <w:rPr>
+          <w:rFonts w:eastAsia="宋体"/>
+        </w:rPr>
+      </w:pPr>
+      <w:r>
+        <w:rPr>
+          <w:rFonts w:eastAsia="宋体"/>
+        </w:rPr>
+        <w:t>在数据分析实践过程中应该更多采用已有的经过验证的方法。</w:t>
+      </w:r>
+    </w:p>
+    <w:p>
+      <w:pPr>
+        <w:spacing w:line="360" w:lineRule="exact"/>
+        <w:ind w:firstLineChars="200" w:firstLine="420"/>
+        <w:rPr>
+          <w:rFonts w:eastAsia="宋体"/>
+        </w:rPr>
+      </w:pPr>
+      <w:r>
+        <w:rPr>
+          <w:rFonts w:eastAsia="宋体" w:hint="eastAsia"/>
+        </w:rPr>
+        <w:t>。。。。。。</w:t>
+      </w:r>
+    </w:p>
+    <w:p>
+      <w:pPr>
+        <w:pStyle w:val="1"/>
+        <w:numPr>
+          <w:ilvl w:val="0"/>
+          <w:numId w:val="1"/>
+        </w:numPr>
+        <w:spacing w:line="360" w:lineRule="exact"/>
+        <w:ind w:left="420" w:firstLineChars="0"/>
+        <w:rPr>
+          <w:rFonts w:eastAsia="宋体"/>
+        </w:rPr>
+      </w:pPr>
+      <w:r>
+        <w:rPr>
+          <w:rFonts w:eastAsia="宋体"/>
+        </w:rPr>
+        <w:t>关于数据分析实验的可重复性上存在的问题和一些解决方案。</w:t>
+      </w:r>
+    </w:p>
+    <w:p>
+      <w:pPr>
+        <w:spacing w:line="360" w:lineRule="exact"/>
+        <w:ind w:firstLineChars="200" w:firstLine="420"/>
+        <w:rPr>
+          <w:rFonts w:eastAsia="宋体"/>
+        </w:rPr>
+      </w:pPr>
+      <w:r>
+        <w:rPr>
+          <w:rFonts w:eastAsia="宋体" w:hint="eastAsia"/>
+        </w:rPr>
+        <w:t>。。。。。。</w:t>
+      </w:r>
+    </w:p>
+    <w:p>
+      <w:pPr>
+        <w:pStyle w:val="1"/>
+        <w:numPr>
+          <w:ilvl w:val="0"/>
+          <w:numId w:val="1"/>
+        </w:numPr>
+        <w:spacing w:line="360" w:lineRule="exact"/>
+        <w:ind w:left="420" w:firstLineChars="0"/>
+        <w:rPr>
+          <w:rFonts w:eastAsia="宋体"/>
+        </w:rPr>
+      </w:pPr>
+      <w:r>
+        <w:rPr>
+          <w:rFonts w:eastAsia="宋体"/>
+        </w:rPr>
+        <w:t>集成分析与可视化将使的数据更加易于理解。</w:t>
+      </w:r>
+    </w:p>
+    <w:p>
+      <w:pPr>
+        <w:pStyle w:val="1"/>
+        <w:spacing w:line="360" w:lineRule="exact"/>
+        <w:ind w:left="420" w:firstLineChars="0" w:firstLine="0"/>
+        <w:rPr>
+          <w:rFonts w:eastAsia="宋体"/>
+        </w:rPr>
+      </w:pPr>
+      <w:r>
+        <w:rPr>
+          <w:rFonts w:eastAsia="宋体" w:hint="eastAsia"/>
+        </w:rPr>
+        <w:t>。。。。。。</w:t>
+      </w:r>
+    </w:p>
+    <w:p>
+      <w:pPr>
+        <w:spacing w:line="360" w:lineRule="exact"/>
+        <w:ind w:firstLineChars="200" w:firstLine="420"/>
+        <w:rPr>
+          <w:rFonts w:eastAsia="宋体"/>
+        </w:rPr>
+      </w:pPr>
+      <w:r>
+        <w:rPr>
+          <w:rFonts w:eastAsia="宋体"/>
+        </w:rPr>
+        <w:t>针对数据分析实验的可重复性问题</w:t>
+      </w:r>
+      <w:r>
+        <w:rPr>
+          <w:rFonts w:eastAsia="宋体"/>
+        </w:rPr>
+        <w:t xml:space="preserve">, </w:t>
+      </w:r>
+      <w:proofErr w:type="spellStart"/>
+      <w:r>
+        <w:rPr>
+          <w:rFonts w:eastAsia="宋体"/>
+        </w:rPr>
+        <w:t>Geir</w:t>
+      </w:r>
+      <w:proofErr w:type="spellEnd"/>
+      <w:r>
+        <w:rPr>
+          <w:rFonts w:eastAsia="宋体"/>
+        </w:rPr>
+        <w:t>等人提出了十条简单的原则</w:t>
+      </w:r>
+      <w:r>
+        <w:rPr>
+          <w:rFonts w:eastAsia="宋体"/>
+        </w:rPr>
+        <w:t xml:space="preserve">: 1) </w:t>
+      </w:r>
+      <w:r>
+        <w:rPr>
+          <w:rFonts w:eastAsia="宋体"/>
+        </w:rPr>
+        <w:t>对每一个结果</w:t>
+      </w:r>
+      <w:r>
+        <w:rPr>
+          <w:rFonts w:eastAsia="宋体"/>
+        </w:rPr>
+        <w:t xml:space="preserve">, </w:t>
+      </w:r>
+      <w:r>
+        <w:rPr>
+          <w:rFonts w:eastAsia="宋体"/>
+        </w:rPr>
+        <w:t>保存得到这个结果的</w:t>
+      </w:r>
+      <w:r>
+        <w:rPr>
+          <w:rFonts w:eastAsia="宋体"/>
+        </w:rPr>
+        <w:t>Track</w:t>
+      </w:r>
+      <w:r>
+        <w:rPr>
+          <w:rFonts w:eastAsia="宋体"/>
+        </w:rPr>
+        <w:t>。</w:t>
+      </w:r>
+      <w:r>
+        <w:rPr>
+          <w:rFonts w:eastAsia="宋体"/>
+        </w:rPr>
+        <w:t xml:space="preserve">2) </w:t>
+      </w:r>
+      <w:r>
+        <w:rPr>
+          <w:rFonts w:eastAsia="宋体"/>
+        </w:rPr>
+        <w:t>避免手工的数据处理。因为程序处理只要逻辑正确语法正确则结果就一定正确</w:t>
+      </w:r>
+      <w:r>
+        <w:rPr>
+          <w:rFonts w:eastAsia="宋体"/>
+        </w:rPr>
+        <w:t xml:space="preserve">, </w:t>
+      </w:r>
+      <w:r>
+        <w:rPr>
+          <w:rFonts w:eastAsia="宋体"/>
+        </w:rPr>
+        <w:t>而手工处理的话出现各种各样的问题的可能性较大。</w:t>
+      </w:r>
+      <w:r>
+        <w:rPr>
+          <w:rFonts w:eastAsia="宋体"/>
+        </w:rPr>
+        <w:t xml:space="preserve">3) </w:t>
+      </w:r>
+      <w:r>
+        <w:rPr>
+          <w:rFonts w:eastAsia="宋体"/>
+        </w:rPr>
+        <w:t>记录所有使用的软件的版本。</w:t>
+      </w:r>
+      <w:r>
+        <w:rPr>
+          <w:rFonts w:eastAsia="宋体"/>
+        </w:rPr>
+        <w:t xml:space="preserve">4) </w:t>
+      </w:r>
+      <w:r>
+        <w:rPr>
+          <w:rFonts w:eastAsia="宋体"/>
+        </w:rPr>
+        <w:t>对所有自编脚本进行版本控制。可以采用标准的代码改进追踪解决方案</w:t>
+      </w:r>
+      <w:r>
+        <w:rPr>
+          <w:rFonts w:eastAsia="宋体"/>
+        </w:rPr>
+        <w:t xml:space="preserve">, </w:t>
+      </w:r>
+      <w:r>
+        <w:rPr>
+          <w:rFonts w:eastAsia="宋体"/>
+        </w:rPr>
+        <w:t>比如</w:t>
+      </w:r>
+      <w:r>
+        <w:rPr>
+          <w:rFonts w:eastAsia="宋体"/>
+        </w:rPr>
+        <w:t>Git</w:t>
+      </w:r>
+      <w:r>
+        <w:rPr>
+          <w:rFonts w:eastAsia="宋体"/>
+        </w:rPr>
+        <w:t>、</w:t>
+      </w:r>
+      <w:r>
+        <w:rPr>
+          <w:rFonts w:eastAsia="宋体"/>
+        </w:rPr>
+        <w:t>Subversion</w:t>
+      </w:r>
+      <w:r>
+        <w:rPr>
+          <w:rFonts w:eastAsia="宋体"/>
+        </w:rPr>
+        <w:t>等。</w:t>
+      </w:r>
+      <w:r>
+        <w:rPr>
+          <w:rFonts w:eastAsia="宋体"/>
+        </w:rPr>
+        <w:t xml:space="preserve">5) </w:t>
+      </w:r>
+      <w:r>
+        <w:rPr>
+          <w:rFonts w:eastAsia="宋体"/>
+        </w:rPr>
+        <w:t>尽可能保存中间结果</w:t>
+      </w:r>
+      <w:r>
+        <w:rPr>
+          <w:rFonts w:eastAsia="宋体"/>
+        </w:rPr>
+        <w:t xml:space="preserve">, </w:t>
+      </w:r>
+      <w:r>
+        <w:rPr>
+          <w:rFonts w:eastAsia="宋体"/>
+        </w:rPr>
+        <w:t>至少在进行一项分析的时候保存这项分</w:t>
+      </w:r>
+      <w:r>
+        <w:rPr>
+          <w:rFonts w:eastAsia="宋体"/>
+        </w:rPr>
+        <w:lastRenderedPageBreak/>
+        <w:t>析的所有中间结果。</w:t>
+      </w:r>
+      <w:r>
+        <w:rPr>
+          <w:rFonts w:eastAsia="宋体"/>
+        </w:rPr>
+        <w:t xml:space="preserve">6) </w:t>
+      </w:r>
+      <w:r>
+        <w:rPr>
+          <w:rFonts w:eastAsia="宋体"/>
+        </w:rPr>
+        <w:t>对包含随机数的分析保存该随机数。</w:t>
+      </w:r>
+      <w:r>
+        <w:rPr>
+          <w:rFonts w:eastAsia="宋体"/>
+        </w:rPr>
+        <w:t xml:space="preserve">7) </w:t>
+      </w:r>
+      <w:r>
+        <w:rPr>
+          <w:rFonts w:eastAsia="宋体"/>
+        </w:rPr>
+        <w:t>总是保存画图所使用的数据。</w:t>
+      </w:r>
+      <w:r>
+        <w:rPr>
+          <w:rFonts w:eastAsia="宋体"/>
+        </w:rPr>
+        <w:t xml:space="preserve">8) </w:t>
+      </w:r>
+      <w:r>
+        <w:rPr>
+          <w:rFonts w:eastAsia="宋体"/>
+        </w:rPr>
+        <w:t>生成层级分析结果</w:t>
+      </w:r>
+      <w:r>
+        <w:rPr>
+          <w:rFonts w:eastAsia="宋体"/>
+        </w:rPr>
+        <w:t xml:space="preserve">, </w:t>
+      </w:r>
+      <w:r>
+        <w:rPr>
+          <w:rFonts w:eastAsia="宋体"/>
+        </w:rPr>
+        <w:t>使得每一增加细节的环节都可以被调查。</w:t>
+      </w:r>
+      <w:r>
+        <w:rPr>
+          <w:rFonts w:eastAsia="宋体"/>
+        </w:rPr>
+        <w:t xml:space="preserve">9) </w:t>
+      </w:r>
+      <w:r>
+        <w:rPr>
+          <w:rFonts w:eastAsia="宋体"/>
+        </w:rPr>
+        <w:t>为每一个分析结果的产生注释一段文本的说明。使得研究者再回过头来看的时候</w:t>
+      </w:r>
+      <w:r>
+        <w:rPr>
+          <w:rFonts w:eastAsia="宋体"/>
+        </w:rPr>
+        <w:t xml:space="preserve">, </w:t>
+      </w:r>
+      <w:r>
+        <w:rPr>
+          <w:rFonts w:eastAsia="宋体"/>
+        </w:rPr>
+        <w:t>可以快速明白这个分析的参数的设置过程中都考虑了哪些因素。</w:t>
+      </w:r>
+      <w:r>
+        <w:rPr>
+          <w:rFonts w:eastAsia="宋体"/>
+        </w:rPr>
+        <w:t xml:space="preserve">10) </w:t>
+      </w:r>
+      <w:r>
+        <w:rPr>
+          <w:rFonts w:eastAsia="宋体"/>
+        </w:rPr>
+        <w:t>提供可公开访问的输入数据</w:t>
+      </w:r>
+      <w:r>
+        <w:rPr>
+          <w:rFonts w:eastAsia="宋体"/>
+        </w:rPr>
+        <w:t xml:space="preserve">, </w:t>
+      </w:r>
+      <w:r>
+        <w:rPr>
+          <w:rFonts w:eastAsia="宋体"/>
+        </w:rPr>
+        <w:t>脚本</w:t>
+      </w:r>
+      <w:r>
+        <w:rPr>
+          <w:rFonts w:eastAsia="宋体"/>
+        </w:rPr>
+        <w:t xml:space="preserve">, </w:t>
+      </w:r>
+      <w:r>
+        <w:rPr>
+          <w:rFonts w:eastAsia="宋体"/>
+        </w:rPr>
+        <w:t>版本和参数等。</w:t>
+      </w:r>
+      <w:r>
+        <w:rPr>
+          <w:rFonts w:ascii="Times New Roman" w:eastAsia="宋体" w:hAnsi="Times New Roman" w:cs="Times New Roman" w:hint="eastAsia"/>
+          <w:color w:val="000000"/>
+          <w:szCs w:val="21"/>
+        </w:rPr>
+        <w:t>”</w:t>
+      </w:r>
+    </w:p>
+    <w:p>
+      <w:pPr>
+        <w:autoSpaceDE w:val="0"/>
+        <w:autoSpaceDN w:val="0"/>
+        <w:adjustRightInd w:val="0"/>
+        <w:spacing w:line="360" w:lineRule="exact"/>
+        <w:ind w:firstLineChars="200" w:firstLine="420"/>
+        <w:rPr>
+          <w:rFonts w:ascii="Times New Roman" w:eastAsia="宋体" w:hAnsi="Times New Roman" w:cs="Times New Roman"/>
+          <w:color w:val="000000"/>
+          <w:szCs w:val="21"/>
+        </w:rPr>
+      </w:pPr>
+      <w:r>
+        <w:rPr>
+          <w:rFonts w:ascii="Times New Roman" w:eastAsia="宋体" w:hAnsi="Times New Roman" w:cs="Times New Roman" w:hint="eastAsia"/>
+          <w:color w:val="000000"/>
+          <w:szCs w:val="21"/>
+        </w:rPr>
+        <w:t>“</w:t>
+      </w:r>
+      <w:r>
+        <w:rPr>
+          <w:rFonts w:ascii="Times New Roman" w:eastAsia="宋体" w:hAnsi="Times New Roman" w:cs="Times New Roman" w:hint="eastAsia"/>
+          <w:color w:val="000000"/>
+          <w:szCs w:val="21"/>
+        </w:rPr>
+        <w:t>本系统的意义不仅在于实现当前的一些方便数据管理和分析的功能，更在于提供了一个非常灵活的框架，可以将生物信息繁重的分析工作有机的、成系统的拆分和组织，使得具体的问题可以被划分到特定的专业人员进行完善，也为有生物信息分析业务的企业提供了一个组织不同专业背景的团队来解决各个特定生物学问题或者分析工作的手段，不论是在科学研究的探索上，还是工程化批量生产上都可以起到很好的作用。本系统的构建思想吸收了当前生物大数据分析领域的进展、观点和准测（参考综述部分）。</w:t>
+      </w:r>
+      <w:r>
+        <w:rPr>
+          <w:rFonts w:ascii="Times New Roman" w:eastAsia="宋体" w:hAnsi="Times New Roman" w:cs="Times New Roman" w:hint="eastAsia"/>
+          <w:color w:val="000000"/>
+          <w:szCs w:val="21"/>
+        </w:rPr>
+        <w:t>”</w:t>
+      </w:r>
+      <w:r>
+        <w:rPr>
+          <w:rFonts w:ascii="Times New Roman" w:eastAsia="宋体" w:hAnsi="Times New Roman" w:cs="Times New Roman" w:hint="eastAsia"/>
+          <w:color w:val="000000"/>
+          <w:szCs w:val="21"/>
+        </w:rPr>
+        <w:t>----</w:t>
+      </w:r>
+      <w:r>
+        <w:rPr>
+          <w:rFonts w:ascii="Times New Roman" w:eastAsia="宋体" w:hAnsi="Times New Roman" w:cs="Times New Roman" w:hint="eastAsia"/>
+          <w:color w:val="000000"/>
+          <w:szCs w:val="21"/>
+        </w:rPr>
+        <w:t>摘自</w:t>
+      </w:r>
+      <w:r>
+        <w:rPr>
+          <w:rFonts w:ascii="Times New Roman" w:eastAsia="宋体" w:hAnsi="Times New Roman" w:cs="Times New Roman" w:hint="eastAsia"/>
+          <w:color w:val="000000"/>
+          <w:szCs w:val="21"/>
+        </w:rPr>
+        <w:t>本人</w:t>
+      </w:r>
+      <w:r>
+        <w:rPr>
+          <w:rFonts w:ascii="Times New Roman" w:eastAsia="宋体" w:hAnsi="Times New Roman" w:cs="Times New Roman" w:hint="eastAsia"/>
+          <w:color w:val="000000"/>
+          <w:szCs w:val="21"/>
+        </w:rPr>
+        <w:t>博士论文</w:t>
+      </w:r>
+    </w:p>
+    <w:p>
+      <w:pPr>
+        <w:autoSpaceDE w:val="0"/>
+        <w:autoSpaceDN w:val="0"/>
+        <w:adjustRightInd w:val="0"/>
+        <w:spacing w:line="360" w:lineRule="exact"/>
+        <w:ind w:firstLineChars="200" w:firstLine="420"/>
+      </w:pPr>
+    </w:p>
+    <w:p>
+      <w:pPr>
+        <w:rPr>
+          <w:rFonts w:asciiTheme="minorEastAsia" w:hAnsiTheme="minorEastAsia" w:cs="Times New Roman"/>
+          <w:color w:val="000000" w:themeColor="text1"/>
+          <w:szCs w:val="21"/>
+        </w:rPr>
+      </w:pPr>
+    </w:p>
     <w:sectPr>
       <w:pgSz w:w="11906" w:h="16838"/>
       <w:pgMar w:top="1440" w:right="1800" w:bottom="1440" w:left="1800" w:header="851" w:footer="992" w:gutter="0"/>
@@ -2875,6 +3573,132 @@
     </w:p>
   </w:footnote>
 </w:footnotes>
+</file>
+
+<file path=word/numbering.xml><?xml version="1.0" encoding="utf-8"?>
+<w:numbering xmlns:wpc="http://schemas.microsoft.com/office/word/2010/wordprocessingCanvas" xmlns:cx="http://schemas.microsoft.com/office/drawing/2014/chartex" xmlns:cx1="http://schemas.microsoft.com/office/drawing/2015/9/8/chartex" xmlns:cx2="http://schemas.microsoft.com/office/drawing/2015/10/21/chartex" xmlns:cx3="http://schemas.microsoft.com/office/drawing/2016/5/9/chartex" xmlns:cx4="http://schemas.microsoft.com/office/drawing/2016/5/10/chartex" xmlns:cx5="http://schemas.microsoft.com/office/drawing/2016/5/11/chartex" xmlns:cx6="http://schemas.microsoft.com/office/drawing/2016/5/12/chartex" xmlns:cx7="http://schemas.microsoft.com/office/drawing/2016/5/13/chartex" xmlns:cx8="http://schemas.microsoft.com/office/drawing/2016/5/14/chartex" xmlns:mc="http://schemas.openxmlformats.org/markup-compatibility/2006" xmlns:aink="http://schemas.microsoft.com/office/drawing/2016/ink" xmlns:am3d="http://schemas.microsoft.com/office/drawing/2017/model3d" xmlns:o="urn:schemas-microsoft-com:office:office" xmlns:r="http://schemas.openxmlformats.org/officeDocument/2006/relationships" xmlns:m="http://schemas.openxmlformats.org/officeDocument/2006/math" xmlns:v="urn:schemas-microsoft-com:vml" xmlns:wp14="http://schemas.microsoft.com/office/word/2010/wordprocessingDrawing" xmlns:wp="http://schemas.openxmlformats.org/drawingml/2006/wordprocessingDrawing" xmlns:w10="urn:schemas-microsoft-com:office:word" xmlns:w="http://schemas.openxmlformats.org/wordprocessingml/2006/main" xmlns:w14="http://schemas.microsoft.com/office/word/2010/wordml" xmlns:w15="http://schemas.microsoft.com/office/word/2012/wordml" xmlns:w16cid="http://schemas.microsoft.com/office/word/2016/wordml/cid" xmlns:w16se="http://schemas.microsoft.com/office/word/2015/wordml/symex" xmlns:wpg="http://schemas.microsoft.com/office/word/2010/wordprocessingGroup" xmlns:wpi="http://schemas.microsoft.com/office/word/2010/wordprocessingInk" xmlns:wne="http://schemas.microsoft.com/office/word/2006/wordml" xmlns:wps="http://schemas.microsoft.com/office/word/2010/wordprocessingShape" mc:Ignorable="w14 w15 w16se w16cid wp14">
+  <w:abstractNum w:abstractNumId="0" w15:restartNumberingAfterBreak="0">
+    <w:nsid w:val="7D0C0DF0"/>
+    <w:multiLevelType w:val="multilevel"/>
+    <w:tmpl w:val="7D0C0DF0"/>
+    <w:lvl w:ilvl="0">
+      <w:start w:val="1"/>
+      <w:numFmt w:val="decimal"/>
+      <w:lvlText w:val="%1."/>
+      <w:lvlJc w:val="left"/>
+      <w:pPr>
+        <w:ind w:left="840" w:hanging="420"/>
+      </w:pPr>
+    </w:lvl>
+    <w:lvl w:ilvl="1">
+      <w:start w:val="1"/>
+      <w:numFmt w:val="decimal"/>
+      <w:isLgl/>
+      <w:lvlText w:val="%1.%2"/>
+      <w:lvlJc w:val="left"/>
+      <w:pPr>
+        <w:ind w:left="780" w:hanging="360"/>
+      </w:pPr>
+      <w:rPr>
+        <w:rFonts w:hint="default"/>
+      </w:rPr>
+    </w:lvl>
+    <w:lvl w:ilvl="2">
+      <w:start w:val="1"/>
+      <w:numFmt w:val="decimal"/>
+      <w:isLgl/>
+      <w:lvlText w:val="%1.%2.%3"/>
+      <w:lvlJc w:val="left"/>
+      <w:pPr>
+        <w:ind w:left="1140" w:hanging="720"/>
+      </w:pPr>
+      <w:rPr>
+        <w:rFonts w:hint="default"/>
+      </w:rPr>
+    </w:lvl>
+    <w:lvl w:ilvl="3">
+      <w:start w:val="1"/>
+      <w:numFmt w:val="decimal"/>
+      <w:isLgl/>
+      <w:lvlText w:val="%1.%2.%3.%4"/>
+      <w:lvlJc w:val="left"/>
+      <w:pPr>
+        <w:ind w:left="1140" w:hanging="720"/>
+      </w:pPr>
+      <w:rPr>
+        <w:rFonts w:hint="default"/>
+      </w:rPr>
+    </w:lvl>
+    <w:lvl w:ilvl="4">
+      <w:start w:val="1"/>
+      <w:numFmt w:val="decimal"/>
+      <w:isLgl/>
+      <w:lvlText w:val="%1.%2.%3.%4.%5"/>
+      <w:lvlJc w:val="left"/>
+      <w:pPr>
+        <w:ind w:left="1500" w:hanging="1080"/>
+      </w:pPr>
+      <w:rPr>
+        <w:rFonts w:hint="default"/>
+      </w:rPr>
+    </w:lvl>
+    <w:lvl w:ilvl="5">
+      <w:start w:val="1"/>
+      <w:numFmt w:val="decimal"/>
+      <w:isLgl/>
+      <w:lvlText w:val="%1.%2.%3.%4.%5.%6"/>
+      <w:lvlJc w:val="left"/>
+      <w:pPr>
+        <w:ind w:left="1500" w:hanging="1080"/>
+      </w:pPr>
+      <w:rPr>
+        <w:rFonts w:hint="default"/>
+      </w:rPr>
+    </w:lvl>
+    <w:lvl w:ilvl="6">
+      <w:start w:val="1"/>
+      <w:numFmt w:val="decimal"/>
+      <w:isLgl/>
+      <w:lvlText w:val="%1.%2.%3.%4.%5.%6.%7"/>
+      <w:lvlJc w:val="left"/>
+      <w:pPr>
+        <w:ind w:left="1500" w:hanging="1080"/>
+      </w:pPr>
+      <w:rPr>
+        <w:rFonts w:hint="default"/>
+      </w:rPr>
+    </w:lvl>
+    <w:lvl w:ilvl="7">
+      <w:start w:val="1"/>
+      <w:numFmt w:val="decimal"/>
+      <w:isLgl/>
+      <w:lvlText w:val="%1.%2.%3.%4.%5.%6.%7.%8"/>
+      <w:lvlJc w:val="left"/>
+      <w:pPr>
+        <w:ind w:left="1860" w:hanging="1440"/>
+      </w:pPr>
+      <w:rPr>
+        <w:rFonts w:hint="default"/>
+      </w:rPr>
+    </w:lvl>
+    <w:lvl w:ilvl="8">
+      <w:start w:val="1"/>
+      <w:numFmt w:val="decimal"/>
+      <w:isLgl/>
+      <w:lvlText w:val="%1.%2.%3.%4.%5.%6.%7.%8.%9"/>
+      <w:lvlJc w:val="left"/>
+      <w:pPr>
+        <w:ind w:left="1860" w:hanging="1440"/>
+      </w:pPr>
+      <w:rPr>
+        <w:rFonts w:hint="default"/>
+      </w:rPr>
+    </w:lvl>
+  </w:abstractNum>
+  <w:num w:numId="1">
+    <w:abstractNumId w:val="0"/>
+  </w:num>
+</w:numbering>
 </file>
 
 <file path=word/styles.xml><?xml version="1.0" encoding="utf-8"?>
@@ -3403,6 +4227,46 @@
       <w:szCs w:val="18"/>
     </w:rPr>
   </w:style>
+  <w:style w:type="paragraph" w:styleId="aa">
+    <w:name w:val="Balloon Text"/>
+    <w:basedOn w:val="a"/>
+    <w:link w:val="ab"/>
+    <w:uiPriority w:val="99"/>
+    <w:semiHidden/>
+    <w:unhideWhenUsed/>
+    <w:rsid w:val="003262FA"/>
+    <w:rPr>
+      <w:sz w:val="18"/>
+      <w:szCs w:val="18"/>
+    </w:rPr>
+  </w:style>
+  <w:style w:type="character" w:customStyle="1" w:styleId="ab">
+    <w:name w:val="批注框文本 字符"/>
+    <w:basedOn w:val="a0"/>
+    <w:link w:val="aa"/>
+    <w:uiPriority w:val="99"/>
+    <w:semiHidden/>
+    <w:rsid w:val="003262FA"/>
+    <w:rPr>
+      <w:sz w:val="18"/>
+      <w:szCs w:val="18"/>
+    </w:rPr>
+  </w:style>
+  <w:style w:type="paragraph" w:customStyle="1" w:styleId="1">
+    <w:name w:val="列出段落1"/>
+    <w:basedOn w:val="a"/>
+    <w:uiPriority w:val="34"/>
+    <w:qFormat/>
+    <w:rsid w:val="00961A03"/>
+    <w:pPr>
+      <w:ind w:firstLineChars="200" w:firstLine="420"/>
+    </w:pPr>
+    <w:rPr>
+      <w:rFonts w:ascii="Times New Roman" w:hAnsi="Times New Roman" w:cs="Times New Roman"/>
+      <w:color w:val="000000"/>
+      <w:szCs w:val="21"/>
+    </w:rPr>
+  </w:style>
 </w:styles>
 </file>
 

</xml_diff>

<commit_message>
add log and going to fix MS and answer reviewers
</commit_message>
<xml_diff>
--- a/demo介绍.docx
+++ b/demo介绍.docx
@@ -65,29 +65,21 @@
         <w:rPr>
           <w:rFonts w:hint="eastAsia"/>
         </w:rPr>
-        <w:t>简单介绍一下它现在</w:t>
+        <w:t>简单介绍一下它现在非常初步的功能：</w:t>
+      </w:r>
+    </w:p>
+    <w:p>
+      <w:r>
+        <w:rPr>
+          <w:rFonts w:hint="eastAsia"/>
+        </w:rPr>
+        <w:t>写了一个功能介绍文档</w:t>
+      </w:r>
+      <w:r>
+        <w:t xml:space="preserve"> 在 https://github.com/vitogump/life/tree/mergetocompass 中 下载lifeWebBasedSystemUserGuide.pptx文件有个非常粗</w:t>
       </w:r>
       <w:bookmarkStart w:id="0" w:name="_GoBack"/>
       <w:bookmarkEnd w:id="0"/>
-      <w:r>
-        <w:rPr>
-          <w:rFonts w:hint="eastAsia"/>
-        </w:rPr>
-        <w:t>非常初步的功能：</w:t>
-      </w:r>
-    </w:p>
-    <w:p>
-      <w:r>
-        <w:rPr>
-          <w:rFonts w:hint="eastAsia"/>
-        </w:rPr>
-        <w:t>写了一个功能介绍文档</w:t>
-      </w:r>
-      <w:r>
-        <w:t xml:space="preserve"> 在 https://github.com/vitogump/life/tree/mergetocompass 中 下载lifeWebBasedSystemUserGuide.pptx文件有个非常粗</w:t>
-      </w:r>
-    </w:p>
-    <w:p>
       <w:r>
         <w:rPr>
           <w:rFonts w:hint="eastAsia"/>
@@ -1926,7 +1918,7 @@
           <w:sz w:val="24"/>
           <w:szCs w:val="24"/>
         </w:rPr>
-        <w:t>最如</w:t>
+        <w:t>最如下</w:t>
       </w:r>
       <w:proofErr w:type="gramEnd"/>
       <w:r>
@@ -1936,7 +1928,7 @@
           <w:sz w:val="24"/>
           <w:szCs w:val="24"/>
         </w:rPr>
-        <w:t>下输入。对二级子目录的筛选类似，筛选跟多只需点击“添加”按钮再填入需要筛选的目录名。</w:t>
+        <w:t>输入。对二级子目录的筛选类似，筛选跟多只需点击“添加”按钮再填入需要筛选的目录名。</w:t>
       </w:r>
     </w:p>
     <w:p>
@@ -3715,7 +3707,7 @@
     </w:rPrDefault>
     <w:pPrDefault/>
   </w:docDefaults>
-  <w:latentStyles w:defLockedState="0" w:defUIPriority="99" w:defSemiHidden="0" w:defUnhideWhenUsed="0" w:defQFormat="0" w:count="375">
+  <w:latentStyles w:defLockedState="0" w:defUIPriority="99" w:defSemiHidden="0" w:defUnhideWhenUsed="0" w:defQFormat="0" w:count="376">
     <w:lsdException w:name="Normal" w:uiPriority="0" w:qFormat="1"/>
     <w:lsdException w:name="heading 1" w:uiPriority="9" w:qFormat="1"/>
     <w:lsdException w:name="heading 2" w:semiHidden="1" w:uiPriority="9" w:unhideWhenUsed="1" w:qFormat="1"/>
@@ -3821,7 +3813,6 @@
     <w:lsdException w:name="HTML Sample" w:semiHidden="1" w:unhideWhenUsed="1"/>
     <w:lsdException w:name="HTML Typewriter" w:semiHidden="1" w:unhideWhenUsed="1"/>
     <w:lsdException w:name="HTML Variable" w:semiHidden="1" w:unhideWhenUsed="1"/>
-    <w:lsdException w:name="Normal Table" w:semiHidden="1" w:unhideWhenUsed="1"/>
     <w:lsdException w:name="annotation subject" w:semiHidden="1" w:unhideWhenUsed="1"/>
     <w:lsdException w:name="No List" w:semiHidden="1" w:unhideWhenUsed="1"/>
     <w:lsdException w:name="Outline List 1" w:semiHidden="1" w:unhideWhenUsed="1"/>
@@ -3868,10 +3859,8 @@
     <w:lsdException w:name="Table Subtle 2" w:semiHidden="1" w:unhideWhenUsed="1"/>
     <w:lsdException w:name="Table Web 1" w:semiHidden="1" w:unhideWhenUsed="1"/>
     <w:lsdException w:name="Table Web 2" w:semiHidden="1" w:unhideWhenUsed="1"/>
-    <w:lsdException w:name="Table Web 3" w:semiHidden="1" w:unhideWhenUsed="1"/>
     <w:lsdException w:name="Balloon Text" w:semiHidden="1" w:unhideWhenUsed="1"/>
     <w:lsdException w:name="Table Grid" w:uiPriority="39"/>
-    <w:lsdException w:name="Table Theme" w:semiHidden="1" w:unhideWhenUsed="1"/>
     <w:lsdException w:name="Placeholder Text" w:semiHidden="1"/>
     <w:lsdException w:name="No Spacing" w:uiPriority="1" w:qFormat="1"/>
     <w:lsdException w:name="Light Shading" w:uiPriority="60"/>
@@ -4091,6 +4080,7 @@
     <w:lsdException w:name="Smart Hyperlink" w:semiHidden="1" w:unhideWhenUsed="1"/>
     <w:lsdException w:name="Hashtag" w:semiHidden="1" w:unhideWhenUsed="1"/>
     <w:lsdException w:name="Unresolved Mention" w:semiHidden="1" w:unhideWhenUsed="1"/>
+    <w:lsdException w:name="Smart Link" w:semiHidden="1" w:unhideWhenUsed="1"/>
   </w:latentStyles>
   <w:style w:type="paragraph" w:default="1" w:styleId="a">
     <w:name w:val="Normal"/>

</xml_diff>

<commit_message>
all done except Service.py; hang out for two day
</commit_message>
<xml_diff>
--- a/demo介绍.docx
+++ b/demo介绍.docx
@@ -80,13 +80,6 @@
       </w:r>
     </w:p>
     <w:p>
-      <w:pPr>
-        <w:rPr>
-          <w:rFonts w:hint="eastAsia"/>
-        </w:rPr>
-      </w:pPr>
-      <w:bookmarkStart w:id="0" w:name="_GoBack"/>
-      <w:bookmarkEnd w:id="0"/>
       <w:r>
         <w:t>既然数据是有序的，对有序的数据施以一定的操作，这个过程能否更简单的表示。</w:t>
       </w:r>
@@ -1038,7 +1031,7 @@
               </wp:anchor>
             </w:drawing>
           </mc:Choice>
-          <mc:Fallback xmlns:w16se="http://schemas.microsoft.com/office/word/2015/wordml/symex" xmlns:w16cid="http://schemas.microsoft.com/office/word/2016/wordml/cid" xmlns:am3d="http://schemas.microsoft.com/office/drawing/2017/model3d" xmlns:aink="http://schemas.microsoft.com/office/drawing/2016/ink" xmlns:cx8="http://schemas.microsoft.com/office/drawing/2016/5/14/chartex" xmlns:cx7="http://schemas.microsoft.com/office/drawing/2016/5/13/chartex" xmlns:cx6="http://schemas.microsoft.com/office/drawing/2016/5/12/chartex" xmlns:cx5="http://schemas.microsoft.com/office/drawing/2016/5/11/chartex" xmlns:cx4="http://schemas.microsoft.com/office/drawing/2016/5/10/chartex" xmlns:cx3="http://schemas.microsoft.com/office/drawing/2016/5/9/chartex" xmlns:cx2="http://schemas.microsoft.com/office/drawing/2015/10/21/chartex" xmlns:cx1="http://schemas.microsoft.com/office/drawing/2015/9/8/chartex" xmlns:cx="http://schemas.microsoft.com/office/drawing/2014/chartex">
+          <mc:Fallback xmlns:cx="http://schemas.microsoft.com/office/drawing/2014/chartex" xmlns:cx1="http://schemas.microsoft.com/office/drawing/2015/9/8/chartex" xmlns:cx2="http://schemas.microsoft.com/office/drawing/2015/10/21/chartex" xmlns:cx3="http://schemas.microsoft.com/office/drawing/2016/5/9/chartex" xmlns:cx4="http://schemas.microsoft.com/office/drawing/2016/5/10/chartex" xmlns:cx5="http://schemas.microsoft.com/office/drawing/2016/5/11/chartex" xmlns:cx6="http://schemas.microsoft.com/office/drawing/2016/5/12/chartex" xmlns:cx7="http://schemas.microsoft.com/office/drawing/2016/5/13/chartex" xmlns:cx8="http://schemas.microsoft.com/office/drawing/2016/5/14/chartex" xmlns:aink="http://schemas.microsoft.com/office/drawing/2016/ink" xmlns:am3d="http://schemas.microsoft.com/office/drawing/2017/model3d" xmlns:w16cid="http://schemas.microsoft.com/office/word/2016/wordml/cid" xmlns:w16se="http://schemas.microsoft.com/office/word/2015/wordml/symex">
             <w:pict>
               <v:rect w14:anchorId="737015C9" id="矩形 42" o:spid="_x0000_s1026" style="position:absolute;left:0;text-align:left;margin-left:-10.5pt;margin-top:114.15pt;width:255.7pt;height:63.75pt;z-index:251662336;visibility:visible;mso-wrap-style:square;mso-wrap-distance-left:9pt;mso-wrap-distance-top:0;mso-wrap-distance-right:9pt;mso-wrap-distance-bottom:0;mso-position-horizontal:absolute;mso-position-horizontal-relative:text;mso-position-vertical:absolute;mso-position-vertical-relative:text;v-text-anchor:middle" o:gfxdata="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" filled="f" strokecolor="red" strokeweight="1pt"/>
             </w:pict>
@@ -3015,6 +3008,73 @@
           <w:szCs w:val="21"/>
         </w:rPr>
       </w:pPr>
+      <w:r>
+        <w:rPr>
+          <w:rFonts w:asciiTheme="minorEastAsia" w:hAnsiTheme="minorEastAsia" w:cs="Times New Roman" w:hint="eastAsia"/>
+          <w:color w:val="000000" w:themeColor="text1"/>
+          <w:szCs w:val="21"/>
+        </w:rPr>
+        <w:t>目前增加</w:t>
+      </w:r>
+      <w:r>
+        <w:rPr>
+          <w:rFonts w:asciiTheme="minorEastAsia" w:hAnsiTheme="minorEastAsia" w:cs="Times New Roman"/>
+          <w:color w:val="000000" w:themeColor="text1"/>
+          <w:szCs w:val="21"/>
+        </w:rPr>
+        <w:t>了</w:t>
+      </w:r>
+      <w:r>
+        <w:rPr>
+          <w:rFonts w:asciiTheme="minorEastAsia" w:hAnsiTheme="minorEastAsia" w:cs="Times New Roman" w:hint="eastAsia"/>
+          <w:color w:val="000000" w:themeColor="text1"/>
+          <w:szCs w:val="21"/>
+        </w:rPr>
+        <w:t>对一批</w:t>
+      </w:r>
+      <w:r>
+        <w:rPr>
+          <w:rFonts w:asciiTheme="minorEastAsia" w:hAnsiTheme="minorEastAsia" w:cs="Times New Roman"/>
+          <w:color w:val="000000" w:themeColor="text1"/>
+          <w:szCs w:val="21"/>
+        </w:rPr>
+        <w:t>目录的处理模块，尚未完成</w:t>
+      </w:r>
+    </w:p>
+    <w:p>
+      <w:pPr>
+        <w:rPr>
+          <w:rFonts w:asciiTheme="minorEastAsia" w:hAnsiTheme="minorEastAsia" w:cs="Times New Roman" w:hint="eastAsia"/>
+          <w:color w:val="000000" w:themeColor="text1"/>
+          <w:szCs w:val="21"/>
+        </w:rPr>
+      </w:pPr>
+      <w:r>
+        <w:rPr>
+          <w:rFonts w:asciiTheme="minorEastAsia" w:hAnsiTheme="minorEastAsia" w:cs="Times New Roman"/>
+          <w:color w:val="000000" w:themeColor="text1"/>
+          <w:szCs w:val="21"/>
+        </w:rPr>
+        <w:t>Service.py</w:t>
+      </w:r>
+      <w:r>
+        <w:rPr>
+          <w:rFonts w:asciiTheme="minorEastAsia" w:hAnsiTheme="minorEastAsia" w:cs="Times New Roman" w:hint="eastAsia"/>
+          <w:color w:val="000000" w:themeColor="text1"/>
+          <w:szCs w:val="21"/>
+        </w:rPr>
+        <w:t>第88行process关于</w:t>
+      </w:r>
+      <w:r>
+        <w:rPr>
+          <w:rFonts w:asciiTheme="minorEastAsia" w:hAnsiTheme="minorEastAsia" w:cs="Times New Roman"/>
+          <w:color w:val="000000" w:themeColor="text1"/>
+          <w:szCs w:val="21"/>
+        </w:rPr>
+        <w:t>创建输出目录还需要在调整。</w:t>
+      </w:r>
+      <w:bookmarkStart w:id="0" w:name="_GoBack"/>
+      <w:bookmarkEnd w:id="0"/>
     </w:p>
     <w:sectPr>
       <w:pgSz w:w="11906" w:h="16838"/>

</xml_diff>

<commit_message>
cp mv is still not finished;produce sh like this /USCIRL/project/Fastq/lims/A00262/180621_A00262_L2_0122_BH5FW3DSXX/fastq/Project_RTCS/CS00GL18AW0003-1-55_H5FW3DSXX_L2_CS00GL18AW0003-1-55_20180621_P scriptinputdata scriptoutputdata cp    /USCIRL/project/RD/CTBCTG/liurui/ js function to give a input text is need to be finished
</commit_message>
<xml_diff>
--- a/demo介绍.docx
+++ b/demo介绍.docx
@@ -1031,7 +1031,7 @@
               </wp:anchor>
             </w:drawing>
           </mc:Choice>
-          <mc:Fallback xmlns:cx="http://schemas.microsoft.com/office/drawing/2014/chartex" xmlns:cx1="http://schemas.microsoft.com/office/drawing/2015/9/8/chartex" xmlns:cx2="http://schemas.microsoft.com/office/drawing/2015/10/21/chartex" xmlns:cx3="http://schemas.microsoft.com/office/drawing/2016/5/9/chartex" xmlns:cx4="http://schemas.microsoft.com/office/drawing/2016/5/10/chartex" xmlns:cx5="http://schemas.microsoft.com/office/drawing/2016/5/11/chartex" xmlns:cx6="http://schemas.microsoft.com/office/drawing/2016/5/12/chartex" xmlns:cx7="http://schemas.microsoft.com/office/drawing/2016/5/13/chartex" xmlns:cx8="http://schemas.microsoft.com/office/drawing/2016/5/14/chartex" xmlns:aink="http://schemas.microsoft.com/office/drawing/2016/ink" xmlns:am3d="http://schemas.microsoft.com/office/drawing/2017/model3d" xmlns:w16cid="http://schemas.microsoft.com/office/word/2016/wordml/cid" xmlns:w16se="http://schemas.microsoft.com/office/word/2015/wordml/symex">
+          <mc:Fallback xmlns:w16se="http://schemas.microsoft.com/office/word/2015/wordml/symex" xmlns:w16cid="http://schemas.microsoft.com/office/word/2016/wordml/cid" xmlns:am3d="http://schemas.microsoft.com/office/drawing/2017/model3d" xmlns:aink="http://schemas.microsoft.com/office/drawing/2016/ink" xmlns:cx8="http://schemas.microsoft.com/office/drawing/2016/5/14/chartex" xmlns:cx7="http://schemas.microsoft.com/office/drawing/2016/5/13/chartex" xmlns:cx6="http://schemas.microsoft.com/office/drawing/2016/5/12/chartex" xmlns:cx5="http://schemas.microsoft.com/office/drawing/2016/5/11/chartex" xmlns:cx4="http://schemas.microsoft.com/office/drawing/2016/5/10/chartex" xmlns:cx3="http://schemas.microsoft.com/office/drawing/2016/5/9/chartex" xmlns:cx2="http://schemas.microsoft.com/office/drawing/2015/10/21/chartex" xmlns:cx1="http://schemas.microsoft.com/office/drawing/2015/9/8/chartex" xmlns:cx="http://schemas.microsoft.com/office/drawing/2014/chartex">
             <w:pict>
               <v:rect w14:anchorId="737015C9" id="矩形 42" o:spid="_x0000_s1026" style="position:absolute;left:0;text-align:left;margin-left:-10.5pt;margin-top:114.15pt;width:255.7pt;height:63.75pt;z-index:251662336;visibility:visible;mso-wrap-style:square;mso-wrap-distance-left:9pt;mso-wrap-distance-top:0;mso-wrap-distance-right:9pt;mso-wrap-distance-bottom:0;mso-position-horizontal:absolute;mso-position-horizontal-relative:text;mso-position-vertical:absolute;mso-position-vertical-relative:text;v-text-anchor:middle" o:gfxdata="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" filled="f" strokecolor="red" strokeweight="1pt"/>
             </w:pict>
@@ -3044,26 +3044,60 @@
     <w:p>
       <w:pPr>
         <w:rPr>
+          <w:rFonts w:asciiTheme="minorEastAsia" w:hAnsiTheme="minorEastAsia" w:cs="Times New Roman"/>
+          <w:color w:val="000000" w:themeColor="text1"/>
+          <w:szCs w:val="21"/>
+        </w:rPr>
+      </w:pPr>
+      <w:r>
+        <w:rPr>
+          <w:rFonts w:asciiTheme="minorEastAsia" w:hAnsiTheme="minorEastAsia" w:cs="Times New Roman"/>
+          <w:color w:val="000000" w:themeColor="text1"/>
+          <w:szCs w:val="21"/>
+        </w:rPr>
+        <w:t>Service.py</w:t>
+      </w:r>
+      <w:r>
+        <w:rPr>
           <w:rFonts w:asciiTheme="minorEastAsia" w:hAnsiTheme="minorEastAsia" w:cs="Times New Roman" w:hint="eastAsia"/>
           <w:color w:val="000000" w:themeColor="text1"/>
           <w:szCs w:val="21"/>
         </w:rPr>
-      </w:pPr>
+        <w:t>第88行process关于</w:t>
+      </w:r>
       <w:r>
         <w:rPr>
           <w:rFonts w:asciiTheme="minorEastAsia" w:hAnsiTheme="minorEastAsia" w:cs="Times New Roman"/>
           <w:color w:val="000000" w:themeColor="text1"/>
           <w:szCs w:val="21"/>
         </w:rPr>
-        <w:t>Service.py</w:t>
-      </w:r>
-      <w:r>
+        <w:t>创建输出目录还需要在调整。</w:t>
+      </w:r>
+    </w:p>
+    <w:p>
+      <w:pPr>
+        <w:rPr>
+          <w:rFonts w:asciiTheme="minorEastAsia" w:hAnsiTheme="minorEastAsia" w:cs="Times New Roman"/>
+          <w:color w:val="000000" w:themeColor="text1"/>
+          <w:szCs w:val="21"/>
+        </w:rPr>
+      </w:pPr>
+    </w:p>
+    <w:p>
+      <w:pPr>
         <w:rPr>
           <w:rFonts w:asciiTheme="minorEastAsia" w:hAnsiTheme="minorEastAsia" w:cs="Times New Roman" w:hint="eastAsia"/>
           <w:color w:val="000000" w:themeColor="text1"/>
           <w:szCs w:val="21"/>
         </w:rPr>
-        <w:t>第88行process关于</w:t>
+      </w:pPr>
+      <w:r>
+        <w:rPr>
+          <w:rFonts w:asciiTheme="minorEastAsia" w:hAnsiTheme="minorEastAsia" w:cs="Times New Roman" w:hint="eastAsia"/>
+          <w:color w:val="000000" w:themeColor="text1"/>
+          <w:szCs w:val="21"/>
+        </w:rPr>
+        <w:t>对于cp m</w:t>
       </w:r>
       <w:r>
         <w:rPr>
@@ -3071,10 +3105,82 @@
           <w:color w:val="000000" w:themeColor="text1"/>
           <w:szCs w:val="21"/>
         </w:rPr>
-        <w:t>创建输出目录还需要在调整。</w:t>
+        <w:t xml:space="preserve">v </w:t>
+      </w:r>
+      <w:r>
+        <w:rPr>
+          <w:rFonts w:asciiTheme="minorEastAsia" w:hAnsiTheme="minorEastAsia" w:cs="Times New Roman" w:hint="eastAsia"/>
+          <w:color w:val="000000" w:themeColor="text1"/>
+          <w:szCs w:val="21"/>
+        </w:rPr>
+        <w:t>一类</w:t>
+      </w:r>
+      <w:r>
+        <w:rPr>
+          <w:rFonts w:asciiTheme="minorEastAsia" w:hAnsiTheme="minorEastAsia" w:cs="Times New Roman"/>
+          <w:color w:val="000000" w:themeColor="text1"/>
+          <w:szCs w:val="21"/>
+        </w:rPr>
+        <w:t>命令，输入输出都没有</w:t>
+      </w:r>
+      <w:r>
+        <w:rPr>
+          <w:rFonts w:asciiTheme="minorEastAsia" w:hAnsiTheme="minorEastAsia" w:cs="Times New Roman" w:hint="eastAsia"/>
+          <w:color w:val="000000" w:themeColor="text1"/>
+          <w:szCs w:val="21"/>
+        </w:rPr>
+        <w:t>option前缀</w:t>
+      </w:r>
+      <w:r>
+        <w:rPr>
+          <w:rFonts w:asciiTheme="minorEastAsia" w:hAnsiTheme="minorEastAsia" w:cs="Times New Roman"/>
+          <w:color w:val="000000" w:themeColor="text1"/>
+          <w:szCs w:val="21"/>
+        </w:rPr>
+        <w:t>，那么相应字段放空，获取之后按照输入在前，输出在后的顺序放置即可，如有参数放在中间。</w:t>
+      </w:r>
+      <w:r>
+        <w:rPr>
+          <w:rFonts w:asciiTheme="minorEastAsia" w:hAnsiTheme="minorEastAsia" w:cs="Times New Roman" w:hint="eastAsia"/>
+          <w:color w:val="000000" w:themeColor="text1"/>
+          <w:szCs w:val="21"/>
+        </w:rPr>
+        <w:t>（或者</w:t>
+      </w:r>
+      <w:r>
+        <w:rPr>
+          <w:rFonts w:asciiTheme="minorEastAsia" w:hAnsiTheme="minorEastAsia" w:cs="Times New Roman"/>
+          <w:color w:val="000000" w:themeColor="text1"/>
+          <w:szCs w:val="21"/>
+        </w:rPr>
+        <w:t>替换到$$$$</w:t>
+      </w:r>
+      <w:r>
+        <w:rPr>
+          <w:rFonts w:asciiTheme="minorEastAsia" w:hAnsiTheme="minorEastAsia" w:cs="Times New Roman" w:hint="eastAsia"/>
+          <w:color w:val="000000" w:themeColor="text1"/>
+          <w:szCs w:val="21"/>
+        </w:rPr>
+        <w:t>的</w:t>
+      </w:r>
+      <w:r>
+        <w:rPr>
+          <w:rFonts w:asciiTheme="minorEastAsia" w:hAnsiTheme="minorEastAsia" w:cs="Times New Roman"/>
+          <w:color w:val="000000" w:themeColor="text1"/>
+          <w:szCs w:val="21"/>
+        </w:rPr>
+        <w:t>位置</w:t>
       </w:r>
       <w:bookmarkStart w:id="0" w:name="_GoBack"/>
       <w:bookmarkEnd w:id="0"/>
+      <w:r>
+        <w:rPr>
+          <w:rFonts w:asciiTheme="minorEastAsia" w:hAnsiTheme="minorEastAsia" w:cs="Times New Roman"/>
+          <w:color w:val="000000" w:themeColor="text1"/>
+          <w:szCs w:val="21"/>
+        </w:rPr>
+        <w:t>）</w:t>
+      </w:r>
     </w:p>
     <w:sectPr>
       <w:pgSz w:w="11906" w:h="16838"/>

</xml_diff>

<commit_message>
all done for cp mv function ; but sh overwrited due to the same filename
</commit_message>
<xml_diff>
--- a/demo介绍.docx
+++ b/demo介绍.docx
@@ -3003,18 +3003,34 @@
     <w:p>
       <w:pPr>
         <w:rPr>
+          <w:rFonts w:asciiTheme="minorEastAsia" w:hAnsiTheme="minorEastAsia" w:cs="Times New Roman" w:hint="eastAsia"/>
+          <w:color w:val="000000" w:themeColor="text1"/>
+          <w:szCs w:val="21"/>
+        </w:rPr>
+      </w:pPr>
+      <w:r>
+        <w:rPr>
+          <w:rFonts w:asciiTheme="minorEastAsia" w:hAnsiTheme="minorEastAsia" w:cs="Times New Roman" w:hint="eastAsia"/>
+          <w:color w:val="000000" w:themeColor="text1"/>
+          <w:szCs w:val="21"/>
+        </w:rPr>
+        <w:t>目前增加</w:t>
+      </w:r>
+      <w:r>
+        <w:rPr>
           <w:rFonts w:asciiTheme="minorEastAsia" w:hAnsiTheme="minorEastAsia" w:cs="Times New Roman"/>
           <w:color w:val="000000" w:themeColor="text1"/>
           <w:szCs w:val="21"/>
         </w:rPr>
-      </w:pPr>
+        <w:t>了</w:t>
+      </w:r>
       <w:r>
         <w:rPr>
           <w:rFonts w:asciiTheme="minorEastAsia" w:hAnsiTheme="minorEastAsia" w:cs="Times New Roman" w:hint="eastAsia"/>
           <w:color w:val="000000" w:themeColor="text1"/>
           <w:szCs w:val="21"/>
         </w:rPr>
-        <w:t>目前增加</w:t>
+        <w:t>对一批</w:t>
       </w:r>
       <w:r>
         <w:rPr>
@@ -3022,7 +3038,15 @@
           <w:color w:val="000000" w:themeColor="text1"/>
           <w:szCs w:val="21"/>
         </w:rPr>
-        <w:t>了</w:t>
+        <w:t>目录的处理模块，</w:t>
+      </w:r>
+      <w:r>
+        <w:rPr>
+          <w:rFonts w:asciiTheme="minorEastAsia" w:hAnsiTheme="minorEastAsia" w:cs="Times New Roman"/>
+          <w:color w:val="000000" w:themeColor="text1"/>
+          <w:szCs w:val="21"/>
+        </w:rPr>
+        <w:t>完成</w:t>
       </w:r>
       <w:r>
         <w:rPr>
@@ -3030,7 +3054,7 @@
           <w:color w:val="000000" w:themeColor="text1"/>
           <w:szCs w:val="21"/>
         </w:rPr>
-        <w:t>对一批</w:t>
+        <w:t>，</w:t>
       </w:r>
       <w:r>
         <w:rPr>
@@ -3038,7 +3062,7 @@
           <w:color w:val="000000" w:themeColor="text1"/>
           <w:szCs w:val="21"/>
         </w:rPr>
-        <w:t>目录的处理模块，尚未完成</w:t>
+        <w:t>待检验</w:t>
       </w:r>
     </w:p>
     <w:p>
@@ -3049,13 +3073,30 @@
           <w:szCs w:val="21"/>
         </w:rPr>
       </w:pPr>
+    </w:p>
+    <w:p>
+      <w:pPr>
+        <w:rPr>
+          <w:rFonts w:asciiTheme="minorEastAsia" w:hAnsiTheme="minorEastAsia" w:cs="Times New Roman" w:hint="eastAsia"/>
+          <w:color w:val="000000" w:themeColor="text1"/>
+          <w:szCs w:val="21"/>
+        </w:rPr>
+      </w:pPr>
+      <w:r>
+        <w:rPr>
+          <w:rFonts w:asciiTheme="minorEastAsia" w:hAnsiTheme="minorEastAsia" w:cs="Times New Roman" w:hint="eastAsia"/>
+          <w:color w:val="000000" w:themeColor="text1"/>
+          <w:szCs w:val="21"/>
+        </w:rPr>
+        <w:t>对于cp m</w:t>
+      </w:r>
       <w:r>
         <w:rPr>
           <w:rFonts w:asciiTheme="minorEastAsia" w:hAnsiTheme="minorEastAsia" w:cs="Times New Roman"/>
           <w:color w:val="000000" w:themeColor="text1"/>
           <w:szCs w:val="21"/>
         </w:rPr>
-        <w:t>Service.py</w:t>
+        <w:t xml:space="preserve">v </w:t>
       </w:r>
       <w:r>
         <w:rPr>
@@ -3063,7 +3104,7 @@
           <w:color w:val="000000" w:themeColor="text1"/>
           <w:szCs w:val="21"/>
         </w:rPr>
-        <w:t>第88行process关于</w:t>
+        <w:t>一类</w:t>
       </w:r>
       <w:r>
         <w:rPr>
@@ -3071,105 +3112,23 @@
           <w:color w:val="000000" w:themeColor="text1"/>
           <w:szCs w:val="21"/>
         </w:rPr>
-        <w:t>创建输出目录还需要在调整。</w:t>
-      </w:r>
-    </w:p>
-    <w:p>
-      <w:pPr>
+        <w:t>命令，输入输出都没有</w:t>
+      </w:r>
+      <w:r>
+        <w:rPr>
+          <w:rFonts w:asciiTheme="minorEastAsia" w:hAnsiTheme="minorEastAsia" w:cs="Times New Roman" w:hint="eastAsia"/>
+          <w:color w:val="000000" w:themeColor="text1"/>
+          <w:szCs w:val="21"/>
+        </w:rPr>
+        <w:t>option前缀</w:t>
+      </w:r>
+      <w:r>
         <w:rPr>
           <w:rFonts w:asciiTheme="minorEastAsia" w:hAnsiTheme="minorEastAsia" w:cs="Times New Roman"/>
           <w:color w:val="000000" w:themeColor="text1"/>
           <w:szCs w:val="21"/>
         </w:rPr>
-      </w:pPr>
-    </w:p>
-    <w:p>
-      <w:pPr>
-        <w:rPr>
-          <w:rFonts w:asciiTheme="minorEastAsia" w:hAnsiTheme="minorEastAsia" w:cs="Times New Roman" w:hint="eastAsia"/>
-          <w:color w:val="000000" w:themeColor="text1"/>
-          <w:szCs w:val="21"/>
-        </w:rPr>
-      </w:pPr>
-      <w:r>
-        <w:rPr>
-          <w:rFonts w:asciiTheme="minorEastAsia" w:hAnsiTheme="minorEastAsia" w:cs="Times New Roman" w:hint="eastAsia"/>
-          <w:color w:val="000000" w:themeColor="text1"/>
-          <w:szCs w:val="21"/>
-        </w:rPr>
-        <w:t>对于cp m</w:t>
-      </w:r>
-      <w:r>
-        <w:rPr>
-          <w:rFonts w:asciiTheme="minorEastAsia" w:hAnsiTheme="minorEastAsia" w:cs="Times New Roman"/>
-          <w:color w:val="000000" w:themeColor="text1"/>
-          <w:szCs w:val="21"/>
-        </w:rPr>
-        <w:t xml:space="preserve">v </w:t>
-      </w:r>
-      <w:r>
-        <w:rPr>
-          <w:rFonts w:asciiTheme="minorEastAsia" w:hAnsiTheme="minorEastAsia" w:cs="Times New Roman" w:hint="eastAsia"/>
-          <w:color w:val="000000" w:themeColor="text1"/>
-          <w:szCs w:val="21"/>
-        </w:rPr>
-        <w:t>一类</w:t>
-      </w:r>
-      <w:r>
-        <w:rPr>
-          <w:rFonts w:asciiTheme="minorEastAsia" w:hAnsiTheme="minorEastAsia" w:cs="Times New Roman"/>
-          <w:color w:val="000000" w:themeColor="text1"/>
-          <w:szCs w:val="21"/>
-        </w:rPr>
-        <w:t>命令，输入输出都没有</w:t>
-      </w:r>
-      <w:r>
-        <w:rPr>
-          <w:rFonts w:asciiTheme="minorEastAsia" w:hAnsiTheme="minorEastAsia" w:cs="Times New Roman" w:hint="eastAsia"/>
-          <w:color w:val="000000" w:themeColor="text1"/>
-          <w:szCs w:val="21"/>
-        </w:rPr>
-        <w:t>option前缀</w:t>
-      </w:r>
-      <w:r>
-        <w:rPr>
-          <w:rFonts w:asciiTheme="minorEastAsia" w:hAnsiTheme="minorEastAsia" w:cs="Times New Roman"/>
-          <w:color w:val="000000" w:themeColor="text1"/>
-          <w:szCs w:val="21"/>
-        </w:rPr>
-        <w:t>，那么相应字段放空，获取之后按照输入在前，输出在后的顺序放置即可，如有参数放在中间。</w:t>
-      </w:r>
-      <w:r>
-        <w:rPr>
-          <w:rFonts w:asciiTheme="minorEastAsia" w:hAnsiTheme="minorEastAsia" w:cs="Times New Roman" w:hint="eastAsia"/>
-          <w:color w:val="000000" w:themeColor="text1"/>
-          <w:szCs w:val="21"/>
-        </w:rPr>
-        <w:t>（或者</w:t>
-      </w:r>
-      <w:r>
-        <w:rPr>
-          <w:rFonts w:asciiTheme="minorEastAsia" w:hAnsiTheme="minorEastAsia" w:cs="Times New Roman"/>
-          <w:color w:val="000000" w:themeColor="text1"/>
-          <w:szCs w:val="21"/>
-        </w:rPr>
-        <w:t>替换到$$$$</w:t>
-      </w:r>
-      <w:r>
-        <w:rPr>
-          <w:rFonts w:asciiTheme="minorEastAsia" w:hAnsiTheme="minorEastAsia" w:cs="Times New Roman" w:hint="eastAsia"/>
-          <w:color w:val="000000" w:themeColor="text1"/>
-          <w:szCs w:val="21"/>
-        </w:rPr>
-        <w:t>的</w:t>
-      </w:r>
-      <w:r>
-        <w:rPr>
-          <w:rFonts w:asciiTheme="minorEastAsia" w:hAnsiTheme="minorEastAsia" w:cs="Times New Roman"/>
-          <w:color w:val="000000" w:themeColor="text1"/>
-          <w:szCs w:val="21"/>
-        </w:rPr>
-        <w:t>位置</w:t>
+        <w:t>，那么相应字段放空，获取之后按照输入在前，输出在后的顺序放置即可，如有</w:t>
       </w:r>
       <w:bookmarkStart w:id="0" w:name="_GoBack"/>
       <w:bookmarkEnd w:id="0"/>
@@ -3179,7 +3138,39 @@
           <w:color w:val="000000" w:themeColor="text1"/>
           <w:szCs w:val="21"/>
         </w:rPr>
-        <w:t>）</w:t>
+        <w:t>参数放在中间。</w:t>
+      </w:r>
+      <w:r>
+        <w:rPr>
+          <w:rFonts w:asciiTheme="minorEastAsia" w:hAnsiTheme="minorEastAsia" w:cs="Times New Roman" w:hint="eastAsia"/>
+          <w:color w:val="000000" w:themeColor="text1"/>
+          <w:szCs w:val="21"/>
+        </w:rPr>
+        <w:t>（或者</w:t>
+      </w:r>
+      <w:r>
+        <w:rPr>
+          <w:rFonts w:asciiTheme="minorEastAsia" w:hAnsiTheme="minorEastAsia" w:cs="Times New Roman"/>
+          <w:color w:val="000000" w:themeColor="text1"/>
+          <w:szCs w:val="21"/>
+        </w:rPr>
+        <w:t>替换到$$$$</w:t>
+      </w:r>
+      <w:r>
+        <w:rPr>
+          <w:rFonts w:asciiTheme="minorEastAsia" w:hAnsiTheme="minorEastAsia" w:cs="Times New Roman" w:hint="eastAsia"/>
+          <w:color w:val="000000" w:themeColor="text1"/>
+          <w:szCs w:val="21"/>
+        </w:rPr>
+        <w:t>的</w:t>
+      </w:r>
+      <w:r>
+        <w:rPr>
+          <w:rFonts w:asciiTheme="minorEastAsia" w:hAnsiTheme="minorEastAsia" w:cs="Times New Roman"/>
+          <w:color w:val="000000" w:themeColor="text1"/>
+          <w:szCs w:val="21"/>
+        </w:rPr>
+        <w:t>位置）</w:t>
       </w:r>
     </w:p>
     <w:sectPr>

</xml_diff>

<commit_message>
all work well; tag function work again
</commit_message>
<xml_diff>
--- a/demo介绍.docx
+++ b/demo介绍.docx
@@ -3003,6 +3003,591 @@
     <w:p>
       <w:pPr>
         <w:rPr>
+          <w:rFonts w:ascii="宋体" w:eastAsia="宋体" w:hAnsi="宋体" w:cs="Times New Roman"/>
+          <w:color w:val="000000" w:themeColor="text1"/>
+          <w:szCs w:val="21"/>
+        </w:rPr>
+      </w:pPr>
+      <w:r>
+        <w:rPr>
+          <w:rFonts w:ascii="宋体" w:eastAsia="宋体" w:hAnsi="宋体" w:cs="Times New Roman" w:hint="eastAsia"/>
+          <w:color w:val="000000" w:themeColor="text1"/>
+          <w:szCs w:val="21"/>
+        </w:rPr>
+        <w:t>目前增加</w:t>
+      </w:r>
+      <w:r>
+        <w:rPr>
+          <w:rFonts w:ascii="宋体" w:eastAsia="宋体" w:hAnsi="宋体" w:cs="Times New Roman"/>
+          <w:color w:val="000000" w:themeColor="text1"/>
+          <w:szCs w:val="21"/>
+        </w:rPr>
+        <w:t>了</w:t>
+      </w:r>
+      <w:r>
+        <w:rPr>
+          <w:rFonts w:ascii="宋体" w:eastAsia="宋体" w:hAnsi="宋体" w:cs="Times New Roman" w:hint="eastAsia"/>
+          <w:color w:val="000000" w:themeColor="text1"/>
+          <w:szCs w:val="21"/>
+        </w:rPr>
+        <w:t>对一批</w:t>
+      </w:r>
+      <w:r>
+        <w:rPr>
+          <w:rFonts w:ascii="宋体" w:eastAsia="宋体" w:hAnsi="宋体" w:cs="Times New Roman"/>
+          <w:color w:val="000000" w:themeColor="text1"/>
+          <w:szCs w:val="21"/>
+        </w:rPr>
+        <w:t>目录的处理模块，</w:t>
+      </w:r>
+      <w:r>
+        <w:rPr>
+          <w:rFonts w:ascii="宋体" w:eastAsia="宋体" w:hAnsi="宋体" w:cs="Times New Roman" w:hint="eastAsia"/>
+          <w:color w:val="000000" w:themeColor="text1"/>
+          <w:szCs w:val="21"/>
+        </w:rPr>
+        <w:t>此种</w:t>
+      </w:r>
+      <w:r>
+        <w:rPr>
+          <w:rFonts w:ascii="宋体" w:eastAsia="宋体" w:hAnsi="宋体" w:cs="Times New Roman"/>
+          <w:color w:val="000000" w:themeColor="text1"/>
+          <w:szCs w:val="21"/>
+        </w:rPr>
+        <w:t xml:space="preserve">操作全部输出到同一个输出路径下面。 </w:t>
+      </w:r>
+      <w:r>
+        <w:rPr>
+          <w:rFonts w:ascii="宋体" w:eastAsia="宋体" w:hAnsi="宋体" w:cs="Times New Roman" w:hint="eastAsia"/>
+          <w:color w:val="000000" w:themeColor="text1"/>
+          <w:szCs w:val="21"/>
+        </w:rPr>
+        <w:t>之后再用</w:t>
+      </w:r>
+      <w:r>
+        <w:rPr>
+          <w:rFonts w:ascii="宋体" w:eastAsia="宋体" w:hAnsi="宋体" w:cs="Times New Roman" w:hint="eastAsia"/>
+          <w:color w:val="000000" w:themeColor="text1"/>
+          <w:szCs w:val="21"/>
+        </w:rPr>
+        <w:t>datapreprocess封装</w:t>
+      </w:r>
+      <w:r>
+        <w:rPr>
+          <w:rFonts w:ascii="宋体" w:eastAsia="宋体" w:hAnsi="宋体" w:cs="Times New Roman"/>
+          <w:color w:val="000000" w:themeColor="text1"/>
+          <w:szCs w:val="21"/>
+        </w:rPr>
+        <w:t>起来就好。</w:t>
+      </w:r>
+    </w:p>
+    <w:p>
+      <w:pPr>
+        <w:rPr>
+          <w:rFonts w:ascii="宋体" w:eastAsia="宋体" w:hAnsi="宋体" w:cs="Times New Roman"/>
+          <w:color w:val="000000" w:themeColor="text1"/>
+          <w:szCs w:val="21"/>
+        </w:rPr>
+      </w:pPr>
+      <w:r>
+        <w:rPr>
+          <w:rFonts w:ascii="宋体" w:eastAsia="宋体" w:hAnsi="宋体" w:cs="Times New Roman" w:hint="eastAsia"/>
+          <w:color w:val="000000" w:themeColor="text1"/>
+          <w:szCs w:val="21"/>
+        </w:rPr>
+        <w:t>对于cp m</w:t>
+      </w:r>
+      <w:r>
+        <w:rPr>
+          <w:rFonts w:ascii="宋体" w:eastAsia="宋体" w:hAnsi="宋体" w:cs="Times New Roman"/>
+          <w:color w:val="000000" w:themeColor="text1"/>
+          <w:szCs w:val="21"/>
+        </w:rPr>
+        <w:t xml:space="preserve">v </w:t>
+      </w:r>
+      <w:r>
+        <w:rPr>
+          <w:rFonts w:ascii="宋体" w:eastAsia="宋体" w:hAnsi="宋体" w:cs="Times New Roman" w:hint="eastAsia"/>
+          <w:color w:val="000000" w:themeColor="text1"/>
+          <w:szCs w:val="21"/>
+        </w:rPr>
+        <w:t>一类</w:t>
+      </w:r>
+      <w:r>
+        <w:rPr>
+          <w:rFonts w:ascii="宋体" w:eastAsia="宋体" w:hAnsi="宋体" w:cs="Times New Roman"/>
+          <w:color w:val="000000" w:themeColor="text1"/>
+          <w:szCs w:val="21"/>
+        </w:rPr>
+        <w:t>命令，输入输出都没有</w:t>
+      </w:r>
+      <w:r>
+        <w:rPr>
+          <w:rFonts w:ascii="宋体" w:eastAsia="宋体" w:hAnsi="宋体" w:cs="Times New Roman" w:hint="eastAsia"/>
+          <w:color w:val="000000" w:themeColor="text1"/>
+          <w:szCs w:val="21"/>
+        </w:rPr>
+        <w:t>option前缀</w:t>
+      </w:r>
+      <w:r>
+        <w:rPr>
+          <w:rFonts w:ascii="宋体" w:eastAsia="宋体" w:hAnsi="宋体" w:cs="Times New Roman"/>
+          <w:color w:val="000000" w:themeColor="text1"/>
+          <w:szCs w:val="21"/>
+        </w:rPr>
+        <w:t>，那么相应字段放空，获取之后按照输入在前，输出在后的顺序放置</w:t>
+      </w:r>
+      <w:r>
+        <w:rPr>
+          <w:rFonts w:ascii="宋体" w:eastAsia="宋体" w:hAnsi="宋体" w:cs="Times New Roman" w:hint="eastAsia"/>
+          <w:color w:val="000000" w:themeColor="text1"/>
+          <w:szCs w:val="21"/>
+        </w:rPr>
+        <w:t>（或者</w:t>
+      </w:r>
+      <w:r>
+        <w:rPr>
+          <w:rFonts w:ascii="宋体" w:eastAsia="宋体" w:hAnsi="宋体" w:cs="Times New Roman"/>
+          <w:color w:val="000000" w:themeColor="text1"/>
+          <w:szCs w:val="21"/>
+        </w:rPr>
+        <w:t>替换到$$$$</w:t>
+      </w:r>
+      <w:r>
+        <w:rPr>
+          <w:rFonts w:ascii="宋体" w:eastAsia="宋体" w:hAnsi="宋体" w:cs="Times New Roman" w:hint="eastAsia"/>
+          <w:color w:val="000000" w:themeColor="text1"/>
+          <w:szCs w:val="21"/>
+        </w:rPr>
+        <w:t>的</w:t>
+      </w:r>
+      <w:r>
+        <w:rPr>
+          <w:rFonts w:ascii="宋体" w:eastAsia="宋体" w:hAnsi="宋体" w:cs="Times New Roman"/>
+          <w:color w:val="000000" w:themeColor="text1"/>
+          <w:szCs w:val="21"/>
+        </w:rPr>
+        <w:t>位置）</w:t>
+      </w:r>
+      <w:r>
+        <w:rPr>
+          <w:rFonts w:ascii="宋体" w:eastAsia="宋体" w:hAnsi="宋体" w:cs="Times New Roman" w:hint="eastAsia"/>
+          <w:color w:val="000000" w:themeColor="text1"/>
+          <w:szCs w:val="21"/>
+        </w:rPr>
+        <w:t>。</w:t>
+      </w:r>
+      <w:r>
+        <w:rPr>
+          <w:rFonts w:ascii="宋体" w:eastAsia="宋体" w:hAnsi="宋体" w:cs="Times New Roman"/>
+          <w:color w:val="000000" w:themeColor="text1"/>
+          <w:szCs w:val="21"/>
+        </w:rPr>
+        <w:t>如果是</w:t>
+      </w:r>
+      <w:r>
+        <w:rPr>
+          <w:rFonts w:ascii="宋体" w:eastAsia="宋体" w:hAnsi="宋体" w:cs="Times New Roman" w:hint="eastAsia"/>
+          <w:color w:val="000000" w:themeColor="text1"/>
+          <w:szCs w:val="21"/>
+        </w:rPr>
+        <w:t>rm命令</w:t>
+      </w:r>
+      <w:r>
+        <w:rPr>
+          <w:rFonts w:ascii="宋体" w:eastAsia="宋体" w:hAnsi="宋体" w:cs="Times New Roman"/>
+          <w:color w:val="000000" w:themeColor="text1"/>
+          <w:szCs w:val="21"/>
+        </w:rPr>
+        <w:t>则并不会执行，只会生成相应的命令脚本，可以手动执行，</w:t>
+      </w:r>
+      <w:r>
+        <w:rPr>
+          <w:rFonts w:ascii="宋体" w:eastAsia="宋体" w:hAnsi="宋体" w:cs="Times New Roman" w:hint="eastAsia"/>
+          <w:color w:val="000000" w:themeColor="text1"/>
+          <w:szCs w:val="21"/>
+        </w:rPr>
+        <w:t>以免</w:t>
+      </w:r>
+      <w:r>
+        <w:rPr>
+          <w:rFonts w:ascii="宋体" w:eastAsia="宋体" w:hAnsi="宋体" w:cs="Times New Roman"/>
+          <w:color w:val="000000" w:themeColor="text1"/>
+          <w:szCs w:val="21"/>
+        </w:rPr>
+        <w:t>误删。</w:t>
+      </w:r>
+    </w:p>
+    <w:p>
+      <w:pPr>
+        <w:rPr>
+          <w:rFonts w:ascii="宋体" w:eastAsia="宋体" w:hAnsi="宋体" w:cs="Times New Roman"/>
+          <w:color w:val="000000" w:themeColor="text1"/>
+          <w:szCs w:val="21"/>
+        </w:rPr>
+      </w:pPr>
+      <w:r>
+        <w:rPr>
+          <w:rFonts w:ascii="宋体" w:eastAsia="宋体" w:hAnsi="宋体" w:cs="Times New Roman" w:hint="eastAsia"/>
+          <w:color w:val="000000" w:themeColor="text1"/>
+          <w:szCs w:val="21"/>
+        </w:rPr>
+        <w:t>像rm这种</w:t>
+      </w:r>
+      <w:r>
+        <w:rPr>
+          <w:rFonts w:ascii="宋体" w:eastAsia="宋体" w:hAnsi="宋体" w:cs="Times New Roman"/>
+          <w:color w:val="000000" w:themeColor="text1"/>
+          <w:szCs w:val="21"/>
+        </w:rPr>
+        <w:t>没有输出的</w:t>
+      </w:r>
+      <w:r>
+        <w:rPr>
+          <w:rFonts w:ascii="宋体" w:eastAsia="宋体" w:hAnsi="宋体" w:cs="Times New Roman" w:hint="eastAsia"/>
+          <w:color w:val="000000" w:themeColor="text1"/>
+          <w:szCs w:val="21"/>
+        </w:rPr>
+        <w:t xml:space="preserve"> 相应</w:t>
+      </w:r>
+      <w:r>
+        <w:rPr>
+          <w:rFonts w:ascii="宋体" w:eastAsia="宋体" w:hAnsi="宋体" w:cs="Times New Roman"/>
+          <w:color w:val="000000" w:themeColor="text1"/>
+          <w:szCs w:val="21"/>
+        </w:rPr>
+        <w:t>控制输出部分全部为空。</w:t>
+      </w:r>
+    </w:p>
+    <w:p>
+      <w:pPr>
+        <w:rPr>
+          <w:rFonts w:ascii="宋体" w:eastAsia="宋体" w:hAnsi="宋体" w:cs="Times New Roman"/>
+          <w:color w:val="000000" w:themeColor="text1"/>
+          <w:szCs w:val="21"/>
+        </w:rPr>
+      </w:pPr>
+      <w:r>
+        <w:rPr>
+          <w:rFonts w:ascii="宋体" w:eastAsia="宋体" w:hAnsi="宋体" w:cs="Times New Roman" w:hint="eastAsia"/>
+          <w:color w:val="000000" w:themeColor="text1"/>
+          <w:szCs w:val="21"/>
+        </w:rPr>
+        <w:t>像cp这种，</w:t>
+      </w:r>
+      <w:r>
+        <w:rPr>
+          <w:rFonts w:ascii="宋体" w:eastAsia="宋体" w:hAnsi="宋体" w:cs="Times New Roman"/>
+          <w:color w:val="000000" w:themeColor="text1"/>
+          <w:szCs w:val="21"/>
+        </w:rPr>
+        <w:t>输出选项</w:t>
+      </w:r>
+      <w:r>
+        <w:rPr>
+          <w:rFonts w:ascii="宋体" w:eastAsia="宋体" w:hAnsi="宋体" w:cs="Times New Roman" w:hint="eastAsia"/>
+          <w:color w:val="000000" w:themeColor="text1"/>
+          <w:szCs w:val="21"/>
+        </w:rPr>
+        <w:t>及</w:t>
+      </w:r>
+      <w:r>
+        <w:rPr>
+          <w:rFonts w:ascii="宋体" w:eastAsia="宋体" w:hAnsi="宋体" w:cs="Times New Roman"/>
+          <w:color w:val="000000" w:themeColor="text1"/>
+          <w:szCs w:val="21"/>
+        </w:rPr>
+        <w:t>后缀不用填写。</w:t>
+      </w:r>
+      <w:r>
+        <w:rPr>
+          <w:rFonts w:ascii="宋体" w:eastAsia="宋体" w:hAnsi="宋体" w:cs="Times New Roman" w:hint="eastAsia"/>
+          <w:color w:val="000000" w:themeColor="text1"/>
+          <w:szCs w:val="21"/>
+        </w:rPr>
+        <w:t>使用 一批</w:t>
+      </w:r>
+      <w:r>
+        <w:rPr>
+          <w:rFonts w:ascii="宋体" w:eastAsia="宋体" w:hAnsi="宋体" w:cs="Times New Roman"/>
+          <w:color w:val="000000" w:themeColor="text1"/>
+          <w:szCs w:val="21"/>
+        </w:rPr>
+        <w:t>待处理数据路径时</w:t>
+      </w:r>
+      <w:r>
+        <w:rPr>
+          <w:rFonts w:ascii="宋体" w:eastAsia="宋体" w:hAnsi="宋体" w:cs="Times New Roman" w:hint="eastAsia"/>
+          <w:color w:val="000000" w:themeColor="text1"/>
+          <w:szCs w:val="21"/>
+        </w:rPr>
+        <w:t>，</w:t>
+      </w:r>
+      <w:r>
+        <w:rPr>
+          <w:rFonts w:ascii="宋体" w:eastAsia="宋体" w:hAnsi="宋体" w:cs="Times New Roman"/>
+          <w:color w:val="000000" w:themeColor="text1"/>
+          <w:szCs w:val="21"/>
+        </w:rPr>
+        <w:t>需将</w:t>
+      </w:r>
+      <w:r>
+        <w:rPr>
+          <w:rFonts w:ascii="宋体" w:eastAsia="宋体" w:hAnsi="宋体" w:cs="Times New Roman" w:hint="eastAsia"/>
+          <w:color w:val="000000" w:themeColor="text1"/>
+          <w:szCs w:val="21"/>
+        </w:rPr>
+        <w:t>输入</w:t>
+      </w:r>
+      <w:r>
+        <w:rPr>
+          <w:rFonts w:ascii="宋体" w:eastAsia="宋体" w:hAnsi="宋体" w:cs="Times New Roman"/>
+          <w:color w:val="000000" w:themeColor="text1"/>
+          <w:szCs w:val="21"/>
+        </w:rPr>
+        <w:t>项目路径</w:t>
+      </w:r>
+      <w:r>
+        <w:rPr>
+          <w:rFonts w:ascii="宋体" w:eastAsia="宋体" w:hAnsi="宋体" w:cs="Times New Roman" w:hint="eastAsia"/>
+          <w:color w:val="000000" w:themeColor="text1"/>
+          <w:szCs w:val="21"/>
+        </w:rPr>
+        <w:t xml:space="preserve"> 置</w:t>
+      </w:r>
+      <w:r>
+        <w:rPr>
+          <w:rFonts w:ascii="宋体" w:eastAsia="宋体" w:hAnsi="宋体" w:cs="Times New Roman"/>
+          <w:color w:val="000000" w:themeColor="text1"/>
+          <w:szCs w:val="21"/>
+        </w:rPr>
+        <w:t>空</w:t>
+      </w:r>
+      <w:r>
+        <w:rPr>
+          <w:rFonts w:ascii="宋体" w:eastAsia="宋体" w:hAnsi="宋体" w:cs="Times New Roman" w:hint="eastAsia"/>
+          <w:color w:val="000000" w:themeColor="text1"/>
+          <w:szCs w:val="21"/>
+        </w:rPr>
+        <w:t>，</w:t>
+      </w:r>
+      <w:r>
+        <w:rPr>
+          <w:rFonts w:ascii="宋体" w:eastAsia="宋体" w:hAnsi="宋体" w:cs="Times New Roman"/>
+          <w:color w:val="000000" w:themeColor="text1"/>
+          <w:szCs w:val="21"/>
+        </w:rPr>
+        <w:t>辞世数据收集层所在层均不起作用</w:t>
+      </w:r>
+      <w:r>
+        <w:rPr>
+          <w:rFonts w:ascii="宋体" w:eastAsia="宋体" w:hAnsi="宋体" w:cs="Times New Roman"/>
+          <w:color w:val="000000" w:themeColor="text1"/>
+          <w:szCs w:val="21"/>
+        </w:rPr>
+        <w:t>。</w:t>
+      </w:r>
+      <w:r>
+        <w:rPr>
+          <w:rFonts w:ascii="宋体" w:eastAsia="宋体" w:hAnsi="宋体" w:cs="Times New Roman" w:hint="eastAsia"/>
+          <w:color w:val="000000" w:themeColor="text1"/>
+          <w:szCs w:val="21"/>
+        </w:rPr>
+        <w:t>否则这里的</w:t>
+      </w:r>
+      <w:r>
+        <w:rPr>
+          <w:rFonts w:ascii="宋体" w:eastAsia="宋体" w:hAnsi="宋体" w:cs="Times New Roman" w:hint="eastAsia"/>
+          <w:color w:val="000000" w:themeColor="text1"/>
+          <w:szCs w:val="21"/>
+        </w:rPr>
+        <w:t>路径</w:t>
+      </w:r>
+      <w:r>
+        <w:rPr>
+          <w:rFonts w:ascii="宋体" w:eastAsia="宋体" w:hAnsi="宋体" w:cs="Times New Roman"/>
+          <w:color w:val="000000" w:themeColor="text1"/>
+          <w:szCs w:val="21"/>
+        </w:rPr>
+        <w:t>不起作用。</w:t>
+      </w:r>
+    </w:p>
+    <w:p>
+      <w:pPr>
+        <w:rPr>
+          <w:rFonts w:ascii="宋体" w:eastAsia="宋体" w:hAnsi="宋体" w:cs="Times New Roman"/>
+          <w:color w:val="000000" w:themeColor="text1"/>
+          <w:szCs w:val="21"/>
+        </w:rPr>
+      </w:pPr>
+      <w:r>
+        <w:rPr>
+          <w:noProof/>
+        </w:rPr>
+        <w:drawing>
+          <wp:inline distT="0" distB="0" distL="0" distR="0" wp14:anchorId="4E687943" wp14:editId="4E706315">
+            <wp:extent cx="5274310" cy="4142740"/>
+            <wp:effectExtent l="0" t="0" r="2540" b="0"/>
+            <wp:docPr id="4" name="图片 4"/>
+            <wp:cNvGraphicFramePr>
+              <a:graphicFrameLocks xmlns:a="http://schemas.openxmlformats.org/drawingml/2006/main" noChangeAspect="1"/>
+            </wp:cNvGraphicFramePr>
+            <a:graphic xmlns:a="http://schemas.openxmlformats.org/drawingml/2006/main">
+              <a:graphicData uri="http://schemas.openxmlformats.org/drawingml/2006/picture">
+                <pic:pic xmlns:pic="http://schemas.openxmlformats.org/drawingml/2006/picture">
+                  <pic:nvPicPr>
+                    <pic:cNvPr id="1" name=""/>
+                    <pic:cNvPicPr/>
+                  </pic:nvPicPr>
+                  <pic:blipFill>
+                    <a:blip r:embed="rId25"/>
+                    <a:stretch>
+                      <a:fillRect/>
+                    </a:stretch>
+                  </pic:blipFill>
+                  <pic:spPr>
+                    <a:xfrm>
+                      <a:off x="0" y="0"/>
+                      <a:ext cx="5274310" cy="4142740"/>
+                    </a:xfrm>
+                    <a:prstGeom prst="rect">
+                      <a:avLst/>
+                    </a:prstGeom>
+                  </pic:spPr>
+                </pic:pic>
+              </a:graphicData>
+            </a:graphic>
+          </wp:inline>
+        </w:drawing>
+      </w:r>
+    </w:p>
+    <w:p>
+      <w:pPr>
+        <w:rPr>
+          <w:rFonts w:ascii="宋体" w:eastAsia="宋体" w:hAnsi="宋体" w:cs="Times New Roman"/>
+          <w:color w:val="000000" w:themeColor="text1"/>
+          <w:szCs w:val="21"/>
+        </w:rPr>
+      </w:pPr>
+      <w:r>
+        <w:rPr>
+          <w:rFonts w:ascii="宋体" w:eastAsia="宋体" w:hAnsi="宋体" w:cs="Times New Roman" w:hint="eastAsia"/>
+          <w:color w:val="000000" w:themeColor="text1"/>
+          <w:szCs w:val="21"/>
+        </w:rPr>
+        <w:t>用gtz生成fq.gz文件</w:t>
+      </w:r>
+    </w:p>
+    <w:p>
+      <w:pPr>
+        <w:rPr>
+          <w:rFonts w:ascii="宋体" w:eastAsia="宋体" w:hAnsi="宋体" w:cs="Times New Roman"/>
+          <w:color w:val="000000" w:themeColor="text1"/>
+          <w:szCs w:val="21"/>
+        </w:rPr>
+      </w:pPr>
+      <w:r>
+        <w:rPr>
+          <w:noProof/>
+        </w:rPr>
+        <w:lastRenderedPageBreak/>
+        <w:drawing>
+          <wp:inline distT="0" distB="0" distL="0" distR="0" wp14:anchorId="016AC91B" wp14:editId="79BD403D">
+            <wp:extent cx="5274310" cy="4836160"/>
+            <wp:effectExtent l="0" t="0" r="2540" b="2540"/>
+            <wp:docPr id="5" name="图片 5"/>
+            <wp:cNvGraphicFramePr>
+              <a:graphicFrameLocks xmlns:a="http://schemas.openxmlformats.org/drawingml/2006/main" noChangeAspect="1"/>
+            </wp:cNvGraphicFramePr>
+            <a:graphic xmlns:a="http://schemas.openxmlformats.org/drawingml/2006/main">
+              <a:graphicData uri="http://schemas.openxmlformats.org/drawingml/2006/picture">
+                <pic:pic xmlns:pic="http://schemas.openxmlformats.org/drawingml/2006/picture">
+                  <pic:nvPicPr>
+                    <pic:cNvPr id="1" name=""/>
+                    <pic:cNvPicPr/>
+                  </pic:nvPicPr>
+                  <pic:blipFill>
+                    <a:blip r:embed="rId26"/>
+                    <a:stretch>
+                      <a:fillRect/>
+                    </a:stretch>
+                  </pic:blipFill>
+                  <pic:spPr>
+                    <a:xfrm>
+                      <a:off x="0" y="0"/>
+                      <a:ext cx="5274310" cy="4836160"/>
+                    </a:xfrm>
+                    <a:prstGeom prst="rect">
+                      <a:avLst/>
+                    </a:prstGeom>
+                  </pic:spPr>
+                </pic:pic>
+              </a:graphicData>
+            </a:graphic>
+          </wp:inline>
+        </w:drawing>
+      </w:r>
+    </w:p>
+    <w:p>
+      <w:pPr>
+        <w:rPr>
+          <w:rFonts w:ascii="宋体" w:eastAsia="宋体" w:hAnsi="宋体" w:cs="Times New Roman"/>
+          <w:color w:val="000000" w:themeColor="text1"/>
+          <w:szCs w:val="21"/>
+        </w:rPr>
+      </w:pPr>
+      <w:r>
+        <w:rPr>
+          <w:rFonts w:ascii="宋体" w:eastAsia="宋体" w:hAnsi="宋体" w:cs="Times New Roman" w:hint="eastAsia"/>
+          <w:color w:val="000000" w:themeColor="text1"/>
+          <w:szCs w:val="21"/>
+        </w:rPr>
+        <w:t>像depthDistance.py这种</w:t>
+      </w:r>
+      <w:r>
+        <w:rPr>
+          <w:rFonts w:ascii="宋体" w:eastAsia="宋体" w:hAnsi="宋体" w:cs="Times New Roman"/>
+          <w:color w:val="000000" w:themeColor="text1"/>
+          <w:szCs w:val="21"/>
+        </w:rPr>
+        <w:t>程序，输入</w:t>
+      </w:r>
+      <w:r>
+        <w:rPr>
+          <w:rFonts w:ascii="宋体" w:eastAsia="宋体" w:hAnsi="宋体" w:cs="Times New Roman" w:hint="eastAsia"/>
+          <w:color w:val="000000" w:themeColor="text1"/>
+          <w:szCs w:val="21"/>
+        </w:rPr>
+        <w:t>是路径</w:t>
+      </w:r>
+      <w:r>
+        <w:rPr>
+          <w:rFonts w:ascii="宋体" w:eastAsia="宋体" w:hAnsi="宋体" w:cs="Times New Roman"/>
+          <w:color w:val="000000" w:themeColor="text1"/>
+          <w:szCs w:val="21"/>
+        </w:rPr>
+        <w:t>那么</w:t>
+      </w:r>
+      <w:r>
+        <w:rPr>
+          <w:rFonts w:ascii="宋体" w:eastAsia="宋体" w:hAnsi="宋体" w:cs="Times New Roman" w:hint="eastAsia"/>
+          <w:color w:val="000000" w:themeColor="text1"/>
+          <w:szCs w:val="21"/>
+        </w:rPr>
+        <w:t>相应位置 /即可</w:t>
+      </w:r>
+      <w:r>
+        <w:rPr>
+          <w:rFonts w:ascii="宋体" w:eastAsia="宋体" w:hAnsi="宋体" w:cs="Times New Roman"/>
+          <w:color w:val="000000" w:themeColor="text1"/>
+          <w:szCs w:val="21"/>
+        </w:rPr>
+        <w:t>，也就是说相应位置的路径都将作为输入。</w:t>
+      </w:r>
+    </w:p>
+    <w:p>
+      <w:pPr>
+        <w:rPr>
           <w:rFonts w:asciiTheme="minorEastAsia" w:hAnsiTheme="minorEastAsia" w:cs="Times New Roman" w:hint="eastAsia"/>
           <w:color w:val="000000" w:themeColor="text1"/>
           <w:szCs w:val="21"/>
@@ -3014,7 +3599,7 @@
           <w:color w:val="000000" w:themeColor="text1"/>
           <w:szCs w:val="21"/>
         </w:rPr>
-        <w:t>目前增加</w:t>
+        <w:t>目前demo的</w:t>
       </w:r>
       <w:r>
         <w:rPr>
@@ -3022,7 +3607,7 @@
           <w:color w:val="000000" w:themeColor="text1"/>
           <w:szCs w:val="21"/>
         </w:rPr>
-        <w:t>了</w:t>
+        <w:t>新问题是</w:t>
       </w:r>
       <w:r>
         <w:rPr>
@@ -3030,7 +3615,7 @@
           <w:color w:val="000000" w:themeColor="text1"/>
           <w:szCs w:val="21"/>
         </w:rPr>
-        <w:t>对一批</w:t>
+        <w:t xml:space="preserve">SM </w:t>
       </w:r>
       <w:r>
         <w:rPr>
@@ -3038,7 +3623,15 @@
           <w:color w:val="000000" w:themeColor="text1"/>
           <w:szCs w:val="21"/>
         </w:rPr>
-        <w:t>目录的处理模块，</w:t>
+        <w:t>tag</w:t>
+      </w:r>
+      <w:r>
+        <w:rPr>
+          <w:rFonts w:asciiTheme="minorEastAsia" w:hAnsiTheme="minorEastAsia" w:cs="Times New Roman" w:hint="eastAsia"/>
+          <w:color w:val="000000" w:themeColor="text1"/>
+          <w:szCs w:val="21"/>
+        </w:rPr>
+        <w:t>竟然</w:t>
       </w:r>
       <w:r>
         <w:rPr>
@@ -3046,132 +3639,10 @@
           <w:color w:val="000000" w:themeColor="text1"/>
           <w:szCs w:val="21"/>
         </w:rPr>
-        <w:t>完成</w:t>
-      </w:r>
-      <w:r>
-        <w:rPr>
-          <w:rFonts w:asciiTheme="minorEastAsia" w:hAnsiTheme="minorEastAsia" w:cs="Times New Roman" w:hint="eastAsia"/>
-          <w:color w:val="000000" w:themeColor="text1"/>
-          <w:szCs w:val="21"/>
-        </w:rPr>
-        <w:t>，</w:t>
-      </w:r>
-      <w:r>
-        <w:rPr>
-          <w:rFonts w:asciiTheme="minorEastAsia" w:hAnsiTheme="minorEastAsia" w:cs="Times New Roman"/>
-          <w:color w:val="000000" w:themeColor="text1"/>
-          <w:szCs w:val="21"/>
-        </w:rPr>
-        <w:t>待检验</w:t>
-      </w:r>
-    </w:p>
-    <w:p>
-      <w:pPr>
-        <w:rPr>
-          <w:rFonts w:asciiTheme="minorEastAsia" w:hAnsiTheme="minorEastAsia" w:cs="Times New Roman"/>
-          <w:color w:val="000000" w:themeColor="text1"/>
-          <w:szCs w:val="21"/>
-        </w:rPr>
-      </w:pPr>
-    </w:p>
-    <w:p>
-      <w:pPr>
-        <w:rPr>
-          <w:rFonts w:asciiTheme="minorEastAsia" w:hAnsiTheme="minorEastAsia" w:cs="Times New Roman" w:hint="eastAsia"/>
-          <w:color w:val="000000" w:themeColor="text1"/>
-          <w:szCs w:val="21"/>
-        </w:rPr>
-      </w:pPr>
-      <w:r>
-        <w:rPr>
-          <w:rFonts w:asciiTheme="minorEastAsia" w:hAnsiTheme="minorEastAsia" w:cs="Times New Roman" w:hint="eastAsia"/>
-          <w:color w:val="000000" w:themeColor="text1"/>
-          <w:szCs w:val="21"/>
-        </w:rPr>
-        <w:t>对于cp m</w:t>
-      </w:r>
-      <w:r>
-        <w:rPr>
-          <w:rFonts w:asciiTheme="minorEastAsia" w:hAnsiTheme="minorEastAsia" w:cs="Times New Roman"/>
-          <w:color w:val="000000" w:themeColor="text1"/>
-          <w:szCs w:val="21"/>
-        </w:rPr>
-        <w:t xml:space="preserve">v </w:t>
-      </w:r>
-      <w:r>
-        <w:rPr>
-          <w:rFonts w:asciiTheme="minorEastAsia" w:hAnsiTheme="minorEastAsia" w:cs="Times New Roman" w:hint="eastAsia"/>
-          <w:color w:val="000000" w:themeColor="text1"/>
-          <w:szCs w:val="21"/>
-        </w:rPr>
-        <w:t>一类</w:t>
-      </w:r>
-      <w:r>
-        <w:rPr>
-          <w:rFonts w:asciiTheme="minorEastAsia" w:hAnsiTheme="minorEastAsia" w:cs="Times New Roman"/>
-          <w:color w:val="000000" w:themeColor="text1"/>
-          <w:szCs w:val="21"/>
-        </w:rPr>
-        <w:t>命令，输入输出都没有</w:t>
-      </w:r>
-      <w:r>
-        <w:rPr>
-          <w:rFonts w:asciiTheme="minorEastAsia" w:hAnsiTheme="minorEastAsia" w:cs="Times New Roman" w:hint="eastAsia"/>
-          <w:color w:val="000000" w:themeColor="text1"/>
-          <w:szCs w:val="21"/>
-        </w:rPr>
-        <w:t>option前缀</w:t>
-      </w:r>
-      <w:r>
-        <w:rPr>
-          <w:rFonts w:asciiTheme="minorEastAsia" w:hAnsiTheme="minorEastAsia" w:cs="Times New Roman"/>
-          <w:color w:val="000000" w:themeColor="text1"/>
-          <w:szCs w:val="21"/>
-        </w:rPr>
-        <w:t>，那么相应字段放空，获取之后按照输入在前，输出在后的顺序放置即可，如有</w:t>
+        <w:t>没有加上。</w:t>
       </w:r>
       <w:bookmarkStart w:id="0" w:name="_GoBack"/>
       <w:bookmarkEnd w:id="0"/>
-      <w:r>
-        <w:rPr>
-          <w:rFonts w:asciiTheme="minorEastAsia" w:hAnsiTheme="minorEastAsia" w:cs="Times New Roman"/>
-          <w:color w:val="000000" w:themeColor="text1"/>
-          <w:szCs w:val="21"/>
-        </w:rPr>
-        <w:t>参数放在中间。</w:t>
-      </w:r>
-      <w:r>
-        <w:rPr>
-          <w:rFonts w:asciiTheme="minorEastAsia" w:hAnsiTheme="minorEastAsia" w:cs="Times New Roman" w:hint="eastAsia"/>
-          <w:color w:val="000000" w:themeColor="text1"/>
-          <w:szCs w:val="21"/>
-        </w:rPr>
-        <w:t>（或者</w:t>
-      </w:r>
-      <w:r>
-        <w:rPr>
-          <w:rFonts w:asciiTheme="minorEastAsia" w:hAnsiTheme="minorEastAsia" w:cs="Times New Roman"/>
-          <w:color w:val="000000" w:themeColor="text1"/>
-          <w:szCs w:val="21"/>
-        </w:rPr>
-        <w:t>替换到$$$$</w:t>
-      </w:r>
-      <w:r>
-        <w:rPr>
-          <w:rFonts w:asciiTheme="minorEastAsia" w:hAnsiTheme="minorEastAsia" w:cs="Times New Roman" w:hint="eastAsia"/>
-          <w:color w:val="000000" w:themeColor="text1"/>
-          <w:szCs w:val="21"/>
-        </w:rPr>
-        <w:t>的</w:t>
-      </w:r>
-      <w:r>
-        <w:rPr>
-          <w:rFonts w:asciiTheme="minorEastAsia" w:hAnsiTheme="minorEastAsia" w:cs="Times New Roman"/>
-          <w:color w:val="000000" w:themeColor="text1"/>
-          <w:szCs w:val="21"/>
-        </w:rPr>
-        <w:t>位置）</w:t>
-      </w:r>
     </w:p>
     <w:sectPr>
       <w:pgSz w:w="11906" w:h="16838"/>

</xml_diff>

<commit_message>
shit! I still fuck in the web function add my linuxcommand func done
</commit_message>
<xml_diff>
--- a/demo介绍.docx
+++ b/demo介绍.docx
@@ -1031,7 +1031,7 @@
               </wp:anchor>
             </w:drawing>
           </mc:Choice>
-          <mc:Fallback xmlns:w16se="http://schemas.microsoft.com/office/word/2015/wordml/symex" xmlns:w16cid="http://schemas.microsoft.com/office/word/2016/wordml/cid" xmlns:am3d="http://schemas.microsoft.com/office/drawing/2017/model3d" xmlns:aink="http://schemas.microsoft.com/office/drawing/2016/ink" xmlns:cx8="http://schemas.microsoft.com/office/drawing/2016/5/14/chartex" xmlns:cx7="http://schemas.microsoft.com/office/drawing/2016/5/13/chartex" xmlns:cx6="http://schemas.microsoft.com/office/drawing/2016/5/12/chartex" xmlns:cx5="http://schemas.microsoft.com/office/drawing/2016/5/11/chartex" xmlns:cx4="http://schemas.microsoft.com/office/drawing/2016/5/10/chartex" xmlns:cx3="http://schemas.microsoft.com/office/drawing/2016/5/9/chartex" xmlns:cx2="http://schemas.microsoft.com/office/drawing/2015/10/21/chartex" xmlns:cx1="http://schemas.microsoft.com/office/drawing/2015/9/8/chartex" xmlns:cx="http://schemas.microsoft.com/office/drawing/2014/chartex">
+          <mc:Fallback xmlns:cx="http://schemas.microsoft.com/office/drawing/2014/chartex" xmlns:cx1="http://schemas.microsoft.com/office/drawing/2015/9/8/chartex" xmlns:cx2="http://schemas.microsoft.com/office/drawing/2015/10/21/chartex" xmlns:cx3="http://schemas.microsoft.com/office/drawing/2016/5/9/chartex" xmlns:cx4="http://schemas.microsoft.com/office/drawing/2016/5/10/chartex" xmlns:cx5="http://schemas.microsoft.com/office/drawing/2016/5/11/chartex" xmlns:cx6="http://schemas.microsoft.com/office/drawing/2016/5/12/chartex" xmlns:cx7="http://schemas.microsoft.com/office/drawing/2016/5/13/chartex" xmlns:cx8="http://schemas.microsoft.com/office/drawing/2016/5/14/chartex" xmlns:aink="http://schemas.microsoft.com/office/drawing/2016/ink" xmlns:am3d="http://schemas.microsoft.com/office/drawing/2017/model3d" xmlns:w16cid="http://schemas.microsoft.com/office/word/2016/wordml/cid" xmlns:w16se="http://schemas.microsoft.com/office/word/2015/wordml/symex">
             <w:pict>
               <v:rect w14:anchorId="737015C9" id="矩形 42" o:spid="_x0000_s1026" style="position:absolute;left:0;text-align:left;margin-left:-10.5pt;margin-top:114.15pt;width:255.7pt;height:63.75pt;z-index:251662336;visibility:visible;mso-wrap-style:square;mso-wrap-distance-left:9pt;mso-wrap-distance-top:0;mso-wrap-distance-right:9pt;mso-wrap-distance-bottom:0;mso-position-horizontal:absolute;mso-position-horizontal-relative:text;mso-position-vertical:absolute;mso-position-vertical-relative:text;v-text-anchor:middle" o:gfxdata="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" filled="f" strokecolor="red" strokeweight="1pt"/>
             </w:pict>
@@ -3595,11 +3595,19 @@
       </w:pPr>
       <w:r>
         <w:rPr>
+          <w:rFonts w:asciiTheme="minorEastAsia" w:hAnsiTheme="minorEastAsia" w:cs="Times New Roman"/>
+          <w:color w:val="000000" w:themeColor="text1"/>
+          <w:szCs w:val="21"/>
+        </w:rPr>
+        <w:t>2019/9/10</w:t>
+      </w:r>
+      <w:r>
+        <w:rPr>
           <w:rFonts w:asciiTheme="minorEastAsia" w:hAnsiTheme="minorEastAsia" w:cs="Times New Roman" w:hint="eastAsia"/>
           <w:color w:val="000000" w:themeColor="text1"/>
           <w:szCs w:val="21"/>
         </w:rPr>
-        <w:t>目前demo的</w:t>
+        <w:t>今天虚惊</w:t>
       </w:r>
       <w:r>
         <w:rPr>
@@ -3607,7 +3615,7 @@
           <w:color w:val="000000" w:themeColor="text1"/>
           <w:szCs w:val="21"/>
         </w:rPr>
-        <w:t>新问题是</w:t>
+        <w:t>一场，用系统</w:t>
       </w:r>
       <w:r>
         <w:rPr>
@@ -3615,7 +3623,7 @@
           <w:color w:val="000000" w:themeColor="text1"/>
           <w:szCs w:val="21"/>
         </w:rPr>
-        <w:t xml:space="preserve">SM </w:t>
+        <w:t>将</w:t>
       </w:r>
       <w:r>
         <w:rPr>
@@ -3623,7 +3631,7 @@
           <w:color w:val="000000" w:themeColor="text1"/>
           <w:szCs w:val="21"/>
         </w:rPr>
-        <w:t>tag</w:t>
+        <w:t>文件</w:t>
       </w:r>
       <w:r>
         <w:rPr>
@@ -3631,7 +3639,7 @@
           <w:color w:val="000000" w:themeColor="text1"/>
           <w:szCs w:val="21"/>
         </w:rPr>
-        <w:t>竟然</w:t>
+        <w:t>cp到目录下</w:t>
       </w:r>
       <w:r>
         <w:rPr>
@@ -3639,10 +3647,281 @@
           <w:color w:val="000000" w:themeColor="text1"/>
           <w:szCs w:val="21"/>
         </w:rPr>
-        <w:t>没有加上。</w:t>
+        <w:t>时候后缀用了</w:t>
+      </w:r>
+      <w:r>
+        <w:rPr>
+          <w:rFonts w:asciiTheme="minorEastAsia" w:hAnsiTheme="minorEastAsia" w:cs="Times New Roman" w:hint="eastAsia"/>
+          <w:color w:val="000000" w:themeColor="text1"/>
+          <w:szCs w:val="21"/>
+        </w:rPr>
+        <w:t>fq.gz，</w:t>
+      </w:r>
+      <w:r>
+        <w:rPr>
+          <w:rFonts w:asciiTheme="minorEastAsia" w:hAnsiTheme="minorEastAsia" w:cs="Times New Roman"/>
+          <w:color w:val="000000" w:themeColor="text1"/>
+          <w:szCs w:val="21"/>
+        </w:rPr>
+        <w:t>于是出现了这种情况：</w:t>
+      </w:r>
+      <w:r>
+        <w:rPr>
+          <w:rFonts w:asciiTheme="minorEastAsia" w:hAnsiTheme="minorEastAsia" w:cs="Times New Roman" w:hint="eastAsia"/>
+          <w:color w:val="000000" w:themeColor="text1"/>
+          <w:szCs w:val="21"/>
+        </w:rPr>
+        <w:t>cp 1.fq.gz 2.fq.gz /path/to/</w:t>
+      </w:r>
+      <w:r>
+        <w:rPr>
+          <w:rFonts w:asciiTheme="minorEastAsia" w:hAnsiTheme="minorEastAsia" w:cs="Times New Roman"/>
+          <w:color w:val="000000" w:themeColor="text1"/>
+          <w:szCs w:val="21"/>
+        </w:rPr>
+        <w:t>health</w:t>
+      </w:r>
+    </w:p>
+    <w:p>
+      <w:pPr>
+        <w:rPr>
+          <w:rFonts w:asciiTheme="minorEastAsia" w:hAnsiTheme="minorEastAsia" w:cs="Times New Roman"/>
+          <w:color w:val="000000" w:themeColor="text1"/>
+          <w:szCs w:val="21"/>
+        </w:rPr>
+      </w:pPr>
+      <w:r>
+        <w:rPr>
+          <w:rFonts w:asciiTheme="minorEastAsia" w:hAnsiTheme="minorEastAsia" w:cs="Times New Roman" w:hint="eastAsia"/>
+          <w:color w:val="000000" w:themeColor="text1"/>
+          <w:szCs w:val="21"/>
+        </w:rPr>
+        <w:t>幸亏</w:t>
+      </w:r>
+      <w:r>
+        <w:rPr>
+          <w:rFonts w:asciiTheme="minorEastAsia" w:hAnsiTheme="minorEastAsia" w:cs="Times New Roman"/>
+          <w:color w:val="000000" w:themeColor="text1"/>
+          <w:szCs w:val="21"/>
+        </w:rPr>
+        <w:t>没有</w:t>
+      </w:r>
+      <w:r>
+        <w:rPr>
+          <w:rFonts w:asciiTheme="minorEastAsia" w:hAnsiTheme="minorEastAsia" w:cs="Times New Roman" w:hint="eastAsia"/>
+          <w:color w:val="000000" w:themeColor="text1"/>
+          <w:szCs w:val="21"/>
+        </w:rPr>
+        <w:t>被覆盖</w:t>
+      </w:r>
+      <w:r>
+        <w:rPr>
+          <w:rFonts w:asciiTheme="minorEastAsia" w:hAnsiTheme="minorEastAsia" w:cs="Times New Roman"/>
+          <w:color w:val="000000" w:themeColor="text1"/>
+          <w:szCs w:val="21"/>
+        </w:rPr>
+        <w:t>原始文件，觉得从自己的系统出发</w:t>
+      </w:r>
+      <w:r>
+        <w:rPr>
+          <w:rFonts w:asciiTheme="minorEastAsia" w:hAnsiTheme="minorEastAsia" w:cs="Times New Roman" w:hint="eastAsia"/>
+          <w:color w:val="000000" w:themeColor="text1"/>
+          <w:szCs w:val="21"/>
+        </w:rPr>
+        <w:t>通过</w:t>
+      </w:r>
+      <w:r>
+        <w:rPr>
+          <w:rFonts w:asciiTheme="minorEastAsia" w:hAnsiTheme="minorEastAsia" w:cs="Times New Roman"/>
+          <w:color w:val="000000" w:themeColor="text1"/>
+          <w:szCs w:val="21"/>
+        </w:rPr>
+        <w:t>以下几点来保障</w:t>
+      </w:r>
+      <w:r>
+        <w:rPr>
+          <w:rFonts w:asciiTheme="minorEastAsia" w:hAnsiTheme="minorEastAsia" w:cs="Times New Roman" w:hint="eastAsia"/>
+          <w:color w:val="000000" w:themeColor="text1"/>
+          <w:szCs w:val="21"/>
+        </w:rPr>
+        <w:t>：</w:t>
+      </w:r>
+    </w:p>
+    <w:p>
+      <w:pPr>
+        <w:pStyle w:val="a8"/>
+        <w:numPr>
+          <w:ilvl w:val="0"/>
+          <w:numId w:val="2"/>
+        </w:numPr>
+        <w:ind w:firstLineChars="0"/>
+        <w:rPr>
+          <w:rFonts w:asciiTheme="minorEastAsia" w:hAnsiTheme="minorEastAsia" w:cs="Times New Roman"/>
+          <w:color w:val="000000" w:themeColor="text1"/>
+          <w:szCs w:val="21"/>
+        </w:rPr>
+      </w:pPr>
+      <w:r>
+        <w:rPr>
+          <w:rFonts w:asciiTheme="minorEastAsia" w:hAnsiTheme="minorEastAsia" w:cs="Times New Roman"/>
+          <w:color w:val="000000" w:themeColor="text1"/>
+          <w:szCs w:val="21"/>
+        </w:rPr>
+        <w:t>凡是有覆盖</w:t>
+      </w:r>
+      <w:r>
+        <w:rPr>
+          <w:rFonts w:asciiTheme="minorEastAsia" w:hAnsiTheme="minorEastAsia" w:cs="Times New Roman" w:hint="eastAsia"/>
+          <w:color w:val="000000" w:themeColor="text1"/>
+          <w:szCs w:val="21"/>
+        </w:rPr>
+        <w:t>/删除</w:t>
+      </w:r>
+      <w:r>
+        <w:rPr>
+          <w:rFonts w:asciiTheme="minorEastAsia" w:hAnsiTheme="minorEastAsia" w:cs="Times New Roman"/>
+          <w:color w:val="000000" w:themeColor="text1"/>
+          <w:szCs w:val="21"/>
+        </w:rPr>
+        <w:t>源文件风险的</w:t>
+      </w:r>
+      <w:r>
+        <w:rPr>
+          <w:rFonts w:asciiTheme="minorEastAsia" w:hAnsiTheme="minorEastAsia" w:cs="Times New Roman" w:hint="eastAsia"/>
+          <w:color w:val="000000" w:themeColor="text1"/>
+          <w:szCs w:val="21"/>
+        </w:rPr>
+        <w:t>linux命令</w:t>
+      </w:r>
+      <w:r>
+        <w:rPr>
+          <w:rFonts w:asciiTheme="minorEastAsia" w:hAnsiTheme="minorEastAsia" w:cs="Times New Roman"/>
+          <w:color w:val="000000" w:themeColor="text1"/>
+          <w:szCs w:val="21"/>
+        </w:rPr>
+        <w:t>都</w:t>
+      </w:r>
+      <w:r>
+        <w:rPr>
+          <w:rFonts w:asciiTheme="minorEastAsia" w:hAnsiTheme="minorEastAsia" w:cs="Times New Roman" w:hint="eastAsia"/>
+          <w:color w:val="000000" w:themeColor="text1"/>
+          <w:szCs w:val="21"/>
+        </w:rPr>
+        <w:t>退出</w:t>
+      </w:r>
+      <w:r>
+        <w:rPr>
+          <w:rFonts w:asciiTheme="minorEastAsia" w:hAnsiTheme="minorEastAsia" w:cs="Times New Roman"/>
+          <w:color w:val="000000" w:themeColor="text1"/>
+          <w:szCs w:val="21"/>
+        </w:rPr>
+        <w:t>不执行，只生成脚本。</w:t>
+      </w:r>
+    </w:p>
+    <w:p>
+      <w:pPr>
+        <w:pStyle w:val="a8"/>
+        <w:numPr>
+          <w:ilvl w:val="0"/>
+          <w:numId w:val="2"/>
+        </w:numPr>
+        <w:ind w:firstLineChars="0"/>
+        <w:rPr>
+          <w:rFonts w:asciiTheme="minorEastAsia" w:hAnsiTheme="minorEastAsia" w:cs="Times New Roman"/>
+          <w:color w:val="000000" w:themeColor="text1"/>
+          <w:szCs w:val="21"/>
+        </w:rPr>
+      </w:pPr>
+      <w:r>
+        <w:rPr>
+          <w:rFonts w:asciiTheme="minorEastAsia" w:hAnsiTheme="minorEastAsia" w:cs="Times New Roman" w:hint="eastAsia"/>
+          <w:color w:val="000000" w:themeColor="text1"/>
+          <w:szCs w:val="21"/>
+        </w:rPr>
+        <w:t>一定要有一个</w:t>
+      </w:r>
+      <w:r>
+        <w:rPr>
+          <w:rFonts w:asciiTheme="minorEastAsia" w:hAnsiTheme="minorEastAsia" w:cs="Times New Roman"/>
+          <w:color w:val="000000" w:themeColor="text1"/>
+          <w:szCs w:val="21"/>
+        </w:rPr>
+        <w:t>检查页面，提示预警是否有覆盖风险</w:t>
+      </w:r>
+    </w:p>
+    <w:p>
+      <w:pPr>
+        <w:pStyle w:val="a8"/>
+        <w:numPr>
+          <w:ilvl w:val="0"/>
+          <w:numId w:val="2"/>
+        </w:numPr>
+        <w:ind w:firstLineChars="0"/>
+        <w:rPr>
+          <w:rFonts w:asciiTheme="minorEastAsia" w:hAnsiTheme="minorEastAsia" w:cs="Times New Roman" w:hint="eastAsia"/>
+          <w:color w:val="000000" w:themeColor="text1"/>
+          <w:szCs w:val="21"/>
+        </w:rPr>
+      </w:pPr>
+      <w:r>
+        <w:rPr>
+          <w:rFonts w:asciiTheme="minorEastAsia" w:hAnsiTheme="minorEastAsia" w:cs="Times New Roman" w:hint="eastAsia"/>
+          <w:color w:val="000000" w:themeColor="text1"/>
+          <w:szCs w:val="21"/>
+        </w:rPr>
+        <w:t>应该增加一个页面</w:t>
+      </w:r>
+      <w:r>
+        <w:rPr>
+          <w:rFonts w:asciiTheme="minorEastAsia" w:hAnsiTheme="minorEastAsia" w:cs="Times New Roman" w:hint="eastAsia"/>
+          <w:color w:val="000000" w:themeColor="text1"/>
+          <w:szCs w:val="21"/>
+        </w:rPr>
+        <w:t>，</w:t>
+      </w:r>
+      <w:r>
+        <w:rPr>
+          <w:rFonts w:asciiTheme="minorEastAsia" w:hAnsiTheme="minorEastAsia" w:cs="Times New Roman"/>
+          <w:color w:val="000000" w:themeColor="text1"/>
+          <w:szCs w:val="21"/>
+        </w:rPr>
+        <w:t>显示生成的脚本和命令，再</w:t>
+      </w:r>
+      <w:r>
+        <w:rPr>
+          <w:rFonts w:asciiTheme="minorEastAsia" w:hAnsiTheme="minorEastAsia" w:cs="Times New Roman"/>
+          <w:color w:val="000000" w:themeColor="text1"/>
+          <w:szCs w:val="21"/>
+        </w:rPr>
+        <w:t>确认运行</w:t>
       </w:r>
       <w:bookmarkStart w:id="0" w:name="_GoBack"/>
       <w:bookmarkEnd w:id="0"/>
+    </w:p>
+    <w:p>
+      <w:pPr>
+        <w:rPr>
+          <w:rFonts w:asciiTheme="minorEastAsia" w:hAnsiTheme="minorEastAsia" w:cs="Times New Roman" w:hint="eastAsia"/>
+          <w:color w:val="000000" w:themeColor="text1"/>
+          <w:szCs w:val="21"/>
+        </w:rPr>
+      </w:pPr>
+      <w:r>
+        <w:rPr>
+          <w:rFonts w:asciiTheme="minorEastAsia" w:hAnsiTheme="minorEastAsia" w:cs="Times New Roman"/>
+          <w:color w:val="000000" w:themeColor="text1"/>
+          <w:szCs w:val="21"/>
+        </w:rPr>
+        <w:t>2</w:t>
+      </w:r>
+      <w:r>
+        <w:rPr>
+          <w:rFonts w:asciiTheme="minorEastAsia" w:hAnsiTheme="minorEastAsia" w:cs="Times New Roman" w:hint="eastAsia"/>
+          <w:color w:val="000000" w:themeColor="text1"/>
+          <w:szCs w:val="21"/>
+        </w:rPr>
+        <w:t>、</w:t>
+      </w:r>
     </w:p>
     <w:sectPr>
       <w:pgSz w:w="11906" w:h="16838"/>
@@ -3695,6 +3974,95 @@
 <file path=word/numbering.xml><?xml version="1.0" encoding="utf-8"?>
 <w:numbering xmlns:wpc="http://schemas.microsoft.com/office/word/2010/wordprocessingCanvas" xmlns:mc="http://schemas.openxmlformats.org/markup-compatibility/2006" xmlns:o="urn:schemas-microsoft-com:office:office" xmlns:r="http://schemas.openxmlformats.org/officeDocument/2006/relationships" xmlns:m="http://schemas.openxmlformats.org/officeDocument/2006/math" xmlns:v="urn:schemas-microsoft-com:vml" xmlns:wp14="http://schemas.microsoft.com/office/word/2010/wordprocessingDrawing" xmlns:wp="http://schemas.openxmlformats.org/drawingml/2006/wordprocessingDrawing" xmlns:w10="urn:schemas-microsoft-com:office:word" xmlns:w="http://schemas.openxmlformats.org/wordprocessingml/2006/main" xmlns:w14="http://schemas.microsoft.com/office/word/2010/wordml" xmlns:w15="http://schemas.microsoft.com/office/word/2012/wordml" xmlns:wpg="http://schemas.microsoft.com/office/word/2010/wordprocessingGroup" xmlns:wpi="http://schemas.microsoft.com/office/word/2010/wordprocessingInk" xmlns:wne="http://schemas.microsoft.com/office/word/2006/wordml" xmlns:wps="http://schemas.microsoft.com/office/word/2010/wordprocessingShape" mc:Ignorable="w14 w15 wp14">
   <w:abstractNum w:abstractNumId="0">
+    <w:nsid w:val="5B494235"/>
+    <w:multiLevelType w:val="hybridMultilevel"/>
+    <w:tmpl w:val="1DFA688A"/>
+    <w:lvl w:ilvl="0" w:tplc="F272B248">
+      <w:start w:val="1"/>
+      <w:numFmt w:val="decimal"/>
+      <w:lvlText w:val="%1、"/>
+      <w:lvlJc w:val="left"/>
+      <w:pPr>
+        <w:ind w:left="360" w:hanging="360"/>
+      </w:pPr>
+      <w:rPr>
+        <w:rFonts w:hint="default"/>
+      </w:rPr>
+    </w:lvl>
+    <w:lvl w:ilvl="1" w:tplc="04090019" w:tentative="1">
+      <w:start w:val="1"/>
+      <w:numFmt w:val="lowerLetter"/>
+      <w:lvlText w:val="%2)"/>
+      <w:lvlJc w:val="left"/>
+      <w:pPr>
+        <w:ind w:left="840" w:hanging="420"/>
+      </w:pPr>
+    </w:lvl>
+    <w:lvl w:ilvl="2" w:tplc="0409001B" w:tentative="1">
+      <w:start w:val="1"/>
+      <w:numFmt w:val="lowerRoman"/>
+      <w:lvlText w:val="%3."/>
+      <w:lvlJc w:val="right"/>
+      <w:pPr>
+        <w:ind w:left="1260" w:hanging="420"/>
+      </w:pPr>
+    </w:lvl>
+    <w:lvl w:ilvl="3" w:tplc="0409000F" w:tentative="1">
+      <w:start w:val="1"/>
+      <w:numFmt w:val="decimal"/>
+      <w:lvlText w:val="%4."/>
+      <w:lvlJc w:val="left"/>
+      <w:pPr>
+        <w:ind w:left="1680" w:hanging="420"/>
+      </w:pPr>
+    </w:lvl>
+    <w:lvl w:ilvl="4" w:tplc="04090019" w:tentative="1">
+      <w:start w:val="1"/>
+      <w:numFmt w:val="lowerLetter"/>
+      <w:lvlText w:val="%5)"/>
+      <w:lvlJc w:val="left"/>
+      <w:pPr>
+        <w:ind w:left="2100" w:hanging="420"/>
+      </w:pPr>
+    </w:lvl>
+    <w:lvl w:ilvl="5" w:tplc="0409001B" w:tentative="1">
+      <w:start w:val="1"/>
+      <w:numFmt w:val="lowerRoman"/>
+      <w:lvlText w:val="%6."/>
+      <w:lvlJc w:val="right"/>
+      <w:pPr>
+        <w:ind w:left="2520" w:hanging="420"/>
+      </w:pPr>
+    </w:lvl>
+    <w:lvl w:ilvl="6" w:tplc="0409000F" w:tentative="1">
+      <w:start w:val="1"/>
+      <w:numFmt w:val="decimal"/>
+      <w:lvlText w:val="%7."/>
+      <w:lvlJc w:val="left"/>
+      <w:pPr>
+        <w:ind w:left="2940" w:hanging="420"/>
+      </w:pPr>
+    </w:lvl>
+    <w:lvl w:ilvl="7" w:tplc="04090019" w:tentative="1">
+      <w:start w:val="1"/>
+      <w:numFmt w:val="lowerLetter"/>
+      <w:lvlText w:val="%8)"/>
+      <w:lvlJc w:val="left"/>
+      <w:pPr>
+        <w:ind w:left="3360" w:hanging="420"/>
+      </w:pPr>
+    </w:lvl>
+    <w:lvl w:ilvl="8" w:tplc="0409001B" w:tentative="1">
+      <w:start w:val="1"/>
+      <w:numFmt w:val="lowerRoman"/>
+      <w:lvlText w:val="%9."/>
+      <w:lvlJc w:val="right"/>
+      <w:pPr>
+        <w:ind w:left="3780" w:hanging="420"/>
+      </w:pPr>
+    </w:lvl>
+  </w:abstractNum>
+  <w:abstractNum w:abstractNumId="1">
     <w:nsid w:val="7D0C0DF0"/>
     <w:multiLevelType w:val="multilevel"/>
     <w:tmpl w:val="7D0C0DF0"/>
@@ -3813,6 +4181,9 @@
     </w:lvl>
   </w:abstractNum>
   <w:num w:numId="1">
+    <w:abstractNumId w:val="1"/>
+  </w:num>
+  <w:num w:numId="2">
     <w:abstractNumId w:val="0"/>
   </w:num>
 </w:numbering>
@@ -4380,6 +4751,16 @@
       <w:szCs w:val="21"/>
     </w:rPr>
   </w:style>
+  <w:style w:type="paragraph" w:styleId="a8">
+    <w:name w:val="List Paragraph"/>
+    <w:basedOn w:val="a"/>
+    <w:uiPriority w:val="34"/>
+    <w:qFormat/>
+    <w:rsid w:val="0026704C"/>
+    <w:pPr>
+      <w:ind w:firstLineChars="200" w:firstLine="420"/>
+    </w:pPr>
+  </w:style>
 </w:styles>
 </file>
 

</xml_diff>

<commit_message>
modifiy only one output to be multiple output outputStr+= [pairOut[0]+" ${output="+outputList[0]+"|suffix="+pairOut[1]+"}" if (len(pairOut)=2 and pairOut[0]!="") else " ${output="+outputList[0]+"|suffix="+pairOut[1]+"}" for pairOut in outputList[1:]]
</commit_message>
<xml_diff>
--- a/demo介绍.docx
+++ b/demo介绍.docx
@@ -1031,7 +1031,7 @@
               </wp:anchor>
             </w:drawing>
           </mc:Choice>
-          <mc:Fallback xmlns:w16se="http://schemas.microsoft.com/office/word/2015/wordml/symex" xmlns:w16cid="http://schemas.microsoft.com/office/word/2016/wordml/cid" xmlns:am3d="http://schemas.microsoft.com/office/drawing/2017/model3d" xmlns:aink="http://schemas.microsoft.com/office/drawing/2016/ink" xmlns:cx8="http://schemas.microsoft.com/office/drawing/2016/5/14/chartex" xmlns:cx7="http://schemas.microsoft.com/office/drawing/2016/5/13/chartex" xmlns:cx6="http://schemas.microsoft.com/office/drawing/2016/5/12/chartex" xmlns:cx5="http://schemas.microsoft.com/office/drawing/2016/5/11/chartex" xmlns:cx4="http://schemas.microsoft.com/office/drawing/2016/5/10/chartex" xmlns:cx3="http://schemas.microsoft.com/office/drawing/2016/5/9/chartex" xmlns:cx2="http://schemas.microsoft.com/office/drawing/2015/10/21/chartex" xmlns:cx1="http://schemas.microsoft.com/office/drawing/2015/9/8/chartex" xmlns:cx="http://schemas.microsoft.com/office/drawing/2014/chartex">
+          <mc:Fallback xmlns:cx="http://schemas.microsoft.com/office/drawing/2014/chartex" xmlns:cx1="http://schemas.microsoft.com/office/drawing/2015/9/8/chartex" xmlns:cx2="http://schemas.microsoft.com/office/drawing/2015/10/21/chartex" xmlns:cx3="http://schemas.microsoft.com/office/drawing/2016/5/9/chartex" xmlns:cx4="http://schemas.microsoft.com/office/drawing/2016/5/10/chartex" xmlns:cx5="http://schemas.microsoft.com/office/drawing/2016/5/11/chartex" xmlns:cx6="http://schemas.microsoft.com/office/drawing/2016/5/12/chartex" xmlns:cx7="http://schemas.microsoft.com/office/drawing/2016/5/13/chartex" xmlns:cx8="http://schemas.microsoft.com/office/drawing/2016/5/14/chartex" xmlns:aink="http://schemas.microsoft.com/office/drawing/2016/ink" xmlns:am3d="http://schemas.microsoft.com/office/drawing/2017/model3d" xmlns:w16cid="http://schemas.microsoft.com/office/word/2016/wordml/cid" xmlns:w16se="http://schemas.microsoft.com/office/word/2015/wordml/symex">
             <w:pict>
               <v:rect w14:anchorId="737015C9" id="矩形 42" o:spid="_x0000_s1026" style="position:absolute;left:0;text-align:left;margin-left:-10.5pt;margin-top:114.15pt;width:255.7pt;height:63.75pt;z-index:251662336;visibility:visible;mso-wrap-style:square;mso-wrap-distance-left:9pt;mso-wrap-distance-top:0;mso-wrap-distance-right:9pt;mso-wrap-distance-bottom:0;mso-position-horizontal:absolute;mso-position-horizontal-relative:text;mso-position-vertical:absolute;mso-position-vertical-relative:text;v-text-anchor:middle" o:gfxdata="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" filled="f" strokecolor="red" strokeweight="1pt"/>
             </w:pict>
@@ -3587,479 +3587,79 @@
     </w:p>
     <w:p>
       <w:pPr>
-        <w:rPr>
-          <w:rFonts w:asciiTheme="minorEastAsia" w:hAnsiTheme="minorEastAsia" w:cs="Times New Roman"/>
-          <w:color w:val="000000" w:themeColor="text1"/>
-          <w:szCs w:val="21"/>
-        </w:rPr>
-      </w:pPr>
-      <w:r>
-        <w:rPr>
-          <w:rFonts w:asciiTheme="minorEastAsia" w:hAnsiTheme="minorEastAsia" w:cs="Times New Roman"/>
-          <w:color w:val="000000" w:themeColor="text1"/>
-          <w:szCs w:val="21"/>
-        </w:rPr>
-        <w:t>2019/9/10</w:t>
-      </w:r>
-      <w:r>
-        <w:rPr>
-          <w:rFonts w:asciiTheme="minorEastAsia" w:hAnsiTheme="minorEastAsia" w:cs="Times New Roman" w:hint="eastAsia"/>
-          <w:color w:val="000000" w:themeColor="text1"/>
-          <w:szCs w:val="21"/>
-        </w:rPr>
-        <w:t>今天虚惊</w:t>
-      </w:r>
-      <w:r>
-        <w:rPr>
-          <w:rFonts w:asciiTheme="minorEastAsia" w:hAnsiTheme="minorEastAsia" w:cs="Times New Roman"/>
-          <w:color w:val="000000" w:themeColor="text1"/>
-          <w:szCs w:val="21"/>
-        </w:rPr>
-        <w:t>一场，用系统</w:t>
-      </w:r>
-      <w:r>
-        <w:rPr>
-          <w:rFonts w:asciiTheme="minorEastAsia" w:hAnsiTheme="minorEastAsia" w:cs="Times New Roman" w:hint="eastAsia"/>
-          <w:color w:val="000000" w:themeColor="text1"/>
-          <w:szCs w:val="21"/>
-        </w:rPr>
-        <w:t>将</w:t>
-      </w:r>
-      <w:r>
-        <w:rPr>
-          <w:rFonts w:asciiTheme="minorEastAsia" w:hAnsiTheme="minorEastAsia" w:cs="Times New Roman"/>
-          <w:color w:val="000000" w:themeColor="text1"/>
-          <w:szCs w:val="21"/>
-        </w:rPr>
-        <w:t>文件</w:t>
-      </w:r>
-      <w:r>
-        <w:rPr>
-          <w:rFonts w:asciiTheme="minorEastAsia" w:hAnsiTheme="minorEastAsia" w:cs="Times New Roman" w:hint="eastAsia"/>
-          <w:color w:val="000000" w:themeColor="text1"/>
-          <w:szCs w:val="21"/>
-        </w:rPr>
-        <w:t>cp到目录下</w:t>
-      </w:r>
-      <w:r>
-        <w:rPr>
-          <w:rFonts w:asciiTheme="minorEastAsia" w:hAnsiTheme="minorEastAsia" w:cs="Times New Roman"/>
-          <w:color w:val="000000" w:themeColor="text1"/>
-          <w:szCs w:val="21"/>
-        </w:rPr>
-        <w:t>时候后缀用了</w:t>
-      </w:r>
-      <w:r>
-        <w:rPr>
-          <w:rFonts w:asciiTheme="minorEastAsia" w:hAnsiTheme="minorEastAsia" w:cs="Times New Roman" w:hint="eastAsia"/>
-          <w:color w:val="000000" w:themeColor="text1"/>
-          <w:szCs w:val="21"/>
-        </w:rPr>
-        <w:t>fq.gz，</w:t>
-      </w:r>
-      <w:r>
-        <w:rPr>
-          <w:rFonts w:asciiTheme="minorEastAsia" w:hAnsiTheme="minorEastAsia" w:cs="Times New Roman"/>
-          <w:color w:val="000000" w:themeColor="text1"/>
-          <w:szCs w:val="21"/>
-        </w:rPr>
-        <w:t>于是出现了这种情况：</w:t>
-      </w:r>
-      <w:r>
-        <w:rPr>
-          <w:rFonts w:asciiTheme="minorEastAsia" w:hAnsiTheme="minorEastAsia" w:cs="Times New Roman" w:hint="eastAsia"/>
-          <w:color w:val="000000" w:themeColor="text1"/>
-          <w:szCs w:val="21"/>
-        </w:rPr>
-        <w:t>cp 1.fq.gz 2.fq.gz /path/to/</w:t>
-      </w:r>
-      <w:r>
-        <w:rPr>
-          <w:rFonts w:asciiTheme="minorEastAsia" w:hAnsiTheme="minorEastAsia" w:cs="Times New Roman"/>
-          <w:color w:val="000000" w:themeColor="text1"/>
-          <w:szCs w:val="21"/>
-        </w:rPr>
-        <w:t>health</w:t>
-      </w:r>
-    </w:p>
-    <w:p>
-      <w:pPr>
-        <w:rPr>
-          <w:rFonts w:asciiTheme="minorEastAsia" w:hAnsiTheme="minorEastAsia" w:cs="Times New Roman"/>
-          <w:color w:val="000000" w:themeColor="text1"/>
-          <w:szCs w:val="21"/>
-        </w:rPr>
-      </w:pPr>
-      <w:r>
-        <w:rPr>
-          <w:rFonts w:asciiTheme="minorEastAsia" w:hAnsiTheme="minorEastAsia" w:cs="Times New Roman" w:hint="eastAsia"/>
-          <w:color w:val="000000" w:themeColor="text1"/>
-          <w:szCs w:val="21"/>
-        </w:rPr>
-        <w:t>幸亏</w:t>
-      </w:r>
-      <w:r>
-        <w:rPr>
-          <w:rFonts w:asciiTheme="minorEastAsia" w:hAnsiTheme="minorEastAsia" w:cs="Times New Roman"/>
-          <w:color w:val="000000" w:themeColor="text1"/>
-          <w:szCs w:val="21"/>
-        </w:rPr>
-        <w:t>没有</w:t>
-      </w:r>
-      <w:r>
-        <w:rPr>
-          <w:rFonts w:asciiTheme="minorEastAsia" w:hAnsiTheme="minorEastAsia" w:cs="Times New Roman" w:hint="eastAsia"/>
-          <w:color w:val="000000" w:themeColor="text1"/>
-          <w:szCs w:val="21"/>
-        </w:rPr>
-        <w:t>被覆盖</w:t>
-      </w:r>
-      <w:r>
-        <w:rPr>
-          <w:rFonts w:asciiTheme="minorEastAsia" w:hAnsiTheme="minorEastAsia" w:cs="Times New Roman"/>
-          <w:color w:val="000000" w:themeColor="text1"/>
-          <w:szCs w:val="21"/>
-        </w:rPr>
-        <w:t>原始文件，觉得从自己的系统出发</w:t>
-      </w:r>
-      <w:r>
-        <w:rPr>
-          <w:rFonts w:asciiTheme="minorEastAsia" w:hAnsiTheme="minorEastAsia" w:cs="Times New Roman" w:hint="eastAsia"/>
-          <w:color w:val="000000" w:themeColor="text1"/>
-          <w:szCs w:val="21"/>
-        </w:rPr>
-        <w:t>通过</w:t>
-      </w:r>
-      <w:r>
-        <w:rPr>
-          <w:rFonts w:asciiTheme="minorEastAsia" w:hAnsiTheme="minorEastAsia" w:cs="Times New Roman"/>
-          <w:color w:val="000000" w:themeColor="text1"/>
-          <w:szCs w:val="21"/>
-        </w:rPr>
-        <w:t>以下几点来保障</w:t>
-      </w:r>
-      <w:r>
-        <w:rPr>
-          <w:rFonts w:asciiTheme="minorEastAsia" w:hAnsiTheme="minorEastAsia" w:cs="Times New Roman" w:hint="eastAsia"/>
-          <w:color w:val="000000" w:themeColor="text1"/>
-          <w:szCs w:val="21"/>
-        </w:rPr>
-        <w:t>：</w:t>
-      </w:r>
-    </w:p>
-    <w:p>
-      <w:pPr>
         <w:pStyle w:val="a8"/>
-        <w:numPr>
-          <w:ilvl w:val="0"/>
-          <w:numId w:val="2"/>
-        </w:numPr>
-        <w:ind w:firstLineChars="0"/>
-        <w:rPr>
-          <w:rFonts w:asciiTheme="minorEastAsia" w:hAnsiTheme="minorEastAsia" w:cs="Times New Roman"/>
-          <w:color w:val="000000" w:themeColor="text1"/>
-          <w:szCs w:val="21"/>
-        </w:rPr>
-      </w:pPr>
-      <w:r>
-        <w:rPr>
-          <w:rFonts w:asciiTheme="minorEastAsia" w:hAnsiTheme="minorEastAsia" w:cs="Times New Roman"/>
-          <w:color w:val="000000" w:themeColor="text1"/>
-          <w:szCs w:val="21"/>
-        </w:rPr>
-        <w:t>凡是有覆盖</w:t>
-      </w:r>
-      <w:r>
-        <w:rPr>
-          <w:rFonts w:asciiTheme="minorEastAsia" w:hAnsiTheme="minorEastAsia" w:cs="Times New Roman" w:hint="eastAsia"/>
-          <w:color w:val="000000" w:themeColor="text1"/>
-          <w:szCs w:val="21"/>
-        </w:rPr>
-        <w:t>/删除</w:t>
-      </w:r>
-      <w:r>
-        <w:rPr>
-          <w:rFonts w:asciiTheme="minorEastAsia" w:hAnsiTheme="minorEastAsia" w:cs="Times New Roman"/>
-          <w:color w:val="000000" w:themeColor="text1"/>
-          <w:szCs w:val="21"/>
-        </w:rPr>
-        <w:t>源文件风险的</w:t>
-      </w:r>
-      <w:r>
-        <w:rPr>
-          <w:rFonts w:asciiTheme="minorEastAsia" w:hAnsiTheme="minorEastAsia" w:cs="Times New Roman" w:hint="eastAsia"/>
-          <w:color w:val="000000" w:themeColor="text1"/>
-          <w:szCs w:val="21"/>
-        </w:rPr>
-        <w:t>linux命令</w:t>
-      </w:r>
-      <w:r>
-        <w:rPr>
-          <w:rFonts w:asciiTheme="minorEastAsia" w:hAnsiTheme="minorEastAsia" w:cs="Times New Roman"/>
-          <w:color w:val="000000" w:themeColor="text1"/>
-          <w:szCs w:val="21"/>
-        </w:rPr>
-        <w:t>都</w:t>
-      </w:r>
-      <w:r>
-        <w:rPr>
-          <w:rFonts w:asciiTheme="minorEastAsia" w:hAnsiTheme="minorEastAsia" w:cs="Times New Roman" w:hint="eastAsia"/>
-          <w:color w:val="000000" w:themeColor="text1"/>
-          <w:szCs w:val="21"/>
-        </w:rPr>
-        <w:t>退出</w:t>
-      </w:r>
-      <w:r>
-        <w:rPr>
-          <w:rFonts w:asciiTheme="minorEastAsia" w:hAnsiTheme="minorEastAsia" w:cs="Times New Roman"/>
-          <w:color w:val="000000" w:themeColor="text1"/>
-          <w:szCs w:val="21"/>
-        </w:rPr>
-        <w:t>不执行，只生成脚本。</w:t>
+        <w:ind w:left="840"/>
+      </w:pPr>
+      <w:r>
+        <w:t>/ifs1/User/lrui/data/Tumor</w:t>
       </w:r>
     </w:p>
     <w:p>
       <w:pPr>
         <w:pStyle w:val="a8"/>
-        <w:numPr>
-          <w:ilvl w:val="0"/>
-          <w:numId w:val="2"/>
-        </w:numPr>
-        <w:ind w:firstLineChars="0"/>
-        <w:rPr>
-          <w:rFonts w:asciiTheme="minorEastAsia" w:hAnsiTheme="minorEastAsia" w:cs="Times New Roman"/>
-          <w:color w:val="000000" w:themeColor="text1"/>
-          <w:szCs w:val="21"/>
-        </w:rPr>
-      </w:pPr>
-      <w:r>
-        <w:rPr>
-          <w:rFonts w:asciiTheme="minorEastAsia" w:hAnsiTheme="minorEastAsia" w:cs="Times New Roman" w:hint="eastAsia"/>
-          <w:color w:val="000000" w:themeColor="text1"/>
-          <w:szCs w:val="21"/>
-        </w:rPr>
-        <w:t>一定要有一个</w:t>
-      </w:r>
-      <w:r>
-        <w:rPr>
-          <w:rFonts w:asciiTheme="minorEastAsia" w:hAnsiTheme="minorEastAsia" w:cs="Times New Roman"/>
-          <w:color w:val="000000" w:themeColor="text1"/>
-          <w:szCs w:val="21"/>
-        </w:rPr>
-        <w:t>检查页面，提示预警是否有覆盖风险</w:t>
+        <w:ind w:left="840"/>
+      </w:pPr>
+      <w:r>
+        <w:t>-t E -s /ifs1/User/lrui/data/Tumor/selected.index.of.100kbin.txt</w:t>
       </w:r>
     </w:p>
     <w:p>
       <w:pPr>
         <w:pStyle w:val="a8"/>
-        <w:numPr>
-          <w:ilvl w:val="0"/>
-          <w:numId w:val="2"/>
-        </w:numPr>
-        <w:ind w:firstLineChars="0"/>
-        <w:rPr>
-          <w:rFonts w:asciiTheme="minorEastAsia" w:hAnsiTheme="minorEastAsia" w:cs="Times New Roman"/>
-          <w:color w:val="000000" w:themeColor="text1"/>
-          <w:szCs w:val="21"/>
-        </w:rPr>
-      </w:pPr>
-      <w:r>
-        <w:rPr>
-          <w:rFonts w:asciiTheme="minorEastAsia" w:hAnsiTheme="minorEastAsia" w:cs="Times New Roman" w:hint="eastAsia"/>
-          <w:color w:val="000000" w:themeColor="text1"/>
-          <w:szCs w:val="21"/>
-        </w:rPr>
-        <w:t>应该增加一个页面</w:t>
-      </w:r>
-      <w:r>
-        <w:rPr>
-          <w:rFonts w:asciiTheme="minorEastAsia" w:hAnsiTheme="minorEastAsia" w:cs="Times New Roman" w:hint="eastAsia"/>
-          <w:color w:val="000000" w:themeColor="text1"/>
-          <w:szCs w:val="21"/>
-        </w:rPr>
-        <w:t>，</w:t>
-      </w:r>
-      <w:r>
-        <w:rPr>
-          <w:rFonts w:asciiTheme="minorEastAsia" w:hAnsiTheme="minorEastAsia" w:cs="Times New Roman"/>
-          <w:color w:val="000000" w:themeColor="text1"/>
-          <w:szCs w:val="21"/>
-        </w:rPr>
-        <w:t>显示生成的脚本和命令，再</w:t>
-      </w:r>
-      <w:r>
-        <w:rPr>
-          <w:rFonts w:asciiTheme="minorEastAsia" w:hAnsiTheme="minorEastAsia" w:cs="Times New Roman"/>
-          <w:color w:val="000000" w:themeColor="text1"/>
-          <w:szCs w:val="21"/>
-        </w:rPr>
-        <w:t>确认运行</w:t>
-      </w:r>
-    </w:p>
-    <w:p>
-      <w:pPr>
-        <w:rPr>
-          <w:rFonts w:asciiTheme="minorEastAsia" w:hAnsiTheme="minorEastAsia" w:cs="Times New Roman"/>
-          <w:color w:val="000000" w:themeColor="text1"/>
-          <w:szCs w:val="21"/>
-        </w:rPr>
-      </w:pPr>
-      <w:r>
-        <w:rPr>
-          <w:rFonts w:asciiTheme="minorEastAsia" w:hAnsiTheme="minorEastAsia" w:cs="Times New Roman" w:hint="eastAsia"/>
-          <w:color w:val="000000" w:themeColor="text1"/>
-          <w:szCs w:val="21"/>
-        </w:rPr>
-        <w:t>像</w:t>
-      </w:r>
-      <w:r>
-        <w:rPr>
-          <w:rFonts w:asciiTheme="minorEastAsia" w:hAnsiTheme="minorEastAsia" w:cs="Times New Roman"/>
-          <w:color w:val="000000" w:themeColor="text1"/>
-          <w:szCs w:val="21"/>
-        </w:rPr>
-        <w:t>这种命令</w:t>
-      </w:r>
-      <w:r>
-        <w:rPr>
-          <w:rFonts w:asciiTheme="minorEastAsia" w:hAnsiTheme="minorEastAsia" w:cs="Times New Roman"/>
-          <w:color w:val="000000" w:themeColor="text1"/>
-          <w:szCs w:val="21"/>
-        </w:rPr>
-        <w:t xml:space="preserve">perl /USCIMD/usr/liurui/software/MethylExtract_1.9.1/MethylExtractBSCR.pl    inFile= /USCIMD/usr/liurui/methylationdata/NBEtest/all/BS3/BS31.sam   seqFile=/USCIMD/usr/liurui/databases/methydb/mergepuc19lambda/puc19_lambda.fa  </w:t>
-      </w:r>
-      <w:r>
-        <w:rPr>
-          <w:rFonts w:asciiTheme="minorEastAsia" w:hAnsiTheme="minorEastAsia" w:cs="Times New Roman"/>
-          <w:color w:val="000000" w:themeColor="text1"/>
-          <w:szCs w:val="21"/>
+        <w:ind w:left="840"/>
+      </w:pPr>
+    </w:p>
+    <w:p>
+      <w:pPr>
+        <w:pStyle w:val="a8"/>
+        <w:ind w:left="840"/>
+      </w:pPr>
+      <w:r>
+        <w:t>-o aaa</w:t>
+      </w:r>
+    </w:p>
+    <w:p>
+      <w:pPr>
+        <w:pStyle w:val="a8"/>
+        <w:ind w:left="840"/>
+      </w:pPr>
+    </w:p>
+    <w:p>
+      <w:pPr>
+        <w:pStyle w:val="a8"/>
+        <w:ind w:left="840" w:firstLineChars="0" w:firstLine="0"/>
+      </w:pPr>
+      <w:r>
+        <w:t>/ifs1/User/lrui/data/Tumor</w:t>
+      </w:r>
+    </w:p>
+    <w:p>
+      <w:pPr>
+        <w:rPr>
+          <w:rFonts w:ascii="宋体" w:eastAsia="宋体" w:hAnsi="宋体" w:cs="Times New Roman"/>
+          <w:color w:val="000000" w:themeColor="text1"/>
+          <w:szCs w:val="21"/>
+        </w:rPr>
+      </w:pPr>
+    </w:p>
+    <w:p>
+      <w:pPr>
+        <w:rPr>
+          <w:rFonts w:ascii="宋体" w:eastAsia="宋体" w:hAnsi="宋体" w:cs="Times New Roman"/>
+          <w:color w:val="000000" w:themeColor="text1"/>
+          <w:szCs w:val="21"/>
+        </w:rPr>
+      </w:pPr>
+      <w:r>
+        <w:rPr>
+          <w:noProof/>
         </w:rPr>
         <w:lastRenderedPageBreak/>
-        <w:t>flagW=99,147 flagC=83,163</w:t>
-      </w:r>
-      <w:r>
-        <w:rPr>
-          <w:rFonts w:asciiTheme="minorEastAsia" w:hAnsiTheme="minorEastAsia" w:cs="Times New Roman"/>
-          <w:color w:val="000000" w:themeColor="text1"/>
-          <w:szCs w:val="21"/>
-        </w:rPr>
-        <w:t xml:space="preserve"> </w:t>
-      </w:r>
-    </w:p>
-    <w:p>
-      <w:pPr>
-        <w:rPr>
-          <w:rFonts w:asciiTheme="minorEastAsia" w:hAnsiTheme="minorEastAsia" w:cs="Times New Roman"/>
-          <w:color w:val="000000" w:themeColor="text1"/>
-          <w:szCs w:val="21"/>
-        </w:rPr>
-      </w:pPr>
-      <w:r>
-        <w:rPr>
-          <w:rFonts w:asciiTheme="minorEastAsia" w:hAnsiTheme="minorEastAsia" w:cs="Times New Roman"/>
-          <w:color w:val="000000" w:themeColor="text1"/>
-          <w:szCs w:val="21"/>
-        </w:rPr>
-        <w:t>inFile=</w:t>
-      </w:r>
-      <w:r>
-        <w:rPr>
-          <w:rFonts w:asciiTheme="minorEastAsia" w:hAnsiTheme="minorEastAsia" w:cs="Times New Roman" w:hint="eastAsia"/>
-          <w:color w:val="000000" w:themeColor="text1"/>
-          <w:szCs w:val="21"/>
-        </w:rPr>
-        <w:t>后面</w:t>
-      </w:r>
-      <w:r>
-        <w:rPr>
-          <w:rFonts w:asciiTheme="minorEastAsia" w:hAnsiTheme="minorEastAsia" w:cs="Times New Roman"/>
-          <w:color w:val="000000" w:themeColor="text1"/>
-          <w:szCs w:val="21"/>
-        </w:rPr>
-        <w:t>有个空格就不能运行了。。。可以考虑当输入</w:t>
-      </w:r>
-      <w:r>
-        <w:rPr>
-          <w:rFonts w:asciiTheme="minorEastAsia" w:hAnsiTheme="minorEastAsia" w:cs="Times New Roman" w:hint="eastAsia"/>
-          <w:color w:val="000000" w:themeColor="text1"/>
-          <w:szCs w:val="21"/>
-        </w:rPr>
-        <w:t>option为“=”结尾时</w:t>
-      </w:r>
-      <w:r>
-        <w:rPr>
-          <w:rFonts w:asciiTheme="minorEastAsia" w:hAnsiTheme="minorEastAsia" w:cs="Times New Roman"/>
-          <w:color w:val="000000" w:themeColor="text1"/>
-          <w:szCs w:val="21"/>
-        </w:rPr>
-        <w:t>，</w:t>
-      </w:r>
-      <w:r>
-        <w:rPr>
-          <w:rFonts w:asciiTheme="minorEastAsia" w:hAnsiTheme="minorEastAsia" w:cs="Times New Roman" w:hint="eastAsia"/>
-          <w:color w:val="000000" w:themeColor="text1"/>
-          <w:szCs w:val="21"/>
-        </w:rPr>
-        <w:t>去掉</w:t>
-      </w:r>
-      <w:r>
-        <w:rPr>
-          <w:rFonts w:asciiTheme="minorEastAsia" w:hAnsiTheme="minorEastAsia" w:cs="Times New Roman"/>
-          <w:color w:val="000000" w:themeColor="text1"/>
-          <w:szCs w:val="21"/>
-        </w:rPr>
-        <w:t>其中空格</w:t>
-      </w:r>
-      <w:r>
-        <w:rPr>
-          <w:rFonts w:asciiTheme="minorEastAsia" w:hAnsiTheme="minorEastAsia" w:cs="Times New Roman" w:hint="eastAsia"/>
-          <w:color w:val="000000" w:themeColor="text1"/>
-          <w:szCs w:val="21"/>
-        </w:rPr>
-        <w:t>。</w:t>
-      </w:r>
-      <w:r>
-        <w:rPr>
-          <w:rFonts w:asciiTheme="minorEastAsia" w:hAnsiTheme="minorEastAsia" w:cs="Times New Roman"/>
-          <w:color w:val="000000" w:themeColor="text1"/>
-          <w:szCs w:val="21"/>
-        </w:rPr>
-        <w:t>目前</w:t>
-      </w:r>
-      <w:r>
-        <w:rPr>
-          <w:rFonts w:asciiTheme="minorEastAsia" w:hAnsiTheme="minorEastAsia" w:cs="Times New Roman" w:hint="eastAsia"/>
-          <w:color w:val="000000" w:themeColor="text1"/>
-          <w:szCs w:val="21"/>
-        </w:rPr>
-        <w:t>改动了</w:t>
-      </w:r>
-      <w:r>
-        <w:rPr>
-          <w:rFonts w:asciiTheme="minorEastAsia" w:hAnsiTheme="minorEastAsia" w:cs="Times New Roman"/>
-          <w:color w:val="000000" w:themeColor="text1"/>
-          <w:szCs w:val="21"/>
-        </w:rPr>
-        <w:t>相关功能，但是否会有其他影响还需后续运行测试。</w:t>
-      </w:r>
-    </w:p>
-    <w:p>
-      <w:pPr>
-        <w:rPr>
-          <w:rFonts w:asciiTheme="minorEastAsia" w:hAnsiTheme="minorEastAsia" w:cs="Times New Roman"/>
-          <w:color w:val="000000" w:themeColor="text1"/>
-          <w:szCs w:val="21"/>
-        </w:rPr>
-      </w:pPr>
-      <w:r>
-        <w:rPr>
-          <w:noProof/>
-        </w:rPr>
         <w:drawing>
-          <wp:inline distT="0" distB="0" distL="0" distR="0" wp14:anchorId="48F7B955" wp14:editId="36111D03">
-            <wp:extent cx="3409524" cy="380952"/>
-            <wp:effectExtent l="0" t="0" r="635" b="635"/>
-            <wp:docPr id="6" name="图片 6"/>
+          <wp:inline distT="0" distB="0" distL="0" distR="0" wp14:anchorId="68122009" wp14:editId="1A63F07C">
+            <wp:extent cx="3173185" cy="5597718"/>
+            <wp:effectExtent l="0" t="0" r="8255" b="3175"/>
+            <wp:docPr id="7" name="图片 7"/>
             <wp:cNvGraphicFramePr>
               <a:graphicFrameLocks xmlns:a="http://schemas.openxmlformats.org/drawingml/2006/main" noChangeAspect="1"/>
             </wp:cNvGraphicFramePr>
@@ -4079,6 +3679,525 @@
                   <pic:spPr>
                     <a:xfrm>
                       <a:off x="0" y="0"/>
+                      <a:ext cx="3180233" cy="5610151"/>
+                    </a:xfrm>
+                    <a:prstGeom prst="rect">
+                      <a:avLst/>
+                    </a:prstGeom>
+                  </pic:spPr>
+                </pic:pic>
+              </a:graphicData>
+            </a:graphic>
+          </wp:inline>
+        </w:drawing>
+      </w:r>
+    </w:p>
+    <w:p>
+      <w:pPr>
+        <w:rPr>
+          <w:rFonts w:ascii="宋体" w:eastAsia="宋体" w:hAnsi="宋体" w:cs="Times New Roman" w:hint="eastAsia"/>
+          <w:color w:val="000000" w:themeColor="text1"/>
+          <w:szCs w:val="21"/>
+        </w:rPr>
+      </w:pPr>
+      <w:r>
+        <w:rPr>
+          <w:rFonts w:ascii="宋体" w:eastAsia="宋体" w:cs="宋体"/>
+          <w:kern w:val="0"/>
+          <w:sz w:val="18"/>
+          <w:szCs w:val="18"/>
+        </w:rPr>
+        <w:t>python ~/life/src/usci/depthDistance.py -d /ifs1/User/lrui/data/Tumor/201901553   -t E -s /ifs1/User/lrui/data/Tumor/selected.index.of.100kbin.txt -o /ifs1/User/lrui/fruitfly/autobamfiles/201901553/2019015530.aaa</w:t>
+      </w:r>
+      <w:bookmarkStart w:id="0" w:name="_GoBack"/>
+      <w:bookmarkEnd w:id="0"/>
+    </w:p>
+    <w:p>
+      <w:pPr>
+        <w:rPr>
+          <w:rFonts w:asciiTheme="minorEastAsia" w:hAnsiTheme="minorEastAsia" w:cs="Times New Roman"/>
+          <w:color w:val="000000" w:themeColor="text1"/>
+          <w:szCs w:val="21"/>
+        </w:rPr>
+      </w:pPr>
+      <w:r>
+        <w:rPr>
+          <w:rFonts w:asciiTheme="minorEastAsia" w:hAnsiTheme="minorEastAsia" w:cs="Times New Roman"/>
+          <w:color w:val="000000" w:themeColor="text1"/>
+          <w:szCs w:val="21"/>
+        </w:rPr>
+        <w:t>2019/9/10</w:t>
+      </w:r>
+      <w:r>
+        <w:rPr>
+          <w:rFonts w:asciiTheme="minorEastAsia" w:hAnsiTheme="minorEastAsia" w:cs="Times New Roman" w:hint="eastAsia"/>
+          <w:color w:val="000000" w:themeColor="text1"/>
+          <w:szCs w:val="21"/>
+        </w:rPr>
+        <w:t>今天虚惊</w:t>
+      </w:r>
+      <w:r>
+        <w:rPr>
+          <w:rFonts w:asciiTheme="minorEastAsia" w:hAnsiTheme="minorEastAsia" w:cs="Times New Roman"/>
+          <w:color w:val="000000" w:themeColor="text1"/>
+          <w:szCs w:val="21"/>
+        </w:rPr>
+        <w:t>一场，用系统</w:t>
+      </w:r>
+      <w:r>
+        <w:rPr>
+          <w:rFonts w:asciiTheme="minorEastAsia" w:hAnsiTheme="minorEastAsia" w:cs="Times New Roman" w:hint="eastAsia"/>
+          <w:color w:val="000000" w:themeColor="text1"/>
+          <w:szCs w:val="21"/>
+        </w:rPr>
+        <w:t>将</w:t>
+      </w:r>
+      <w:r>
+        <w:rPr>
+          <w:rFonts w:asciiTheme="minorEastAsia" w:hAnsiTheme="minorEastAsia" w:cs="Times New Roman"/>
+          <w:color w:val="000000" w:themeColor="text1"/>
+          <w:szCs w:val="21"/>
+        </w:rPr>
+        <w:t>文件</w:t>
+      </w:r>
+      <w:r>
+        <w:rPr>
+          <w:rFonts w:asciiTheme="minorEastAsia" w:hAnsiTheme="minorEastAsia" w:cs="Times New Roman" w:hint="eastAsia"/>
+          <w:color w:val="000000" w:themeColor="text1"/>
+          <w:szCs w:val="21"/>
+        </w:rPr>
+        <w:t>cp到目录下</w:t>
+      </w:r>
+      <w:r>
+        <w:rPr>
+          <w:rFonts w:asciiTheme="minorEastAsia" w:hAnsiTheme="minorEastAsia" w:cs="Times New Roman"/>
+          <w:color w:val="000000" w:themeColor="text1"/>
+          <w:szCs w:val="21"/>
+        </w:rPr>
+        <w:t>时候后缀用了</w:t>
+      </w:r>
+      <w:r>
+        <w:rPr>
+          <w:rFonts w:asciiTheme="minorEastAsia" w:hAnsiTheme="minorEastAsia" w:cs="Times New Roman" w:hint="eastAsia"/>
+          <w:color w:val="000000" w:themeColor="text1"/>
+          <w:szCs w:val="21"/>
+        </w:rPr>
+        <w:t>fq.gz，</w:t>
+      </w:r>
+      <w:r>
+        <w:rPr>
+          <w:rFonts w:asciiTheme="minorEastAsia" w:hAnsiTheme="minorEastAsia" w:cs="Times New Roman"/>
+          <w:color w:val="000000" w:themeColor="text1"/>
+          <w:szCs w:val="21"/>
+        </w:rPr>
+        <w:t>于是出现了这种情况：</w:t>
+      </w:r>
+      <w:r>
+        <w:rPr>
+          <w:rFonts w:asciiTheme="minorEastAsia" w:hAnsiTheme="minorEastAsia" w:cs="Times New Roman" w:hint="eastAsia"/>
+          <w:color w:val="000000" w:themeColor="text1"/>
+          <w:szCs w:val="21"/>
+        </w:rPr>
+        <w:t>cp 1.fq.gz 2.fq.gz /path/to/</w:t>
+      </w:r>
+      <w:r>
+        <w:rPr>
+          <w:rFonts w:asciiTheme="minorEastAsia" w:hAnsiTheme="minorEastAsia" w:cs="Times New Roman"/>
+          <w:color w:val="000000" w:themeColor="text1"/>
+          <w:szCs w:val="21"/>
+        </w:rPr>
+        <w:t>health</w:t>
+      </w:r>
+    </w:p>
+    <w:p>
+      <w:pPr>
+        <w:rPr>
+          <w:rFonts w:asciiTheme="minorEastAsia" w:hAnsiTheme="minorEastAsia" w:cs="Times New Roman"/>
+          <w:color w:val="000000" w:themeColor="text1"/>
+          <w:szCs w:val="21"/>
+        </w:rPr>
+      </w:pPr>
+      <w:r>
+        <w:rPr>
+          <w:rFonts w:asciiTheme="minorEastAsia" w:hAnsiTheme="minorEastAsia" w:cs="Times New Roman" w:hint="eastAsia"/>
+          <w:color w:val="000000" w:themeColor="text1"/>
+          <w:szCs w:val="21"/>
+        </w:rPr>
+        <w:t>幸亏</w:t>
+      </w:r>
+      <w:r>
+        <w:rPr>
+          <w:rFonts w:asciiTheme="minorEastAsia" w:hAnsiTheme="minorEastAsia" w:cs="Times New Roman"/>
+          <w:color w:val="000000" w:themeColor="text1"/>
+          <w:szCs w:val="21"/>
+        </w:rPr>
+        <w:t>没有</w:t>
+      </w:r>
+      <w:r>
+        <w:rPr>
+          <w:rFonts w:asciiTheme="minorEastAsia" w:hAnsiTheme="minorEastAsia" w:cs="Times New Roman" w:hint="eastAsia"/>
+          <w:color w:val="000000" w:themeColor="text1"/>
+          <w:szCs w:val="21"/>
+        </w:rPr>
+        <w:t>被覆盖</w:t>
+      </w:r>
+      <w:r>
+        <w:rPr>
+          <w:rFonts w:asciiTheme="minorEastAsia" w:hAnsiTheme="minorEastAsia" w:cs="Times New Roman"/>
+          <w:color w:val="000000" w:themeColor="text1"/>
+          <w:szCs w:val="21"/>
+        </w:rPr>
+        <w:t>原始文件，觉得从自己的系统出发</w:t>
+      </w:r>
+      <w:r>
+        <w:rPr>
+          <w:rFonts w:asciiTheme="minorEastAsia" w:hAnsiTheme="minorEastAsia" w:cs="Times New Roman" w:hint="eastAsia"/>
+          <w:color w:val="000000" w:themeColor="text1"/>
+          <w:szCs w:val="21"/>
+        </w:rPr>
+        <w:t>通过</w:t>
+      </w:r>
+      <w:r>
+        <w:rPr>
+          <w:rFonts w:asciiTheme="minorEastAsia" w:hAnsiTheme="minorEastAsia" w:cs="Times New Roman"/>
+          <w:color w:val="000000" w:themeColor="text1"/>
+          <w:szCs w:val="21"/>
+        </w:rPr>
+        <w:t>以下几点来保障</w:t>
+      </w:r>
+      <w:r>
+        <w:rPr>
+          <w:rFonts w:asciiTheme="minorEastAsia" w:hAnsiTheme="minorEastAsia" w:cs="Times New Roman" w:hint="eastAsia"/>
+          <w:color w:val="000000" w:themeColor="text1"/>
+          <w:szCs w:val="21"/>
+        </w:rPr>
+        <w:t>：</w:t>
+      </w:r>
+    </w:p>
+    <w:p>
+      <w:pPr>
+        <w:pStyle w:val="a8"/>
+        <w:numPr>
+          <w:ilvl w:val="0"/>
+          <w:numId w:val="2"/>
+        </w:numPr>
+        <w:ind w:firstLineChars="0"/>
+        <w:rPr>
+          <w:rFonts w:asciiTheme="minorEastAsia" w:hAnsiTheme="minorEastAsia" w:cs="Times New Roman"/>
+          <w:color w:val="000000" w:themeColor="text1"/>
+          <w:szCs w:val="21"/>
+        </w:rPr>
+      </w:pPr>
+      <w:r>
+        <w:rPr>
+          <w:rFonts w:asciiTheme="minorEastAsia" w:hAnsiTheme="minorEastAsia" w:cs="Times New Roman"/>
+          <w:color w:val="000000" w:themeColor="text1"/>
+          <w:szCs w:val="21"/>
+        </w:rPr>
+        <w:t>凡是有覆盖</w:t>
+      </w:r>
+      <w:r>
+        <w:rPr>
+          <w:rFonts w:asciiTheme="minorEastAsia" w:hAnsiTheme="minorEastAsia" w:cs="Times New Roman" w:hint="eastAsia"/>
+          <w:color w:val="000000" w:themeColor="text1"/>
+          <w:szCs w:val="21"/>
+        </w:rPr>
+        <w:t>/删除</w:t>
+      </w:r>
+      <w:r>
+        <w:rPr>
+          <w:rFonts w:asciiTheme="minorEastAsia" w:hAnsiTheme="minorEastAsia" w:cs="Times New Roman"/>
+          <w:color w:val="000000" w:themeColor="text1"/>
+          <w:szCs w:val="21"/>
+        </w:rPr>
+        <w:t>源文件风险的</w:t>
+      </w:r>
+      <w:r>
+        <w:rPr>
+          <w:rFonts w:asciiTheme="minorEastAsia" w:hAnsiTheme="minorEastAsia" w:cs="Times New Roman" w:hint="eastAsia"/>
+          <w:color w:val="000000" w:themeColor="text1"/>
+          <w:szCs w:val="21"/>
+        </w:rPr>
+        <w:t>linux命令</w:t>
+      </w:r>
+      <w:r>
+        <w:rPr>
+          <w:rFonts w:asciiTheme="minorEastAsia" w:hAnsiTheme="minorEastAsia" w:cs="Times New Roman"/>
+          <w:color w:val="000000" w:themeColor="text1"/>
+          <w:szCs w:val="21"/>
+        </w:rPr>
+        <w:t>都</w:t>
+      </w:r>
+      <w:r>
+        <w:rPr>
+          <w:rFonts w:asciiTheme="minorEastAsia" w:hAnsiTheme="minorEastAsia" w:cs="Times New Roman" w:hint="eastAsia"/>
+          <w:color w:val="000000" w:themeColor="text1"/>
+          <w:szCs w:val="21"/>
+        </w:rPr>
+        <w:t>退出</w:t>
+      </w:r>
+      <w:r>
+        <w:rPr>
+          <w:rFonts w:asciiTheme="minorEastAsia" w:hAnsiTheme="minorEastAsia" w:cs="Times New Roman"/>
+          <w:color w:val="000000" w:themeColor="text1"/>
+          <w:szCs w:val="21"/>
+        </w:rPr>
+        <w:t>不执行，只生成脚本。</w:t>
+      </w:r>
+    </w:p>
+    <w:p>
+      <w:pPr>
+        <w:pStyle w:val="a8"/>
+        <w:numPr>
+          <w:ilvl w:val="0"/>
+          <w:numId w:val="2"/>
+        </w:numPr>
+        <w:ind w:firstLineChars="0"/>
+        <w:rPr>
+          <w:rFonts w:asciiTheme="minorEastAsia" w:hAnsiTheme="minorEastAsia" w:cs="Times New Roman"/>
+          <w:color w:val="000000" w:themeColor="text1"/>
+          <w:szCs w:val="21"/>
+        </w:rPr>
+      </w:pPr>
+      <w:r>
+        <w:rPr>
+          <w:rFonts w:asciiTheme="minorEastAsia" w:hAnsiTheme="minorEastAsia" w:cs="Times New Roman" w:hint="eastAsia"/>
+          <w:color w:val="000000" w:themeColor="text1"/>
+          <w:szCs w:val="21"/>
+        </w:rPr>
+        <w:t>一定要有一个</w:t>
+      </w:r>
+      <w:r>
+        <w:rPr>
+          <w:rFonts w:asciiTheme="minorEastAsia" w:hAnsiTheme="minorEastAsia" w:cs="Times New Roman"/>
+          <w:color w:val="000000" w:themeColor="text1"/>
+          <w:szCs w:val="21"/>
+        </w:rPr>
+        <w:t>检查页面，提示预警是否有覆盖风险</w:t>
+      </w:r>
+    </w:p>
+    <w:p>
+      <w:pPr>
+        <w:pStyle w:val="a8"/>
+        <w:numPr>
+          <w:ilvl w:val="0"/>
+          <w:numId w:val="2"/>
+        </w:numPr>
+        <w:ind w:firstLineChars="0"/>
+        <w:rPr>
+          <w:rFonts w:asciiTheme="minorEastAsia" w:hAnsiTheme="minorEastAsia" w:cs="Times New Roman"/>
+          <w:color w:val="000000" w:themeColor="text1"/>
+          <w:szCs w:val="21"/>
+        </w:rPr>
+      </w:pPr>
+      <w:r>
+        <w:rPr>
+          <w:rFonts w:asciiTheme="minorEastAsia" w:hAnsiTheme="minorEastAsia" w:cs="Times New Roman" w:hint="eastAsia"/>
+          <w:color w:val="000000" w:themeColor="text1"/>
+          <w:szCs w:val="21"/>
+        </w:rPr>
+        <w:t>应该增加一个页面</w:t>
+      </w:r>
+      <w:r>
+        <w:rPr>
+          <w:rFonts w:asciiTheme="minorEastAsia" w:hAnsiTheme="minorEastAsia" w:cs="Times New Roman" w:hint="eastAsia"/>
+          <w:color w:val="000000" w:themeColor="text1"/>
+          <w:szCs w:val="21"/>
+        </w:rPr>
+        <w:t>，</w:t>
+      </w:r>
+      <w:r>
+        <w:rPr>
+          <w:rFonts w:asciiTheme="minorEastAsia" w:hAnsiTheme="minorEastAsia" w:cs="Times New Roman"/>
+          <w:color w:val="000000" w:themeColor="text1"/>
+          <w:szCs w:val="21"/>
+        </w:rPr>
+        <w:t>显示生成的脚本和命令，再</w:t>
+      </w:r>
+      <w:r>
+        <w:rPr>
+          <w:rFonts w:asciiTheme="minorEastAsia" w:hAnsiTheme="minorEastAsia" w:cs="Times New Roman"/>
+          <w:color w:val="000000" w:themeColor="text1"/>
+          <w:szCs w:val="21"/>
+        </w:rPr>
+        <w:t>确认运行</w:t>
+      </w:r>
+    </w:p>
+    <w:p>
+      <w:pPr>
+        <w:rPr>
+          <w:rFonts w:asciiTheme="minorEastAsia" w:hAnsiTheme="minorEastAsia" w:cs="Times New Roman"/>
+          <w:color w:val="000000" w:themeColor="text1"/>
+          <w:szCs w:val="21"/>
+        </w:rPr>
+      </w:pPr>
+      <w:r>
+        <w:rPr>
+          <w:rFonts w:asciiTheme="minorEastAsia" w:hAnsiTheme="minorEastAsia" w:cs="Times New Roman" w:hint="eastAsia"/>
+          <w:color w:val="000000" w:themeColor="text1"/>
+          <w:szCs w:val="21"/>
+        </w:rPr>
+        <w:lastRenderedPageBreak/>
+        <w:t>像</w:t>
+      </w:r>
+      <w:r>
+        <w:rPr>
+          <w:rFonts w:asciiTheme="minorEastAsia" w:hAnsiTheme="minorEastAsia" w:cs="Times New Roman"/>
+          <w:color w:val="000000" w:themeColor="text1"/>
+          <w:szCs w:val="21"/>
+        </w:rPr>
+        <w:t>这种命令</w:t>
+      </w:r>
+      <w:r>
+        <w:rPr>
+          <w:rFonts w:asciiTheme="minorEastAsia" w:hAnsiTheme="minorEastAsia" w:cs="Times New Roman"/>
+          <w:color w:val="000000" w:themeColor="text1"/>
+          <w:szCs w:val="21"/>
+        </w:rPr>
+        <w:t>perl /USCIMD/usr/liurui/software/MethylExtract_1.9.1/MethylExtractBSCR.pl    inFile= /USCIMD/usr/liurui/methylationdata/NBEtest/all/BS3/BS31.sam   seqFile=/USCIMD/usr/liurui/databases/methydb/mergepuc19lambda/puc19_lambda.fa  flagW=99,147 flagC=83,163</w:t>
+      </w:r>
+      <w:r>
+        <w:rPr>
+          <w:rFonts w:asciiTheme="minorEastAsia" w:hAnsiTheme="minorEastAsia" w:cs="Times New Roman"/>
+          <w:color w:val="000000" w:themeColor="text1"/>
+          <w:szCs w:val="21"/>
+        </w:rPr>
+        <w:t xml:space="preserve"> </w:t>
+      </w:r>
+    </w:p>
+    <w:p>
+      <w:pPr>
+        <w:rPr>
+          <w:rFonts w:asciiTheme="minorEastAsia" w:hAnsiTheme="minorEastAsia" w:cs="Times New Roman"/>
+          <w:color w:val="000000" w:themeColor="text1"/>
+          <w:szCs w:val="21"/>
+        </w:rPr>
+      </w:pPr>
+      <w:r>
+        <w:rPr>
+          <w:rFonts w:asciiTheme="minorEastAsia" w:hAnsiTheme="minorEastAsia" w:cs="Times New Roman"/>
+          <w:color w:val="000000" w:themeColor="text1"/>
+          <w:szCs w:val="21"/>
+        </w:rPr>
+        <w:t>inFile=</w:t>
+      </w:r>
+      <w:r>
+        <w:rPr>
+          <w:rFonts w:asciiTheme="minorEastAsia" w:hAnsiTheme="minorEastAsia" w:cs="Times New Roman" w:hint="eastAsia"/>
+          <w:color w:val="000000" w:themeColor="text1"/>
+          <w:szCs w:val="21"/>
+        </w:rPr>
+        <w:t>后面</w:t>
+      </w:r>
+      <w:r>
+        <w:rPr>
+          <w:rFonts w:asciiTheme="minorEastAsia" w:hAnsiTheme="minorEastAsia" w:cs="Times New Roman"/>
+          <w:color w:val="000000" w:themeColor="text1"/>
+          <w:szCs w:val="21"/>
+        </w:rPr>
+        <w:t>有个空格就不能运行了。。。可以考虑当输入</w:t>
+      </w:r>
+      <w:r>
+        <w:rPr>
+          <w:rFonts w:asciiTheme="minorEastAsia" w:hAnsiTheme="minorEastAsia" w:cs="Times New Roman" w:hint="eastAsia"/>
+          <w:color w:val="000000" w:themeColor="text1"/>
+          <w:szCs w:val="21"/>
+        </w:rPr>
+        <w:t>option为“=”结尾时</w:t>
+      </w:r>
+      <w:r>
+        <w:rPr>
+          <w:rFonts w:asciiTheme="minorEastAsia" w:hAnsiTheme="minorEastAsia" w:cs="Times New Roman"/>
+          <w:color w:val="000000" w:themeColor="text1"/>
+          <w:szCs w:val="21"/>
+        </w:rPr>
+        <w:t>，</w:t>
+      </w:r>
+      <w:r>
+        <w:rPr>
+          <w:rFonts w:asciiTheme="minorEastAsia" w:hAnsiTheme="minorEastAsia" w:cs="Times New Roman" w:hint="eastAsia"/>
+          <w:color w:val="000000" w:themeColor="text1"/>
+          <w:szCs w:val="21"/>
+        </w:rPr>
+        <w:t>去掉</w:t>
+      </w:r>
+      <w:r>
+        <w:rPr>
+          <w:rFonts w:asciiTheme="minorEastAsia" w:hAnsiTheme="minorEastAsia" w:cs="Times New Roman"/>
+          <w:color w:val="000000" w:themeColor="text1"/>
+          <w:szCs w:val="21"/>
+        </w:rPr>
+        <w:t>其中空格</w:t>
+      </w:r>
+      <w:r>
+        <w:rPr>
+          <w:rFonts w:asciiTheme="minorEastAsia" w:hAnsiTheme="minorEastAsia" w:cs="Times New Roman" w:hint="eastAsia"/>
+          <w:color w:val="000000" w:themeColor="text1"/>
+          <w:szCs w:val="21"/>
+        </w:rPr>
+        <w:t>。</w:t>
+      </w:r>
+      <w:r>
+        <w:rPr>
+          <w:rFonts w:asciiTheme="minorEastAsia" w:hAnsiTheme="minorEastAsia" w:cs="Times New Roman"/>
+          <w:color w:val="000000" w:themeColor="text1"/>
+          <w:szCs w:val="21"/>
+        </w:rPr>
+        <w:t>目前</w:t>
+      </w:r>
+      <w:r>
+        <w:rPr>
+          <w:rFonts w:asciiTheme="minorEastAsia" w:hAnsiTheme="minorEastAsia" w:cs="Times New Roman" w:hint="eastAsia"/>
+          <w:color w:val="000000" w:themeColor="text1"/>
+          <w:szCs w:val="21"/>
+        </w:rPr>
+        <w:t>改动了</w:t>
+      </w:r>
+      <w:r>
+        <w:rPr>
+          <w:rFonts w:asciiTheme="minorEastAsia" w:hAnsiTheme="minorEastAsia" w:cs="Times New Roman"/>
+          <w:color w:val="000000" w:themeColor="text1"/>
+          <w:szCs w:val="21"/>
+        </w:rPr>
+        <w:t>相关功能，但是否会有其他影响还需后续运行测试。</w:t>
+      </w:r>
+    </w:p>
+    <w:p>
+      <w:pPr>
+        <w:rPr>
+          <w:rFonts w:asciiTheme="minorEastAsia" w:hAnsiTheme="minorEastAsia" w:cs="Times New Roman"/>
+          <w:color w:val="000000" w:themeColor="text1"/>
+          <w:szCs w:val="21"/>
+        </w:rPr>
+      </w:pPr>
+      <w:r>
+        <w:rPr>
+          <w:noProof/>
+        </w:rPr>
+        <w:drawing>
+          <wp:inline distT="0" distB="0" distL="0" distR="0" wp14:anchorId="48F7B955" wp14:editId="36111D03">
+            <wp:extent cx="3409524" cy="380952"/>
+            <wp:effectExtent l="0" t="0" r="635" b="635"/>
+            <wp:docPr id="6" name="图片 6"/>
+            <wp:cNvGraphicFramePr>
+              <a:graphicFrameLocks xmlns:a="http://schemas.openxmlformats.org/drawingml/2006/main" noChangeAspect="1"/>
+            </wp:cNvGraphicFramePr>
+            <a:graphic xmlns:a="http://schemas.openxmlformats.org/drawingml/2006/main">
+              <a:graphicData uri="http://schemas.openxmlformats.org/drawingml/2006/picture">
+                <pic:pic xmlns:pic="http://schemas.openxmlformats.org/drawingml/2006/picture">
+                  <pic:nvPicPr>
+                    <pic:cNvPr id="1" name=""/>
+                    <pic:cNvPicPr/>
+                  </pic:nvPicPr>
+                  <pic:blipFill>
+                    <a:blip r:embed="rId28"/>
+                    <a:stretch>
+                      <a:fillRect/>
+                    </a:stretch>
+                  </pic:blipFill>
+                  <pic:spPr>
+                    <a:xfrm>
+                      <a:off x="0" y="0"/>
                       <a:ext cx="3409524" cy="380952"/>
                     </a:xfrm>
                     <a:prstGeom prst="rect">
@@ -4095,13 +4214,11 @@
     <w:p>
       <w:pPr>
         <w:rPr>
-          <w:rFonts w:asciiTheme="minorEastAsia" w:hAnsiTheme="minorEastAsia" w:cs="Times New Roman" w:hint="eastAsia"/>
-          <w:color w:val="000000" w:themeColor="text1"/>
-          <w:szCs w:val="21"/>
-        </w:rPr>
-      </w:pPr>
-      <w:bookmarkStart w:id="0" w:name="_GoBack"/>
-      <w:bookmarkEnd w:id="0"/>
+          <w:rFonts w:asciiTheme="minorEastAsia" w:hAnsiTheme="minorEastAsia" w:cs="Times New Roman"/>
+          <w:color w:val="000000" w:themeColor="text1"/>
+          <w:szCs w:val="21"/>
+        </w:rPr>
+      </w:pPr>
       <w:r>
         <w:rPr>
           <w:rFonts w:asciiTheme="minorEastAsia" w:hAnsiTheme="minorEastAsia" w:cs="Times New Roman" w:hint="eastAsia"/>
@@ -4189,6 +4306,56 @@
           <w:szCs w:val="21"/>
         </w:rPr>
         <w:t>运行</w:t>
+      </w:r>
+    </w:p>
+    <w:p>
+      <w:pPr>
+        <w:rPr>
+          <w:rFonts w:asciiTheme="minorEastAsia" w:hAnsiTheme="minorEastAsia" w:cs="Times New Roman"/>
+          <w:color w:val="000000" w:themeColor="text1"/>
+          <w:szCs w:val="21"/>
+        </w:rPr>
+      </w:pPr>
+    </w:p>
+    <w:p>
+      <w:pPr>
+        <w:rPr>
+          <w:rFonts w:asciiTheme="minorEastAsia" w:hAnsiTheme="minorEastAsia" w:cs="Times New Roman" w:hint="eastAsia"/>
+          <w:color w:val="000000" w:themeColor="text1"/>
+          <w:szCs w:val="21"/>
+        </w:rPr>
+      </w:pPr>
+      <w:r>
+        <w:rPr>
+          <w:rFonts w:asciiTheme="minorEastAsia" w:hAnsiTheme="minorEastAsia" w:cs="Times New Roman" w:hint="eastAsia"/>
+          <w:color w:val="000000" w:themeColor="text1"/>
+          <w:szCs w:val="21"/>
+        </w:rPr>
+        <w:t>后面</w:t>
+      </w:r>
+      <w:r>
+        <w:rPr>
+          <w:rFonts w:asciiTheme="minorEastAsia" w:hAnsiTheme="minorEastAsia" w:cs="Times New Roman"/>
+          <w:color w:val="000000" w:themeColor="text1"/>
+          <w:szCs w:val="21"/>
+        </w:rPr>
+        <w:t>有时间需要改进的地方，</w:t>
+      </w:r>
+      <w:r>
+        <w:rPr>
+          <w:rFonts w:asciiTheme="minorEastAsia" w:hAnsiTheme="minorEastAsia" w:cs="Times New Roman" w:hint="eastAsia"/>
+          <w:color w:val="000000" w:themeColor="text1"/>
+          <w:szCs w:val="21"/>
+        </w:rPr>
+        <w:t>可以灵活增减</w:t>
+      </w:r>
+      <w:r>
+        <w:rPr>
+          <w:rFonts w:asciiTheme="minorEastAsia" w:hAnsiTheme="minorEastAsia" w:cs="Times New Roman"/>
+          <w:color w:val="000000" w:themeColor="text1"/>
+          <w:szCs w:val="21"/>
+        </w:rPr>
+        <w:t>输入输出。</w:t>
       </w:r>
     </w:p>
     <w:sectPr>

</xml_diff>

<commit_message>
upload video file and work page has done
</commit_message>
<xml_diff>
--- a/demo介绍.docx
+++ b/demo介绍.docx
@@ -1,12 +1,233 @@
 
 <file path=word/document.xml><?xml version="1.0" encoding="utf-8"?>
-<w:document xmlns:wpc="http://schemas.microsoft.com/office/word/2010/wordprocessingCanvas" xmlns:cx="http://schemas.microsoft.com/office/drawing/2014/chartex" xmlns:cx1="http://schemas.microsoft.com/office/drawing/2015/9/8/chartex" xmlns:cx2="http://schemas.microsoft.com/office/drawing/2015/10/21/chartex" xmlns:cx3="http://schemas.microsoft.com/office/drawing/2016/5/9/chartex" xmlns:cx4="http://schemas.microsoft.com/office/drawing/2016/5/10/chartex" xmlns:cx5="http://schemas.microsoft.com/office/drawing/2016/5/11/chartex" xmlns:cx6="http://schemas.microsoft.com/office/drawing/2016/5/12/chartex" xmlns:cx7="http://schemas.microsoft.com/office/drawing/2016/5/13/chartex" xmlns:cx8="http://schemas.microsoft.com/office/drawing/2016/5/14/chartex" xmlns:mc="http://schemas.openxmlformats.org/markup-compatibility/2006" xmlns:aink="http://schemas.microsoft.com/office/drawing/2016/ink" xmlns:am3d="http://schemas.microsoft.com/office/drawing/2017/model3d" xmlns:o="urn:schemas-microsoft-com:office:office" xmlns:r="http://schemas.openxmlformats.org/officeDocument/2006/relationships" xmlns:m="http://schemas.openxmlformats.org/officeDocument/2006/math" xmlns:v="urn:schemas-microsoft-com:vml" xmlns:wp14="http://schemas.microsoft.com/office/word/2010/wordprocessingDrawing" xmlns:wp="http://schemas.openxmlformats.org/drawingml/2006/wordprocessingDrawing" xmlns:w10="urn:schemas-microsoft-com:office:word" xmlns:w="http://schemas.openxmlformats.org/wordprocessingml/2006/main" xmlns:w14="http://schemas.microsoft.com/office/word/2010/wordml" xmlns:w15="http://schemas.microsoft.com/office/word/2012/wordml" xmlns:w16cid="http://schemas.microsoft.com/office/word/2016/wordml/cid" xmlns:w16se="http://schemas.microsoft.com/office/word/2015/wordml/symex" xmlns:wpg="http://schemas.microsoft.com/office/word/2010/wordprocessingGroup" xmlns:wpi="http://schemas.microsoft.com/office/word/2010/wordprocessingInk" xmlns:wne="http://schemas.microsoft.com/office/word/2006/wordml" xmlns:wps="http://schemas.microsoft.com/office/word/2010/wordprocessingShape" mc:Ignorable="w14 w15 w16se w16cid wp14">
+<w:document xmlns:wpc="http://schemas.microsoft.com/office/word/2010/wordprocessingCanvas" xmlns:cx="http://schemas.microsoft.com/office/drawing/2014/chartex" xmlns:cx1="http://schemas.microsoft.com/office/drawing/2015/9/8/chartex" xmlns:cx2="http://schemas.microsoft.com/office/drawing/2015/10/21/chartex" xmlns:cx3="http://schemas.microsoft.com/office/drawing/2016/5/9/chartex" xmlns:cx4="http://schemas.microsoft.com/office/drawing/2016/5/10/chartex" xmlns:cx5="http://schemas.microsoft.com/office/drawing/2016/5/11/chartex" xmlns:cx6="http://schemas.microsoft.com/office/drawing/2016/5/12/chartex" xmlns:cx7="http://schemas.microsoft.com/office/drawing/2016/5/13/chartex" xmlns:cx8="http://schemas.microsoft.com/office/drawing/2016/5/14/chartex" xmlns:mc="http://schemas.openxmlformats.org/markup-compatibility/2006" xmlns:aink="http://schemas.microsoft.com/office/drawing/2016/ink" xmlns:am3d="http://schemas.microsoft.com/office/drawing/2017/model3d" xmlns:o="urn:schemas-microsoft-com:office:office" xmlns:r="http://schemas.openxmlformats.org/officeDocument/2006/relationships" xmlns:m="http://schemas.openxmlformats.org/officeDocument/2006/math" xmlns:v="urn:schemas-microsoft-com:vml" xmlns:wp14="http://schemas.microsoft.com/office/word/2010/wordprocessingDrawing" xmlns:wp="http://schemas.openxmlformats.org/drawingml/2006/wordprocessingDrawing" xmlns:w10="urn:schemas-microsoft-com:office:word" xmlns:w="http://schemas.openxmlformats.org/wordprocessingml/2006/main" xmlns:w14="http://schemas.microsoft.com/office/word/2010/wordml" xmlns:w15="http://schemas.microsoft.com/office/word/2012/wordml" xmlns:w16cex="http://schemas.microsoft.com/office/word/2018/wordml/cex" xmlns:w16cid="http://schemas.microsoft.com/office/word/2016/wordml/cid" xmlns:w16="http://schemas.microsoft.com/office/word/2018/wordml" xmlns:w16se="http://schemas.microsoft.com/office/word/2015/wordml/symex" xmlns:wpg="http://schemas.microsoft.com/office/word/2010/wordprocessingGroup" xmlns:wpi="http://schemas.microsoft.com/office/word/2010/wordprocessingInk" xmlns:wne="http://schemas.microsoft.com/office/word/2006/wordml" xmlns:wps="http://schemas.microsoft.com/office/word/2010/wordprocessingShape" mc:Ignorable="w14 w15 w16se w16cid w16 w16cex wp14">
   <w:body>
     <w:p>
       <w:r>
         <w:rPr>
           <w:rFonts w:hint="eastAsia"/>
         </w:rPr>
+        <w:t>项目地址：</w:t>
+      </w:r>
+      <w:r>
+        <w:fldChar w:fldCharType="begin"/>
+      </w:r>
+      <w:r>
+        <w:instrText xml:space="preserve"> HYPERLINK "https://github.com/vitogump/life" </w:instrText>
+      </w:r>
+      <w:r>
+        <w:fldChar w:fldCharType="separate"/>
+      </w:r>
+      <w:r>
+        <w:rPr>
+          <w:rStyle w:val="a3"/>
+        </w:rPr>
+        <w:t>https://github.com/vitogump/life</w:t>
+      </w:r>
+      <w:r>
+        <w:rPr>
+          <w:rStyle w:val="a3"/>
+        </w:rPr>
+        <w:fldChar w:fldCharType="end"/>
+      </w:r>
+      <w:r>
+        <w:t xml:space="preserve"> </w:t>
+      </w:r>
+      <w:r>
+        <w:rPr>
+          <w:rFonts w:hint="eastAsia"/>
+        </w:rPr>
+        <w:t>最新b</w:t>
+      </w:r>
+      <w:r>
+        <w:t>ranch</w:t>
+      </w:r>
+      <w:r>
+        <w:rPr>
+          <w:rFonts w:hint="eastAsia"/>
+        </w:rPr>
+        <w:t>：</w:t>
+      </w:r>
+      <w:proofErr w:type="spellStart"/>
+      <w:r>
+        <w:rPr>
+          <w:rFonts w:hint="eastAsia"/>
+        </w:rPr>
+        <w:t>u</w:t>
+      </w:r>
+      <w:r>
+        <w:t>sci</w:t>
+      </w:r>
+      <w:proofErr w:type="spellEnd"/>
+    </w:p>
+    <w:p>
+      <w:r>
+        <w:rPr>
+          <w:rFonts w:hint="eastAsia"/>
+        </w:rPr>
+        <w:t>网站程序启动路径：</w:t>
+      </w:r>
+      <w:r>
+        <w:t>/ifs1/User/</w:t>
+      </w:r>
+      <w:proofErr w:type="spellStart"/>
+      <w:r>
+        <w:t>lrui</w:t>
+      </w:r>
+      <w:proofErr w:type="spellEnd"/>
+      <w:r>
+        <w:t>/life/</w:t>
+      </w:r>
+      <w:proofErr w:type="spellStart"/>
+      <w:r>
+        <w:t>src</w:t>
+      </w:r>
+      <w:proofErr w:type="spellEnd"/>
+      <w:r>
+        <w:t>/web</w:t>
+      </w:r>
+    </w:p>
+    <w:p>
+      <w:proofErr w:type="spellStart"/>
+      <w:r>
+        <w:t>nohup</w:t>
+      </w:r>
+      <w:proofErr w:type="spellEnd"/>
+      <w:r>
+        <w:t xml:space="preserve"> python autodemo.py &amp;</w:t>
+      </w:r>
+    </w:p>
+    <w:p>
+      <w:r>
+        <w:rPr>
+          <w:rFonts w:hint="eastAsia"/>
+        </w:rPr>
+        <w:t>访问：</w:t>
+      </w:r>
+      <w:r>
+        <w:fldChar w:fldCharType="begin"/>
+      </w:r>
+      <w:r>
+        <w:instrText xml:space="preserve"> HYPERLINK "</w:instrText>
+      </w:r>
+      <w:r>
+        <w:instrText>http://ugene.asuscomm.com:9090/</w:instrText>
+      </w:r>
+      <w:r>
+        <w:instrText xml:space="preserve">" </w:instrText>
+      </w:r>
+      <w:r>
+        <w:fldChar w:fldCharType="separate"/>
+      </w:r>
+      <w:r>
+        <w:rPr>
+          <w:rStyle w:val="a3"/>
+        </w:rPr>
+        <w:t>http://ugene.asuscomm.com:9090/</w:t>
+      </w:r>
+      <w:r>
+        <w:fldChar w:fldCharType="end"/>
+      </w:r>
+    </w:p>
+    <w:p>
+      <w:pPr>
+        <w:rPr>
+          <w:rFonts w:hint="eastAsia"/>
+        </w:rPr>
+      </w:pPr>
+      <w:proofErr w:type="spellStart"/>
+      <w:r>
+        <w:t>ip</w:t>
+      </w:r>
+      <w:proofErr w:type="spellEnd"/>
+      <w:r>
+        <w:t>是192.168.50.170 但是putty 访问是用ugene.asuscomm.com:22 用户命是</w:t>
+      </w:r>
+      <w:proofErr w:type="spellStart"/>
+      <w:r>
+        <w:t>lrui</w:t>
+      </w:r>
+      <w:proofErr w:type="spellEnd"/>
+      <w:r>
+        <w:t xml:space="preserve"> 密码是duck007uk</w:t>
+      </w:r>
+    </w:p>
+    <w:p>
+      <w:r>
+        <w:rPr>
+          <w:rFonts w:hint="eastAsia"/>
+        </w:rPr>
+        <w:t>源程序基本都在</w:t>
+      </w:r>
+      <w:proofErr w:type="spellStart"/>
+      <w:r>
+        <w:rPr>
+          <w:rFonts w:hint="eastAsia"/>
+        </w:rPr>
+        <w:t>sr</w:t>
+      </w:r>
+      <w:r>
+        <w:t>c</w:t>
+      </w:r>
+      <w:proofErr w:type="spellEnd"/>
+      <w:r>
+        <w:t>/web</w:t>
+      </w:r>
+      <w:r>
+        <w:rPr>
+          <w:rFonts w:hint="eastAsia"/>
+        </w:rPr>
+        <w:t>路径，</w:t>
+      </w:r>
+      <w:r>
+        <w:rPr>
+          <w:rFonts w:hint="eastAsia"/>
+        </w:rPr>
+        <w:t>自动化分析控制界面</w:t>
+      </w:r>
+      <w:r>
+        <w:t>commandtemplate.html</w:t>
+      </w:r>
+    </w:p>
+    <w:p>
+      <w:r>
+        <w:rPr>
+          <w:rFonts w:hint="eastAsia"/>
+        </w:rPr>
+        <w:t>网站框架F</w:t>
+      </w:r>
+      <w:r>
+        <w:t>LASK</w:t>
+      </w:r>
+      <w:r>
+        <w:rPr>
+          <w:rFonts w:hint="eastAsia"/>
+        </w:rPr>
+        <w:t>，前端界面j</w:t>
+      </w:r>
+      <w:r>
+        <w:t>inja</w:t>
+      </w:r>
+      <w:r>
+        <w:rPr>
+          <w:rFonts w:hint="eastAsia"/>
+        </w:rPr>
+        <w:t>框架，</w:t>
+      </w:r>
+    </w:p>
+    <w:p>
+      <w:r>
+        <w:rPr>
+          <w:rFonts w:hint="eastAsia"/>
+        </w:rPr>
+        <w:t>==========================以上写给刚哥========================</w:t>
+      </w:r>
+    </w:p>
+    <w:p>
+      <w:r>
+        <w:rPr>
+          <w:rFonts w:hint="eastAsia"/>
+        </w:rPr>
         <w:t>本人</w:t>
       </w:r>
       <w:r>
@@ -25,15 +246,7 @@
         <w:t>本人</w:t>
       </w:r>
       <w:r>
-        <w:t>从一开始做二代测序数据分析就认为需要有的这么一个东西，在博士论文里面略有提及。现在把这个东西的demo做出来，一是觉得它也许能为实验室或者产业化方面做一点贡献，也是想</w:t>
-      </w:r>
-      <w:proofErr w:type="gramStart"/>
-      <w:r>
-        <w:t>把之前</w:t>
-      </w:r>
-      <w:proofErr w:type="gramEnd"/>
-      <w:r>
-        <w:t>设想的做了一半的东西具体进一步的整理和实现一下，做一个收尾结束。个人觉得这个东西可以对很多生物信息数据分析工作有贡献</w:t>
+        <w:t>从一开始做二代测序数据分析就认为需要有的这么一个东西，在博士论文里面略有提及。现在把这个东西的demo做出来，一是觉得它也许能为实验室或者产业化方面做一点贡献，也是想把之前设想的做了一半的东西具体进一步的整理和实现一下，做一个收尾结束。个人觉得这个东西可以对很多生物信息数据分析工作有贡献</w:t>
       </w:r>
       <w:r>
         <w:rPr>
@@ -94,46 +307,101 @@
     </w:p>
     <w:p>
       <w:pPr>
+        <w:rPr>
+          <w:b/>
+          <w:bCs/>
+        </w:rPr>
+      </w:pPr>
+      <w:r>
         <w:rPr>
           <w:rFonts w:hint="eastAsia"/>
           <w:b/>
           <w:bCs/>
         </w:rPr>
-      </w:pPr>
-      <w:bookmarkStart w:id="0" w:name="_GoBack"/>
+        <w:t>简而言之：系统要将数据以尽可能一目了然的逻辑展示出来，同时可以对数据方便的操作。</w:t>
+      </w:r>
+    </w:p>
+    <w:p>
       <w:r>
         <w:rPr>
           <w:rFonts w:hint="eastAsia"/>
-          <w:b/>
-          <w:bCs/>
-        </w:rPr>
-        <w:t>简而言之：系统要将数据以尽可能一目了然的逻辑展示出来，同时可以对数据方便的操作。</w:t>
-      </w:r>
-    </w:p>
-    <w:bookmarkEnd w:id="0"/>
+        </w:rPr>
+        <w:t>简单介绍一下它现在非常初步的功能：</w:t>
+      </w:r>
+    </w:p>
     <w:p>
       <w:r>
         <w:rPr>
           <w:rFonts w:hint="eastAsia"/>
         </w:rPr>
-        <w:t>简单介绍一下它现在非常初步的功能：</w:t>
-      </w:r>
-    </w:p>
-    <w:p>
+        <w:t>写了一个功能介绍文档</w:t>
+      </w:r>
+      <w:r>
+        <w:t xml:space="preserve"> 在 https://github.com/vitogump/life/tree/mergetocompass 中下载lifeWebBasedSystemUserGuide.pptx文件有个非常粗</w:t>
+      </w:r>
       <w:r>
         <w:rPr>
           <w:rFonts w:hint="eastAsia"/>
         </w:rPr>
-        <w:t>写了一个功能介绍文档</w:t>
-      </w:r>
-      <w:r>
-        <w:t xml:space="preserve"> 在 https://github.com/vitogump/life/tree/mergetocompass 中下载lifeWebBasedSystemUserGuide.pptx文件有个非常粗</w:t>
-      </w:r>
+        <w:t>糙的介绍：</w:t>
+      </w:r>
+    </w:p>
+    <w:p>
       <w:r>
         <w:rPr>
           <w:rFonts w:hint="eastAsia"/>
         </w:rPr>
-        <w:t>糙的介绍：</w:t>
+        <w:t>比方说我的鸭的重测序项目，下机之后有</w:t>
+      </w:r>
+      <w:r>
+        <w:t>mallard</w:t>
+      </w:r>
+      <w:r>
+        <w:t xml:space="preserve">, </w:t>
+      </w:r>
+      <w:r>
+        <w:t>spot-billed,</w:t>
+      </w:r>
+      <w:r>
+        <w:t xml:space="preserve"> </w:t>
+      </w:r>
+      <w:proofErr w:type="spellStart"/>
+      <w:r>
+        <w:t>beijing</w:t>
+      </w:r>
+      <w:proofErr w:type="spellEnd"/>
+      <w:r>
+        <w:t>,</w:t>
+      </w:r>
+      <w:r>
+        <w:t xml:space="preserve"> </w:t>
+      </w:r>
+      <w:proofErr w:type="spellStart"/>
+      <w:r>
+        <w:t>shaoxing</w:t>
+      </w:r>
+      <w:proofErr w:type="spellEnd"/>
+      <w:r>
+        <w:t>四个群体的个体测序数据--- 1.fq/2.fq文件。还有</w:t>
+      </w:r>
+      <w:proofErr w:type="spellStart"/>
+      <w:r>
+        <w:t>gaoyou</w:t>
+      </w:r>
+      <w:proofErr w:type="spellEnd"/>
+      <w:r>
+        <w:t>,</w:t>
+      </w:r>
+      <w:r>
+        <w:t xml:space="preserve"> </w:t>
+      </w:r>
+      <w:proofErr w:type="spellStart"/>
+      <w:r>
+        <w:t>fanya</w:t>
+      </w:r>
+      <w:proofErr w:type="spellEnd"/>
+      <w:r>
+        <w:t>,</w:t>
       </w:r>
     </w:p>
     <w:p>
@@ -141,57 +409,64 @@
         <w:rPr>
           <w:rFonts w:hint="eastAsia"/>
         </w:rPr>
-        <w:t>比方说我的鸭的重测序项目，下机之后有</w:t>
-      </w:r>
-      <w:r>
-        <w:t>mallard</w:t>
-      </w:r>
-      <w:r>
-        <w:t xml:space="preserve">, </w:t>
-      </w:r>
-      <w:r>
-        <w:t>spot-billed,</w:t>
-      </w:r>
-      <w:r>
-        <w:t xml:space="preserve"> </w:t>
+        <w:t>等群体有混池的群体测序数据</w:t>
+      </w:r>
+      <w:r>
+        <w:t>--- 也是后缀为1.fq/2.fq文件的文件。</w:t>
+      </w:r>
+    </w:p>
+    <w:p>
+      <w:r>
+        <w:rPr>
+          <w:rFonts w:hint="eastAsia"/>
+        </w:rPr>
+        <w:t>那么我首先需要将每对</w:t>
       </w:r>
       <w:proofErr w:type="spellStart"/>
       <w:r>
-        <w:t>beijing</w:t>
+        <w:t>fq</w:t>
       </w:r>
       <w:proofErr w:type="spellEnd"/>
       <w:r>
-        <w:t>,</w:t>
-      </w:r>
-      <w:r>
-        <w:t xml:space="preserve"> </w:t>
+        <w:t>数据都生成，bam，比如我用bowtie2。而且每个个体的bam都要在SM、ID加上各自个体名称的标签。</w:t>
+      </w:r>
+    </w:p>
+    <w:p>
+      <w:r>
+        <w:rPr>
+          <w:rFonts w:hint="eastAsia"/>
+        </w:rPr>
+        <w:t>手工输入要需要些上百个</w:t>
+      </w:r>
+      <w:r>
+        <w:t>bowtie2的脚本，而且搞不好会写错。当然可以编写脚本，但是这无疑增加了技术门槛，本来招一些流水化作业的专员就能</w:t>
+      </w:r>
+    </w:p>
+    <w:p>
+      <w:r>
+        <w:rPr>
+          <w:rFonts w:hint="eastAsia"/>
+        </w:rPr>
+        <w:t>完成的事情，现在还需要博士去写脚本，这个博士既要懂数据分析流程里面所有参数的意义，还要回一些编程，并且要花费一些精力和注意力在这种</w:t>
+      </w:r>
+    </w:p>
+    <w:p>
+      <w:r>
+        <w:rPr>
+          <w:rFonts w:hint="eastAsia"/>
+        </w:rPr>
+        <w:t>流水化工厂化的操作上面，而不能专注在生物学问题的思考本身。其实只要告诉计算机，帮我把</w:t>
+      </w:r>
+      <w:r>
+        <w:t xml:space="preserve">paired </w:t>
       </w:r>
       <w:proofErr w:type="spellStart"/>
       <w:r>
-        <w:t>shaoxing</w:t>
+        <w:t>fq</w:t>
       </w:r>
       <w:proofErr w:type="spellEnd"/>
       <w:r>
-        <w:t>四个群体的个体测序数据--- 1.fq/2.fq文件。还有</w:t>
-      </w:r>
-      <w:proofErr w:type="spellStart"/>
-      <w:r>
-        <w:t>gaoyou</w:t>
-      </w:r>
-      <w:proofErr w:type="spellEnd"/>
-      <w:r>
-        <w:t>,</w:t>
-      </w:r>
-      <w:r>
-        <w:t xml:space="preserve"> </w:t>
-      </w:r>
-      <w:proofErr w:type="spellStart"/>
-      <w:r>
-        <w:t>fanya</w:t>
-      </w:r>
-      <w:proofErr w:type="spellEnd"/>
-      <w:r>
-        <w:t>,</w:t>
+        <w:t>文件各自生成一个bam文件，并且打上个体</w:t>
       </w:r>
     </w:p>
     <w:p>
@@ -199,104 +474,17 @@
         <w:rPr>
           <w:rFonts w:hint="eastAsia"/>
         </w:rPr>
-        <w:t>等群体</w:t>
-      </w:r>
-      <w:proofErr w:type="gramStart"/>
+        <w:t>编号的</w:t>
+      </w:r>
+      <w:r>
+        <w:t>ID. 具体说的话，可参考文档，或者如果您时间方便我可以当面向您介绍：</w:t>
+      </w:r>
+    </w:p>
+    <w:p>
       <w:r>
         <w:rPr>
           <w:rFonts w:hint="eastAsia"/>
         </w:rPr>
-        <w:t>有混池的</w:t>
-      </w:r>
-      <w:proofErr w:type="gramEnd"/>
-      <w:r>
-        <w:rPr>
-          <w:rFonts w:hint="eastAsia"/>
-        </w:rPr>
-        <w:t>群体测序数据</w:t>
-      </w:r>
-      <w:r>
-        <w:t>--- 也是后缀为1.fq/2.fq文件的文件。</w:t>
-      </w:r>
-    </w:p>
-    <w:p>
-      <w:r>
-        <w:rPr>
-          <w:rFonts w:hint="eastAsia"/>
-        </w:rPr>
-        <w:t>那么我首先需要将每对</w:t>
-      </w:r>
-      <w:proofErr w:type="spellStart"/>
-      <w:r>
-        <w:t>fq</w:t>
-      </w:r>
-      <w:proofErr w:type="spellEnd"/>
-      <w:r>
-        <w:t>数据都生成，bam，比如我用bowtie2。而且每个个体的bam都要在SM、ID加上各自个体名称的标签。</w:t>
-      </w:r>
-    </w:p>
-    <w:p>
-      <w:r>
-        <w:rPr>
-          <w:rFonts w:hint="eastAsia"/>
-        </w:rPr>
-        <w:t>手工输入要需要些上百个</w:t>
-      </w:r>
-      <w:r>
-        <w:t>bowtie2的脚本，而且搞不好会写错。当然可以编写脚本，但是这无疑增加了技术门槛，本来招一些流水化作业的专员就能</w:t>
-      </w:r>
-    </w:p>
-    <w:p>
-      <w:r>
-        <w:rPr>
-          <w:rFonts w:hint="eastAsia"/>
-        </w:rPr>
-        <w:t>完成的事情，现在还需要博士去写脚本，这个博士既要懂数据分析流程里面所有参数的意义，还要回一些编程，并且要花费一些精力和注意力在这种</w:t>
-      </w:r>
-    </w:p>
-    <w:p>
-      <w:r>
-        <w:rPr>
-          <w:rFonts w:hint="eastAsia"/>
-        </w:rPr>
-        <w:t>流水化工厂化的操作上面，而不能专注在生物学问题的思考本身。其实只要告诉计算机，帮我把</w:t>
-      </w:r>
-      <w:r>
-        <w:t xml:space="preserve">paired </w:t>
-      </w:r>
-      <w:proofErr w:type="spellStart"/>
-      <w:r>
-        <w:t>fq</w:t>
-      </w:r>
-      <w:proofErr w:type="spellEnd"/>
-      <w:r>
-        <w:t>文件各自生成一个bam文件，并且打上个体</w:t>
-      </w:r>
-    </w:p>
-    <w:p>
-      <w:r>
-        <w:rPr>
-          <w:rFonts w:hint="eastAsia"/>
-        </w:rPr>
-        <w:t>编号的</w:t>
-      </w:r>
-      <w:r>
-        <w:t>ID. 具体说的话，可参考文档，或者如果</w:t>
-      </w:r>
-      <w:proofErr w:type="gramStart"/>
-      <w:r>
-        <w:t>您时间</w:t>
-      </w:r>
-      <w:proofErr w:type="gramEnd"/>
-      <w:r>
-        <w:t>方便我可以当面向您介绍：</w:t>
-      </w:r>
-    </w:p>
-    <w:p>
-      <w:r>
-        <w:rPr>
-          <w:rFonts w:hint="eastAsia"/>
-        </w:rPr>
         <w:t>假如原始数据存放的目录结构为：</w:t>
       </w:r>
     </w:p>
@@ -305,8 +493,9 @@
         <w:rPr>
           <w:noProof/>
         </w:rPr>
+        <w:lastRenderedPageBreak/>
         <w:drawing>
-          <wp:anchor distT="0" distB="0" distL="114300" distR="114300" simplePos="0" relativeHeight="251658240" behindDoc="0" locked="0" layoutInCell="1" allowOverlap="1" wp14:anchorId="75366664">
+          <wp:anchor distT="0" distB="0" distL="114300" distR="114300" simplePos="0" relativeHeight="251658240" behindDoc="0" locked="0" layoutInCell="1" allowOverlap="1" wp14:anchorId="64799AA5" wp14:editId="282EA4F4">
             <wp:simplePos x="0" y="0"/>
             <wp:positionH relativeFrom="column">
               <wp:posOffset>0</wp:posOffset>
@@ -364,7 +553,7 @@
           <w:noProof/>
         </w:rPr>
         <w:drawing>
-          <wp:inline distT="0" distB="0" distL="0" distR="0" wp14:anchorId="1D66E360">
+          <wp:inline distT="0" distB="0" distL="0" distR="0" wp14:anchorId="207AE588" wp14:editId="25C4516C">
             <wp:extent cx="2057400" cy="1042827"/>
             <wp:effectExtent l="0" t="0" r="0" b="0"/>
             <wp:docPr id="2" name="图片 2"/>
@@ -482,7 +671,7 @@
           <w:noProof/>
         </w:rPr>
         <w:drawing>
-          <wp:anchor distT="0" distB="0" distL="114300" distR="114300" simplePos="0" relativeHeight="251661312" behindDoc="0" locked="0" layoutInCell="1" allowOverlap="1" wp14:anchorId="47C1834D">
+          <wp:anchor distT="0" distB="0" distL="114300" distR="114300" simplePos="0" relativeHeight="251661312" behindDoc="0" locked="0" layoutInCell="1" allowOverlap="1" wp14:anchorId="77746CDB" wp14:editId="4880F87B">
             <wp:simplePos x="0" y="0"/>
             <wp:positionH relativeFrom="column">
               <wp:posOffset>2552700</wp:posOffset>
@@ -637,7 +826,7 @@
           <w:szCs w:val="24"/>
         </w:rPr>
         <w:drawing>
-          <wp:anchor distT="0" distB="0" distL="114300" distR="114300" simplePos="0" relativeHeight="251659264" behindDoc="0" locked="0" layoutInCell="1" allowOverlap="1" wp14:anchorId="7C2C81B3">
+          <wp:anchor distT="0" distB="0" distL="114300" distR="114300" simplePos="0" relativeHeight="251659264" behindDoc="0" locked="0" layoutInCell="1" allowOverlap="1" wp14:anchorId="16C96851" wp14:editId="47B3B8E7">
             <wp:simplePos x="0" y="0"/>
             <wp:positionH relativeFrom="column">
               <wp:posOffset>2552700</wp:posOffset>
@@ -708,7 +897,7 @@
           <w:noProof/>
         </w:rPr>
         <w:drawing>
-          <wp:anchor distT="0" distB="0" distL="114300" distR="114300" simplePos="0" relativeHeight="251660288" behindDoc="0" locked="0" layoutInCell="1" allowOverlap="1" wp14:anchorId="54A37486">
+          <wp:anchor distT="0" distB="0" distL="114300" distR="114300" simplePos="0" relativeHeight="251660288" behindDoc="0" locked="0" layoutInCell="1" allowOverlap="1" wp14:anchorId="54C948B6" wp14:editId="48F7634E">
             <wp:simplePos x="0" y="0"/>
             <wp:positionH relativeFrom="column">
               <wp:posOffset>2600325</wp:posOffset>
@@ -763,7 +952,6 @@
           </wp:anchor>
         </w:drawing>
       </w:r>
-      <w:proofErr w:type="gramStart"/>
       <w:r>
         <w:rPr>
           <w:rFonts w:ascii="楷体" w:eastAsia="楷体" w:hAnsi="楷体" w:hint="eastAsia"/>
@@ -772,7 +960,6 @@
         </w:rPr>
         <w:t>向下数</w:t>
       </w:r>
-      <w:proofErr w:type="gramEnd"/>
       <w:r>
         <w:rPr>
           <w:rFonts w:ascii="楷体" w:eastAsia="楷体" w:hAnsi="楷体" w:hint="eastAsia"/>
@@ -812,7 +999,6 @@
           <w:sz w:val="24"/>
           <w:szCs w:val="24"/>
         </w:rPr>
-        <w:lastRenderedPageBreak/>
         <w:t>的输入</w:t>
       </w:r>
       <w:r>
@@ -836,7 +1022,7 @@
           <w:noProof/>
         </w:rPr>
         <w:drawing>
-          <wp:inline distT="0" distB="0" distL="0" distR="0" wp14:anchorId="26930665" wp14:editId="6513D451">
+          <wp:inline distT="0" distB="0" distL="0" distR="0" wp14:anchorId="55A98479" wp14:editId="634BE754">
             <wp:extent cx="3114286" cy="238095"/>
             <wp:effectExtent l="0" t="0" r="0" b="0"/>
             <wp:docPr id="16" name="图片 16"/>
@@ -911,7 +1097,7 @@
           <w:noProof/>
         </w:rPr>
         <w:drawing>
-          <wp:inline distT="0" distB="0" distL="0" distR="0" wp14:anchorId="043D62C6" wp14:editId="4B721290">
+          <wp:inline distT="0" distB="0" distL="0" distR="0" wp14:anchorId="71F66564" wp14:editId="149CB267">
             <wp:extent cx="3400000" cy="761905"/>
             <wp:effectExtent l="0" t="0" r="0" b="635"/>
             <wp:docPr id="17" name="图片 17"/>
@@ -970,7 +1156,7 @@
           <w:noProof/>
         </w:rPr>
         <w:drawing>
-          <wp:inline distT="0" distB="0" distL="0" distR="0" wp14:anchorId="2C881730" wp14:editId="544C0F1A">
+          <wp:inline distT="0" distB="0" distL="0" distR="0" wp14:anchorId="5A74E3AC" wp14:editId="514F178C">
             <wp:extent cx="3200000" cy="704762"/>
             <wp:effectExtent l="0" t="0" r="635" b="635"/>
             <wp:docPr id="20" name="图片 20"/>
@@ -1094,10 +1280,11 @@
         <w:rPr>
           <w:noProof/>
         </w:rPr>
+        <w:lastRenderedPageBreak/>
         <mc:AlternateContent>
           <mc:Choice Requires="wps">
             <w:drawing>
-              <wp:anchor distT="0" distB="0" distL="114300" distR="114300" simplePos="0" relativeHeight="251662336" behindDoc="0" locked="0" layoutInCell="1" allowOverlap="1">
+              <wp:anchor distT="0" distB="0" distL="114300" distR="114300" simplePos="0" relativeHeight="251662336" behindDoc="0" locked="0" layoutInCell="1" allowOverlap="1" wp14:anchorId="62473C6F" wp14:editId="61E661B6">
                 <wp:simplePos x="0" y="0"/>
                 <wp:positionH relativeFrom="column">
                   <wp:posOffset>-133350</wp:posOffset>
@@ -1169,7 +1356,7 @@
           <w:noProof/>
         </w:rPr>
         <w:drawing>
-          <wp:inline distT="0" distB="0" distL="0" distR="0" wp14:anchorId="705533A2" wp14:editId="0078FDC6">
+          <wp:inline distT="0" distB="0" distL="0" distR="0" wp14:anchorId="5E3F78D4" wp14:editId="440B4491">
             <wp:extent cx="3142857" cy="2238095"/>
             <wp:effectExtent l="0" t="0" r="635" b="0"/>
             <wp:docPr id="43" name="图片 43"/>
@@ -1770,7 +1957,6 @@
           <w:sz w:val="24"/>
           <w:szCs w:val="24"/>
         </w:rPr>
-        <w:lastRenderedPageBreak/>
         <w:t>最后，如果要对根目录下所有</w:t>
       </w:r>
       <w:r>
@@ -1860,7 +2046,7 @@
           <w:noProof/>
         </w:rPr>
         <w:drawing>
-          <wp:inline distT="0" distB="0" distL="0" distR="0" wp14:anchorId="571A26A9" wp14:editId="425B3A53">
+          <wp:inline distT="0" distB="0" distL="0" distR="0" wp14:anchorId="7F52498F" wp14:editId="12DCFFD1">
             <wp:extent cx="3200000" cy="2371429"/>
             <wp:effectExtent l="0" t="0" r="635" b="0"/>
             <wp:docPr id="49" name="图片 49"/>
@@ -1905,7 +2091,6 @@
           <w:szCs w:val="24"/>
         </w:rPr>
       </w:pPr>
-      <w:proofErr w:type="gramStart"/>
       <w:r>
         <w:rPr>
           <w:rFonts w:ascii="Times New Roman" w:eastAsia="楷体" w:hAnsi="Times New Roman" w:cs="Times New Roman" w:hint="eastAsia"/>
@@ -1915,7 +2100,6 @@
         </w:rPr>
         <w:t>勾选</w:t>
       </w:r>
-      <w:proofErr w:type="gramEnd"/>
       <w:r>
         <w:rPr>
           <w:rFonts w:ascii="Times New Roman" w:eastAsia="楷体" w:hAnsi="Times New Roman" w:cs="Times New Roman" w:hint="eastAsia"/>
@@ -1950,27 +2134,7 @@
           <w:sz w:val="24"/>
           <w:szCs w:val="24"/>
         </w:rPr>
-        <w:t>并且</w:t>
-      </w:r>
-      <w:proofErr w:type="gramStart"/>
-      <w:r>
-        <w:rPr>
-          <w:rFonts w:ascii="Times New Roman" w:eastAsia="楷体" w:hAnsi="Times New Roman" w:cs="Times New Roman" w:hint="eastAsia"/>
-          <w:color w:val="000000" w:themeColor="text1"/>
-          <w:sz w:val="24"/>
-          <w:szCs w:val="24"/>
-        </w:rPr>
-        <w:t>最如下</w:t>
-      </w:r>
-      <w:proofErr w:type="gramEnd"/>
-      <w:r>
-        <w:rPr>
-          <w:rFonts w:ascii="Times New Roman" w:eastAsia="楷体" w:hAnsi="Times New Roman" w:cs="Times New Roman" w:hint="eastAsia"/>
-          <w:color w:val="000000" w:themeColor="text1"/>
-          <w:sz w:val="24"/>
-          <w:szCs w:val="24"/>
-        </w:rPr>
-        <w:t>输入。对二级子目录的筛选类似，筛选跟多只需点击“添加”按钮再填入需要筛选的目录名。</w:t>
+        <w:t>并且最如下输入。对二级子目录的筛选类似，筛选跟多只需点击“添加”按钮再填入需要筛选的目录名。</w:t>
       </w:r>
     </w:p>
     <w:p>
@@ -1987,7 +2151,7 @@
           <w:noProof/>
         </w:rPr>
         <w:drawing>
-          <wp:inline distT="0" distB="0" distL="0" distR="0" wp14:anchorId="470B4225" wp14:editId="7EB75CF5">
+          <wp:inline distT="0" distB="0" distL="0" distR="0" wp14:anchorId="434EBAFC" wp14:editId="3E682904">
             <wp:extent cx="4695238" cy="809524"/>
             <wp:effectExtent l="0" t="0" r="0" b="0"/>
             <wp:docPr id="50" name="图片 50"/>
@@ -2039,6 +2203,7 @@
           <w:sz w:val="24"/>
           <w:szCs w:val="24"/>
         </w:rPr>
+        <w:lastRenderedPageBreak/>
         <w:t>点击提交，就会在在服务器指定位置生成脚本，并且自动执行，每次执行多少个脚本可以在上图</w:t>
       </w:r>
       <w:r>
@@ -2092,7 +2257,7 @@
           <w:noProof/>
         </w:rPr>
         <w:drawing>
-          <wp:inline distT="0" distB="0" distL="0" distR="0" wp14:anchorId="095B2577" wp14:editId="0A8B8011">
+          <wp:inline distT="0" distB="0" distL="0" distR="0" wp14:anchorId="3CFA65A1" wp14:editId="6D19AFE5">
             <wp:extent cx="5274310" cy="1725930"/>
             <wp:effectExtent l="0" t="0" r="2540" b="7620"/>
             <wp:docPr id="53" name="图片 53"/>
@@ -2277,9 +2442,8 @@
         <w:rPr>
           <w:noProof/>
         </w:rPr>
-        <w:lastRenderedPageBreak/>
         <w:drawing>
-          <wp:inline distT="0" distB="0" distL="0" distR="0" wp14:anchorId="79E7F524" wp14:editId="6F8C2F52">
+          <wp:inline distT="0" distB="0" distL="0" distR="0" wp14:anchorId="0D7DDF4D" wp14:editId="30EC513C">
             <wp:extent cx="5274310" cy="2660650"/>
             <wp:effectExtent l="0" t="0" r="2540" b="6350"/>
             <wp:docPr id="54" name="图片 54"/>
@@ -2470,7 +2634,7 @@
           <w:noProof/>
         </w:rPr>
         <w:drawing>
-          <wp:inline distT="0" distB="0" distL="0" distR="0" wp14:anchorId="422E16A1" wp14:editId="2E14634B">
+          <wp:inline distT="0" distB="0" distL="0" distR="0" wp14:anchorId="74F5307A" wp14:editId="7D51B5AC">
             <wp:extent cx="3295238" cy="838095"/>
             <wp:effectExtent l="0" t="0" r="635" b="635"/>
             <wp:docPr id="55" name="图片 55"/>
@@ -2536,7 +2700,90 @@
           <w:color w:val="000000" w:themeColor="text1"/>
           <w:szCs w:val="21"/>
         </w:rPr>
-        <w:t>一种模式，去告诉系统 输入是什么， 输出是什么，软件以及参数是什么。作用于那些数据。这个规则可以套用目前大多数的分析，甚至是</w:t>
+        <w:t>一种模式，去告诉系统 输入是什么， 输出是什么，软件以及参数是什么。作用于那些数据。这个规则可以套用目前大多数的分析，甚至是a</w:t>
+      </w:r>
+      <w:r>
+        <w:rPr>
+          <w:rFonts w:asciiTheme="minorEastAsia" w:hAnsiTheme="minorEastAsia" w:cs="Times New Roman"/>
+          <w:color w:val="000000" w:themeColor="text1"/>
+          <w:szCs w:val="21"/>
+        </w:rPr>
+        <w:t>wk sed</w:t>
+      </w:r>
+      <w:r>
+        <w:rPr>
+          <w:rFonts w:asciiTheme="minorEastAsia" w:hAnsiTheme="minorEastAsia" w:cs="Times New Roman" w:hint="eastAsia"/>
+          <w:color w:val="000000" w:themeColor="text1"/>
+          <w:szCs w:val="21"/>
+        </w:rPr>
+        <w:t>等s</w:t>
+      </w:r>
+      <w:r>
+        <w:rPr>
+          <w:rFonts w:asciiTheme="minorEastAsia" w:hAnsiTheme="minorEastAsia" w:cs="Times New Roman"/>
+          <w:color w:val="000000" w:themeColor="text1"/>
+          <w:szCs w:val="21"/>
+        </w:rPr>
+        <w:t>hell</w:t>
+      </w:r>
+      <w:r>
+        <w:rPr>
+          <w:rFonts w:asciiTheme="minorEastAsia" w:hAnsiTheme="minorEastAsia" w:cs="Times New Roman" w:hint="eastAsia"/>
+          <w:color w:val="000000" w:themeColor="text1"/>
+          <w:szCs w:val="21"/>
+        </w:rPr>
+        <w:t>脚本，但是现在没法在网页上实时刷新输出，以后可以扩展功能。</w:t>
+      </w:r>
+    </w:p>
+    <w:p>
+      <w:pPr>
+        <w:rPr>
+          <w:rFonts w:asciiTheme="minorEastAsia" w:hAnsiTheme="minorEastAsia" w:cs="Times New Roman"/>
+          <w:color w:val="000000" w:themeColor="text1"/>
+          <w:szCs w:val="21"/>
+        </w:rPr>
+      </w:pPr>
+      <w:r>
+        <w:rPr>
+          <w:rFonts w:asciiTheme="minorEastAsia" w:hAnsiTheme="minorEastAsia" w:cs="Times New Roman" w:hint="eastAsia"/>
+          <w:color w:val="000000" w:themeColor="text1"/>
+          <w:szCs w:val="21"/>
+        </w:rPr>
+        <w:t>使用这样系统现在看起来规则有点复杂，未来会越来越友好，而且有一些显而易见的好处。</w:t>
+      </w:r>
+      <w:r>
+        <w:rPr>
+          <w:rFonts w:asciiTheme="minorEastAsia" w:hAnsiTheme="minorEastAsia" w:cs="Times New Roman" w:hint="eastAsia"/>
+          <w:color w:val="000000" w:themeColor="text1"/>
+          <w:szCs w:val="21"/>
+        </w:rPr>
+        <w:lastRenderedPageBreak/>
+        <w:t>比如给数据的管理提供了一个框架，防止错误操作等。机械性重复操作可以交给没有资深分析经验的人，只要有一两个有经验的人可以随时监控脚本是否正确，输出是否满意，如果想调参数，</w:t>
+      </w:r>
+      <w:r>
+        <w:rPr>
+          <w:rFonts w:asciiTheme="minorEastAsia" w:hAnsiTheme="minorEastAsia" w:cs="Times New Roman" w:hint="eastAsia"/>
+          <w:color w:val="000000" w:themeColor="text1"/>
+          <w:szCs w:val="21"/>
+        </w:rPr>
+        <w:t>也很方便，而且系统会自动记录和参数对应的生成数据，以防实验参数太多，不知道那个数据对应那个参数，那个输入对应那个输出等问题。。。</w:t>
+      </w:r>
+    </w:p>
+    <w:p>
+      <w:pPr>
+        <w:rPr>
+          <w:rFonts w:asciiTheme="minorEastAsia" w:hAnsiTheme="minorEastAsia" w:cs="Times New Roman"/>
+          <w:color w:val="000000" w:themeColor="text1"/>
+          <w:szCs w:val="21"/>
+        </w:rPr>
+      </w:pPr>
+      <w:r>
+        <w:rPr>
+          <w:rFonts w:asciiTheme="minorEastAsia" w:hAnsiTheme="minorEastAsia" w:cs="Times New Roman" w:hint="eastAsia"/>
+          <w:color w:val="000000" w:themeColor="text1"/>
+          <w:szCs w:val="21"/>
+        </w:rPr>
+        <w:t>在举两个例子，比如生成</w:t>
       </w:r>
       <w:proofErr w:type="spellStart"/>
       <w:r>
@@ -2545,111 +2792,19 @@
           <w:color w:val="000000" w:themeColor="text1"/>
           <w:szCs w:val="21"/>
         </w:rPr>
-        <w:t>a</w:t>
-      </w:r>
-      <w:r>
-        <w:rPr>
-          <w:rFonts w:asciiTheme="minorEastAsia" w:hAnsiTheme="minorEastAsia" w:cs="Times New Roman"/>
-          <w:color w:val="000000" w:themeColor="text1"/>
-          <w:szCs w:val="21"/>
-        </w:rPr>
-        <w:t>wk</w:t>
+        <w:t>v</w:t>
+      </w:r>
+      <w:r>
+        <w:rPr>
+          <w:rFonts w:asciiTheme="minorEastAsia" w:hAnsiTheme="minorEastAsia" w:cs="Times New Roman"/>
+          <w:color w:val="000000" w:themeColor="text1"/>
+          <w:szCs w:val="21"/>
+        </w:rPr>
+        <w:t>cf</w:t>
       </w:r>
       <w:proofErr w:type="spellEnd"/>
       <w:r>
         <w:rPr>
-          <w:rFonts w:asciiTheme="minorEastAsia" w:hAnsiTheme="minorEastAsia" w:cs="Times New Roman"/>
-          <w:color w:val="000000" w:themeColor="text1"/>
-          <w:szCs w:val="21"/>
-        </w:rPr>
-        <w:t xml:space="preserve"> sed</w:t>
-      </w:r>
-      <w:r>
-        <w:rPr>
-          <w:rFonts w:asciiTheme="minorEastAsia" w:hAnsiTheme="minorEastAsia" w:cs="Times New Roman" w:hint="eastAsia"/>
-          <w:color w:val="000000" w:themeColor="text1"/>
-          <w:szCs w:val="21"/>
-        </w:rPr>
-        <w:t>等s</w:t>
-      </w:r>
-      <w:r>
-        <w:rPr>
-          <w:rFonts w:asciiTheme="minorEastAsia" w:hAnsiTheme="minorEastAsia" w:cs="Times New Roman"/>
-          <w:color w:val="000000" w:themeColor="text1"/>
-          <w:szCs w:val="21"/>
-        </w:rPr>
-        <w:t>hell</w:t>
-      </w:r>
-      <w:r>
-        <w:rPr>
-          <w:rFonts w:asciiTheme="minorEastAsia" w:hAnsiTheme="minorEastAsia" w:cs="Times New Roman" w:hint="eastAsia"/>
-          <w:color w:val="000000" w:themeColor="text1"/>
-          <w:szCs w:val="21"/>
-        </w:rPr>
-        <w:t>脚本，但是现在没法在网页上实时刷新输出，以后可以扩展功能。</w:t>
-      </w:r>
-    </w:p>
-    <w:p>
-      <w:pPr>
-        <w:rPr>
-          <w:rFonts w:asciiTheme="minorEastAsia" w:hAnsiTheme="minorEastAsia" w:cs="Times New Roman"/>
-          <w:color w:val="000000" w:themeColor="text1"/>
-          <w:szCs w:val="21"/>
-        </w:rPr>
-      </w:pPr>
-      <w:r>
-        <w:rPr>
-          <w:rFonts w:asciiTheme="minorEastAsia" w:hAnsiTheme="minorEastAsia" w:cs="Times New Roman" w:hint="eastAsia"/>
-          <w:color w:val="000000" w:themeColor="text1"/>
-          <w:szCs w:val="21"/>
-        </w:rPr>
-        <w:t>使用这样系统现在看起来规则有点复杂，未来会越来越友好，而且有一些显而易见的好处。比如给数据的管理提供了一个框架，防止错误操作等。机械性重复操作可以交给没有资深分析经验的人，只要有一两个有经验的人可以随时监控脚本是否正确，输出是否满意，如果想调参数，</w:t>
-      </w:r>
-      <w:r>
-        <w:rPr>
-          <w:rFonts w:asciiTheme="minorEastAsia" w:hAnsiTheme="minorEastAsia" w:cs="Times New Roman" w:hint="eastAsia"/>
-          <w:color w:val="000000" w:themeColor="text1"/>
-          <w:szCs w:val="21"/>
-        </w:rPr>
-        <w:t>也很方便，而且系统会自动记录和参数对应的生成数据，以防实验参数太多，不知道那个数据对应那个参数，那个输入对应那个输出等问题。。。</w:t>
-      </w:r>
-    </w:p>
-    <w:p>
-      <w:pPr>
-        <w:rPr>
-          <w:rFonts w:asciiTheme="minorEastAsia" w:hAnsiTheme="minorEastAsia" w:cs="Times New Roman"/>
-          <w:color w:val="000000" w:themeColor="text1"/>
-          <w:szCs w:val="21"/>
-        </w:rPr>
-      </w:pPr>
-      <w:r>
-        <w:rPr>
-          <w:rFonts w:asciiTheme="minorEastAsia" w:hAnsiTheme="minorEastAsia" w:cs="Times New Roman" w:hint="eastAsia"/>
-          <w:color w:val="000000" w:themeColor="text1"/>
-          <w:szCs w:val="21"/>
-        </w:rPr>
-        <w:t>在举两个例子，比如生成</w:t>
-      </w:r>
-      <w:proofErr w:type="spellStart"/>
-      <w:r>
-        <w:rPr>
-          <w:rFonts w:asciiTheme="minorEastAsia" w:hAnsiTheme="minorEastAsia" w:cs="Times New Roman" w:hint="eastAsia"/>
-          <w:color w:val="000000" w:themeColor="text1"/>
-          <w:szCs w:val="21"/>
-        </w:rPr>
-        <w:t>v</w:t>
-      </w:r>
-      <w:r>
-        <w:rPr>
-          <w:rFonts w:asciiTheme="minorEastAsia" w:hAnsiTheme="minorEastAsia" w:cs="Times New Roman"/>
-          <w:color w:val="000000" w:themeColor="text1"/>
-          <w:szCs w:val="21"/>
-        </w:rPr>
-        <w:t>cf</w:t>
-      </w:r>
-      <w:proofErr w:type="spellEnd"/>
-      <w:r>
-        <w:rPr>
           <w:rFonts w:asciiTheme="minorEastAsia" w:hAnsiTheme="minorEastAsia" w:cs="Times New Roman" w:hint="eastAsia"/>
           <w:color w:val="000000" w:themeColor="text1"/>
           <w:szCs w:val="21"/>
@@ -2677,7 +2832,7 @@
           <w:noProof/>
         </w:rPr>
         <w:drawing>
-          <wp:inline distT="0" distB="0" distL="0" distR="0" wp14:anchorId="03E1A631" wp14:editId="33C235DF">
+          <wp:inline distT="0" distB="0" distL="0" distR="0" wp14:anchorId="42B38357" wp14:editId="7BC2842F">
             <wp:extent cx="3114286" cy="228571"/>
             <wp:effectExtent l="0" t="0" r="0" b="635"/>
             <wp:docPr id="57" name="图片 57"/>
@@ -2809,7 +2964,7 @@
           <w:noProof/>
         </w:rPr>
         <w:drawing>
-          <wp:inline distT="0" distB="0" distL="0" distR="0" wp14:anchorId="5E319703" wp14:editId="46B22CF1">
+          <wp:inline distT="0" distB="0" distL="0" distR="0" wp14:anchorId="7055E845" wp14:editId="2ABCA02B">
             <wp:extent cx="2571750" cy="1442511"/>
             <wp:effectExtent l="0" t="0" r="0" b="5715"/>
             <wp:docPr id="58" name="图片 58"/>
@@ -2867,7 +3022,6 @@
           <w:color w:val="000000" w:themeColor="text1"/>
           <w:szCs w:val="21"/>
         </w:rPr>
-        <w:lastRenderedPageBreak/>
         <w:t>如果是芯片数据，比如每年种猪种牛公司下机大量芯片数据，都可以套用这个系统进行数据处理和分析。</w:t>
       </w:r>
     </w:p>
@@ -2940,7 +3094,7 @@
           <w:szCs w:val="21"/>
         </w:rPr>
         <w:drawing>
-          <wp:inline distT="0" distB="0" distL="0" distR="0">
+          <wp:inline distT="0" distB="0" distL="0" distR="0" wp14:anchorId="21596A43" wp14:editId="7E4E619B">
             <wp:extent cx="5274310" cy="4286250"/>
             <wp:effectExtent l="0" t="0" r="2540" b="0"/>
             <wp:docPr id="3" name="图片 3"/>
@@ -3004,6 +3158,7 @@
           <w:color w:val="000000"/>
           <w:szCs w:val="21"/>
         </w:rPr>
+        <w:lastRenderedPageBreak/>
         <w:t>本</w:t>
       </w:r>
       <w:r>
@@ -3347,14 +3502,7 @@
         <w:rPr>
           <w:rFonts w:eastAsia="宋体"/>
         </w:rPr>
-        <w:t>至少在进行一项分析的时候保存这项分</w:t>
-      </w:r>
-      <w:r>
-        <w:rPr>
-          <w:rFonts w:eastAsia="宋体"/>
-        </w:rPr>
-        <w:lastRenderedPageBreak/>
-        <w:t>析的所有中间结果。</w:t>
+        <w:t>至少在进行一项分析的时候保存这项分析的所有中间结果。</w:t>
       </w:r>
       <w:r>
         <w:rPr>
@@ -3935,77 +4083,68 @@
       </w:r>
       <w:r>
         <w:rPr>
+          <w:rFonts w:ascii="宋体" w:eastAsia="宋体" w:hAnsi="宋体" w:cs="Times New Roman" w:hint="eastAsia"/>
+          <w:color w:val="000000" w:themeColor="text1"/>
+          <w:szCs w:val="21"/>
+        </w:rPr>
+        <w:t>此时</w:t>
+      </w:r>
+      <w:r>
+        <w:rPr>
           <w:rFonts w:ascii="宋体" w:eastAsia="宋体" w:hAnsi="宋体" w:cs="Times New Roman"/>
           <w:color w:val="000000" w:themeColor="text1"/>
           <w:szCs w:val="21"/>
         </w:rPr>
-        <w:t>辞世数据收集</w:t>
-      </w:r>
-      <w:proofErr w:type="gramStart"/>
+        <w:t>数据收集层所在层均不起作用</w:t>
+      </w:r>
       <w:r>
         <w:rPr>
           <w:rFonts w:ascii="宋体" w:eastAsia="宋体" w:hAnsi="宋体" w:cs="Times New Roman"/>
           <w:color w:val="000000" w:themeColor="text1"/>
           <w:szCs w:val="21"/>
         </w:rPr>
-        <w:t>层所在</w:t>
-      </w:r>
-      <w:proofErr w:type="gramEnd"/>
+        <w:t>。</w:t>
+      </w:r>
+      <w:r>
+        <w:rPr>
+          <w:rFonts w:ascii="宋体" w:eastAsia="宋体" w:hAnsi="宋体" w:cs="Times New Roman" w:hint="eastAsia"/>
+          <w:color w:val="000000" w:themeColor="text1"/>
+          <w:szCs w:val="21"/>
+        </w:rPr>
+        <w:t>否则这里的</w:t>
+      </w:r>
+      <w:r>
+        <w:rPr>
+          <w:rFonts w:ascii="宋体" w:eastAsia="宋体" w:hAnsi="宋体" w:cs="Times New Roman" w:hint="eastAsia"/>
+          <w:color w:val="000000" w:themeColor="text1"/>
+          <w:szCs w:val="21"/>
+        </w:rPr>
+        <w:t>路径</w:t>
+      </w:r>
       <w:r>
         <w:rPr>
           <w:rFonts w:ascii="宋体" w:eastAsia="宋体" w:hAnsi="宋体" w:cs="Times New Roman"/>
           <w:color w:val="000000" w:themeColor="text1"/>
           <w:szCs w:val="21"/>
         </w:rPr>
-        <w:t>层均不起作用</w:t>
-      </w:r>
-      <w:r>
+        <w:t>不起作用。</w:t>
+      </w:r>
+    </w:p>
+    <w:p>
+      <w:pPr>
         <w:rPr>
           <w:rFonts w:ascii="宋体" w:eastAsia="宋体" w:hAnsi="宋体" w:cs="Times New Roman"/>
           <w:color w:val="000000" w:themeColor="text1"/>
           <w:szCs w:val="21"/>
         </w:rPr>
-        <w:t>。</w:t>
-      </w:r>
-      <w:r>
-        <w:rPr>
-          <w:rFonts w:ascii="宋体" w:eastAsia="宋体" w:hAnsi="宋体" w:cs="Times New Roman" w:hint="eastAsia"/>
-          <w:color w:val="000000" w:themeColor="text1"/>
-          <w:szCs w:val="21"/>
-        </w:rPr>
-        <w:t>否则这里的</w:t>
-      </w:r>
-      <w:r>
-        <w:rPr>
-          <w:rFonts w:ascii="宋体" w:eastAsia="宋体" w:hAnsi="宋体" w:cs="Times New Roman" w:hint="eastAsia"/>
-          <w:color w:val="000000" w:themeColor="text1"/>
-          <w:szCs w:val="21"/>
-        </w:rPr>
-        <w:t>路径</w:t>
-      </w:r>
-      <w:r>
-        <w:rPr>
-          <w:rFonts w:ascii="宋体" w:eastAsia="宋体" w:hAnsi="宋体" w:cs="Times New Roman"/>
-          <w:color w:val="000000" w:themeColor="text1"/>
-          <w:szCs w:val="21"/>
-        </w:rPr>
-        <w:t>不起作用。</w:t>
-      </w:r>
-    </w:p>
-    <w:p>
-      <w:pPr>
-        <w:rPr>
-          <w:rFonts w:ascii="宋体" w:eastAsia="宋体" w:hAnsi="宋体" w:cs="Times New Roman"/>
-          <w:color w:val="000000" w:themeColor="text1"/>
-          <w:szCs w:val="21"/>
-        </w:rPr>
       </w:pPr>
       <w:r>
         <w:rPr>
           <w:noProof/>
         </w:rPr>
+        <w:lastRenderedPageBreak/>
         <w:drawing>
-          <wp:inline distT="0" distB="0" distL="0" distR="0" wp14:anchorId="4E687943" wp14:editId="4E706315">
+          <wp:inline distT="0" distB="0" distL="0" distR="0" wp14:anchorId="20036C46" wp14:editId="3E5D81BC">
             <wp:extent cx="5274310" cy="4142740"/>
             <wp:effectExtent l="0" t="0" r="2540" b="0"/>
             <wp:docPr id="4" name="图片 4"/>
@@ -4090,7 +4229,7 @@
         </w:rPr>
         <w:lastRenderedPageBreak/>
         <w:drawing>
-          <wp:inline distT="0" distB="0" distL="0" distR="0" wp14:anchorId="016AC91B" wp14:editId="79BD403D">
+          <wp:inline distT="0" distB="0" distL="0" distR="0" wp14:anchorId="2446EE01" wp14:editId="502554A2">
             <wp:extent cx="5274310" cy="4836160"/>
             <wp:effectExtent l="0" t="0" r="2540" b="2540"/>
             <wp:docPr id="5" name="图片 5"/>
@@ -4283,7 +4422,7 @@
         </w:rPr>
         <w:lastRenderedPageBreak/>
         <w:drawing>
-          <wp:inline distT="0" distB="0" distL="0" distR="0" wp14:anchorId="68122009" wp14:editId="1A63F07C">
+          <wp:inline distT="0" distB="0" distL="0" distR="0" wp14:anchorId="432CB480" wp14:editId="251570B0">
             <wp:extent cx="3173185" cy="5597718"/>
             <wp:effectExtent l="0" t="0" r="8255" b="3175"/>
             <wp:docPr id="7" name="图片 7"/>
@@ -4491,33 +4630,15 @@
           <w:color w:val="000000" w:themeColor="text1"/>
           <w:szCs w:val="21"/>
         </w:rPr>
-        <w:t>cp到目录</w:t>
-      </w:r>
-      <w:proofErr w:type="gramStart"/>
-      <w:r>
-        <w:rPr>
-          <w:rFonts w:asciiTheme="minorEastAsia" w:hAnsiTheme="minorEastAsia" w:cs="Times New Roman" w:hint="eastAsia"/>
-          <w:color w:val="000000" w:themeColor="text1"/>
-          <w:szCs w:val="21"/>
-        </w:rPr>
-        <w:t>下</w:t>
-      </w:r>
-      <w:r>
-        <w:rPr>
-          <w:rFonts w:asciiTheme="minorEastAsia" w:hAnsiTheme="minorEastAsia" w:cs="Times New Roman"/>
-          <w:color w:val="000000" w:themeColor="text1"/>
-          <w:szCs w:val="21"/>
-        </w:rPr>
-        <w:t>时候</w:t>
-      </w:r>
-      <w:proofErr w:type="gramEnd"/>
-      <w:r>
-        <w:rPr>
-          <w:rFonts w:asciiTheme="minorEastAsia" w:hAnsiTheme="minorEastAsia" w:cs="Times New Roman"/>
-          <w:color w:val="000000" w:themeColor="text1"/>
-          <w:szCs w:val="21"/>
-        </w:rPr>
-        <w:t>后缀用了</w:t>
+        <w:t>cp到目录下</w:t>
+      </w:r>
+      <w:r>
+        <w:rPr>
+          <w:rFonts w:asciiTheme="minorEastAsia" w:hAnsiTheme="minorEastAsia" w:cs="Times New Roman"/>
+          <w:color w:val="000000" w:themeColor="text1"/>
+          <w:szCs w:val="21"/>
+        </w:rPr>
+        <w:t>时候后缀用了</w:t>
       </w:r>
       <w:r>
         <w:rPr>
@@ -4906,25 +5027,7 @@
           <w:color w:val="000000" w:themeColor="text1"/>
           <w:szCs w:val="21"/>
         </w:rPr>
-        <w:t>/all/BS3/BS31.sam   seqFile=/USCIMD/usr/liurui/databases/methydb/mergepuc19lambda/puc19_</w:t>
-      </w:r>
-      <w:proofErr w:type="gramStart"/>
-      <w:r>
-        <w:rPr>
-          <w:rFonts w:asciiTheme="minorEastAsia" w:hAnsiTheme="minorEastAsia" w:cs="Times New Roman"/>
-          <w:color w:val="000000" w:themeColor="text1"/>
-          <w:szCs w:val="21"/>
-        </w:rPr>
-        <w:t>lambda.fa</w:t>
-      </w:r>
-      <w:proofErr w:type="gramEnd"/>
-      <w:r>
-        <w:rPr>
-          <w:rFonts w:asciiTheme="minorEastAsia" w:hAnsiTheme="minorEastAsia" w:cs="Times New Roman"/>
-          <w:color w:val="000000" w:themeColor="text1"/>
-          <w:szCs w:val="21"/>
-        </w:rPr>
-        <w:t xml:space="preserve">  </w:t>
+        <w:t xml:space="preserve">/all/BS3/BS31.sam   seqFile=/USCIMD/usr/liurui/databases/methydb/mergepuc19lambda/puc19_lambda.fa  </w:t>
       </w:r>
       <w:proofErr w:type="spellStart"/>
       <w:r>
@@ -5092,7 +5195,7 @@
         </w:rPr>
         <w:lastRenderedPageBreak/>
         <w:drawing>
-          <wp:inline distT="0" distB="0" distL="0" distR="0" wp14:anchorId="48F7B955" wp14:editId="36111D03">
+          <wp:inline distT="0" distB="0" distL="0" distR="0" wp14:anchorId="4290CFC7" wp14:editId="487FD5D7">
             <wp:extent cx="3409524" cy="380952"/>
             <wp:effectExtent l="0" t="0" r="635" b="635"/>
             <wp:docPr id="6" name="图片 6"/>
@@ -5357,7 +5460,7 @@
           <w:noProof/>
         </w:rPr>
         <w:drawing>
-          <wp:inline distT="0" distB="0" distL="0" distR="0" wp14:anchorId="3F699456" wp14:editId="1B33FD87">
+          <wp:inline distT="0" distB="0" distL="0" distR="0" wp14:anchorId="6B3B7D0F" wp14:editId="64398E20">
             <wp:extent cx="3485714" cy="780952"/>
             <wp:effectExtent l="0" t="0" r="635" b="635"/>
             <wp:docPr id="8" name="图片 8"/>
@@ -5524,7 +5627,7 @@
           <w:noProof/>
         </w:rPr>
         <w:drawing>
-          <wp:inline distT="0" distB="0" distL="0" distR="0" wp14:anchorId="1AEE9F2E" wp14:editId="4B943134">
+          <wp:inline distT="0" distB="0" distL="0" distR="0" wp14:anchorId="0F0E4E33" wp14:editId="32DAB592">
             <wp:extent cx="3304762" cy="866667"/>
             <wp:effectExtent l="0" t="0" r="0" b="0"/>
             <wp:docPr id="12" name="图片 12"/>
@@ -5625,7 +5728,7 @@
           <w:noProof/>
         </w:rPr>
         <w:drawing>
-          <wp:inline distT="0" distB="0" distL="0" distR="0" wp14:anchorId="0B2C74CA" wp14:editId="56EAF271">
+          <wp:inline distT="0" distB="0" distL="0" distR="0" wp14:anchorId="0B7480FA" wp14:editId="0F84AF9F">
             <wp:extent cx="5274310" cy="607060"/>
             <wp:effectExtent l="0" t="0" r="2540" b="2540"/>
             <wp:docPr id="13" name="图片 13"/>
@@ -5697,7 +5800,7 @@
           <w:noProof/>
         </w:rPr>
         <w:drawing>
-          <wp:inline distT="0" distB="0" distL="0" distR="0" wp14:anchorId="362C12CB" wp14:editId="5D40535A">
+          <wp:inline distT="0" distB="0" distL="0" distR="0" wp14:anchorId="70520E19" wp14:editId="16F3BCC9">
             <wp:extent cx="3171429" cy="742857"/>
             <wp:effectExtent l="0" t="0" r="0" b="635"/>
             <wp:docPr id="14" name="图片 14"/>
@@ -5818,7 +5921,7 @@
           <w:noProof/>
         </w:rPr>
         <w:drawing>
-          <wp:inline distT="0" distB="0" distL="0" distR="0" wp14:anchorId="1C8F8002" wp14:editId="482E811B">
+          <wp:inline distT="0" distB="0" distL="0" distR="0" wp14:anchorId="1F9E2D7C" wp14:editId="1243A5F2">
             <wp:extent cx="5274310" cy="798998"/>
             <wp:effectExtent l="0" t="0" r="2540" b="1270"/>
             <wp:docPr id="18" name="图片 18"/>
@@ -5899,7 +6002,7 @@
           <w:noProof/>
         </w:rPr>
         <w:drawing>
-          <wp:inline distT="0" distB="0" distL="0" distR="0" wp14:anchorId="086E2BD5" wp14:editId="15B06A19">
+          <wp:inline distT="0" distB="0" distL="0" distR="0" wp14:anchorId="4841FBB9" wp14:editId="2662B4A3">
             <wp:extent cx="5274310" cy="1043940"/>
             <wp:effectExtent l="0" t="0" r="2540" b="3810"/>
             <wp:docPr id="19" name="图片 19"/>
@@ -6130,7 +6233,7 @@
 </file>
 
 <file path=word/endnotes.xml><?xml version="1.0" encoding="utf-8"?>
-<w:endnotes xmlns:wpc="http://schemas.microsoft.com/office/word/2010/wordprocessingCanvas" xmlns:cx="http://schemas.microsoft.com/office/drawing/2014/chartex" xmlns:cx1="http://schemas.microsoft.com/office/drawing/2015/9/8/chartex" xmlns:cx2="http://schemas.microsoft.com/office/drawing/2015/10/21/chartex" xmlns:cx3="http://schemas.microsoft.com/office/drawing/2016/5/9/chartex" xmlns:cx4="http://schemas.microsoft.com/office/drawing/2016/5/10/chartex" xmlns:cx5="http://schemas.microsoft.com/office/drawing/2016/5/11/chartex" xmlns:cx6="http://schemas.microsoft.com/office/drawing/2016/5/12/chartex" xmlns:cx7="http://schemas.microsoft.com/office/drawing/2016/5/13/chartex" xmlns:cx8="http://schemas.microsoft.com/office/drawing/2016/5/14/chartex" xmlns:mc="http://schemas.openxmlformats.org/markup-compatibility/2006" xmlns:aink="http://schemas.microsoft.com/office/drawing/2016/ink" xmlns:am3d="http://schemas.microsoft.com/office/drawing/2017/model3d" xmlns:o="urn:schemas-microsoft-com:office:office" xmlns:r="http://schemas.openxmlformats.org/officeDocument/2006/relationships" xmlns:m="http://schemas.openxmlformats.org/officeDocument/2006/math" xmlns:v="urn:schemas-microsoft-com:vml" xmlns:wp14="http://schemas.microsoft.com/office/word/2010/wordprocessingDrawing" xmlns:wp="http://schemas.openxmlformats.org/drawingml/2006/wordprocessingDrawing" xmlns:w10="urn:schemas-microsoft-com:office:word" xmlns:w="http://schemas.openxmlformats.org/wordprocessingml/2006/main" xmlns:w14="http://schemas.microsoft.com/office/word/2010/wordml" xmlns:w15="http://schemas.microsoft.com/office/word/2012/wordml" xmlns:w16cid="http://schemas.microsoft.com/office/word/2016/wordml/cid" xmlns:w16se="http://schemas.microsoft.com/office/word/2015/wordml/symex" xmlns:wpg="http://schemas.microsoft.com/office/word/2010/wordprocessingGroup" xmlns:wpi="http://schemas.microsoft.com/office/word/2010/wordprocessingInk" xmlns:wne="http://schemas.microsoft.com/office/word/2006/wordml" xmlns:wps="http://schemas.microsoft.com/office/word/2010/wordprocessingShape" mc:Ignorable="w14 w15 w16se w16cid wp14">
+<w:endnotes xmlns:wpc="http://schemas.microsoft.com/office/word/2010/wordprocessingCanvas" xmlns:cx="http://schemas.microsoft.com/office/drawing/2014/chartex" xmlns:cx1="http://schemas.microsoft.com/office/drawing/2015/9/8/chartex" xmlns:cx2="http://schemas.microsoft.com/office/drawing/2015/10/21/chartex" xmlns:cx3="http://schemas.microsoft.com/office/drawing/2016/5/9/chartex" xmlns:cx4="http://schemas.microsoft.com/office/drawing/2016/5/10/chartex" xmlns:cx5="http://schemas.microsoft.com/office/drawing/2016/5/11/chartex" xmlns:cx6="http://schemas.microsoft.com/office/drawing/2016/5/12/chartex" xmlns:cx7="http://schemas.microsoft.com/office/drawing/2016/5/13/chartex" xmlns:cx8="http://schemas.microsoft.com/office/drawing/2016/5/14/chartex" xmlns:mc="http://schemas.openxmlformats.org/markup-compatibility/2006" xmlns:aink="http://schemas.microsoft.com/office/drawing/2016/ink" xmlns:am3d="http://schemas.microsoft.com/office/drawing/2017/model3d" xmlns:o="urn:schemas-microsoft-com:office:office" xmlns:r="http://schemas.openxmlformats.org/officeDocument/2006/relationships" xmlns:m="http://schemas.openxmlformats.org/officeDocument/2006/math" xmlns:v="urn:schemas-microsoft-com:vml" xmlns:wp14="http://schemas.microsoft.com/office/word/2010/wordprocessingDrawing" xmlns:wp="http://schemas.openxmlformats.org/drawingml/2006/wordprocessingDrawing" xmlns:w10="urn:schemas-microsoft-com:office:word" xmlns:w="http://schemas.openxmlformats.org/wordprocessingml/2006/main" xmlns:w14="http://schemas.microsoft.com/office/word/2010/wordml" xmlns:w15="http://schemas.microsoft.com/office/word/2012/wordml" xmlns:w16cex="http://schemas.microsoft.com/office/word/2018/wordml/cex" xmlns:w16cid="http://schemas.microsoft.com/office/word/2016/wordml/cid" xmlns:w16="http://schemas.microsoft.com/office/word/2018/wordml" xmlns:w16se="http://schemas.microsoft.com/office/word/2015/wordml/symex" xmlns:wpg="http://schemas.microsoft.com/office/word/2010/wordprocessingGroup" xmlns:wpi="http://schemas.microsoft.com/office/word/2010/wordprocessingInk" xmlns:wne="http://schemas.microsoft.com/office/word/2006/wordml" xmlns:wps="http://schemas.microsoft.com/office/word/2010/wordprocessingShape" mc:Ignorable="w14 w15 w16se w16cid w16 w16cex wp14">
   <w:endnote w:type="separator" w:id="-1">
     <w:p>
       <w:r>
@@ -6149,7 +6252,7 @@
 </file>
 
 <file path=word/footnotes.xml><?xml version="1.0" encoding="utf-8"?>
-<w:footnotes xmlns:wpc="http://schemas.microsoft.com/office/word/2010/wordprocessingCanvas" xmlns:cx="http://schemas.microsoft.com/office/drawing/2014/chartex" xmlns:cx1="http://schemas.microsoft.com/office/drawing/2015/9/8/chartex" xmlns:cx2="http://schemas.microsoft.com/office/drawing/2015/10/21/chartex" xmlns:cx3="http://schemas.microsoft.com/office/drawing/2016/5/9/chartex" xmlns:cx4="http://schemas.microsoft.com/office/drawing/2016/5/10/chartex" xmlns:cx5="http://schemas.microsoft.com/office/drawing/2016/5/11/chartex" xmlns:cx6="http://schemas.microsoft.com/office/drawing/2016/5/12/chartex" xmlns:cx7="http://schemas.microsoft.com/office/drawing/2016/5/13/chartex" xmlns:cx8="http://schemas.microsoft.com/office/drawing/2016/5/14/chartex" xmlns:mc="http://schemas.openxmlformats.org/markup-compatibility/2006" xmlns:aink="http://schemas.microsoft.com/office/drawing/2016/ink" xmlns:am3d="http://schemas.microsoft.com/office/drawing/2017/model3d" xmlns:o="urn:schemas-microsoft-com:office:office" xmlns:r="http://schemas.openxmlformats.org/officeDocument/2006/relationships" xmlns:m="http://schemas.openxmlformats.org/officeDocument/2006/math" xmlns:v="urn:schemas-microsoft-com:vml" xmlns:wp14="http://schemas.microsoft.com/office/word/2010/wordprocessingDrawing" xmlns:wp="http://schemas.openxmlformats.org/drawingml/2006/wordprocessingDrawing" xmlns:w10="urn:schemas-microsoft-com:office:word" xmlns:w="http://schemas.openxmlformats.org/wordprocessingml/2006/main" xmlns:w14="http://schemas.microsoft.com/office/word/2010/wordml" xmlns:w15="http://schemas.microsoft.com/office/word/2012/wordml" xmlns:w16cid="http://schemas.microsoft.com/office/word/2016/wordml/cid" xmlns:w16se="http://schemas.microsoft.com/office/word/2015/wordml/symex" xmlns:wpg="http://schemas.microsoft.com/office/word/2010/wordprocessingGroup" xmlns:wpi="http://schemas.microsoft.com/office/word/2010/wordprocessingInk" xmlns:wne="http://schemas.microsoft.com/office/word/2006/wordml" xmlns:wps="http://schemas.microsoft.com/office/word/2010/wordprocessingShape" mc:Ignorable="w14 w15 w16se w16cid wp14">
+<w:footnotes xmlns:wpc="http://schemas.microsoft.com/office/word/2010/wordprocessingCanvas" xmlns:cx="http://schemas.microsoft.com/office/drawing/2014/chartex" xmlns:cx1="http://schemas.microsoft.com/office/drawing/2015/9/8/chartex" xmlns:cx2="http://schemas.microsoft.com/office/drawing/2015/10/21/chartex" xmlns:cx3="http://schemas.microsoft.com/office/drawing/2016/5/9/chartex" xmlns:cx4="http://schemas.microsoft.com/office/drawing/2016/5/10/chartex" xmlns:cx5="http://schemas.microsoft.com/office/drawing/2016/5/11/chartex" xmlns:cx6="http://schemas.microsoft.com/office/drawing/2016/5/12/chartex" xmlns:cx7="http://schemas.microsoft.com/office/drawing/2016/5/13/chartex" xmlns:cx8="http://schemas.microsoft.com/office/drawing/2016/5/14/chartex" xmlns:mc="http://schemas.openxmlformats.org/markup-compatibility/2006" xmlns:aink="http://schemas.microsoft.com/office/drawing/2016/ink" xmlns:am3d="http://schemas.microsoft.com/office/drawing/2017/model3d" xmlns:o="urn:schemas-microsoft-com:office:office" xmlns:r="http://schemas.openxmlformats.org/officeDocument/2006/relationships" xmlns:m="http://schemas.openxmlformats.org/officeDocument/2006/math" xmlns:v="urn:schemas-microsoft-com:vml" xmlns:wp14="http://schemas.microsoft.com/office/word/2010/wordprocessingDrawing" xmlns:wp="http://schemas.openxmlformats.org/drawingml/2006/wordprocessingDrawing" xmlns:w10="urn:schemas-microsoft-com:office:word" xmlns:w="http://schemas.openxmlformats.org/wordprocessingml/2006/main" xmlns:w14="http://schemas.microsoft.com/office/word/2010/wordml" xmlns:w15="http://schemas.microsoft.com/office/word/2012/wordml" xmlns:w16cex="http://schemas.microsoft.com/office/word/2018/wordml/cex" xmlns:w16cid="http://schemas.microsoft.com/office/word/2016/wordml/cid" xmlns:w16="http://schemas.microsoft.com/office/word/2018/wordml" xmlns:w16se="http://schemas.microsoft.com/office/word/2015/wordml/symex" xmlns:wpg="http://schemas.microsoft.com/office/word/2010/wordprocessingGroup" xmlns:wpi="http://schemas.microsoft.com/office/word/2010/wordprocessingInk" xmlns:wne="http://schemas.microsoft.com/office/word/2006/wordml" xmlns:wps="http://schemas.microsoft.com/office/word/2010/wordprocessingShape" mc:Ignorable="w14 w15 w16se w16cid w16 w16cex wp14">
   <w:footnote w:type="separator" w:id="-1">
     <w:p>
       <w:r>
@@ -6168,7 +6271,7 @@
 </file>
 
 <file path=word/numbering.xml><?xml version="1.0" encoding="utf-8"?>
-<w:numbering xmlns:wpc="http://schemas.microsoft.com/office/word/2010/wordprocessingCanvas" xmlns:cx="http://schemas.microsoft.com/office/drawing/2014/chartex" xmlns:cx1="http://schemas.microsoft.com/office/drawing/2015/9/8/chartex" xmlns:cx2="http://schemas.microsoft.com/office/drawing/2015/10/21/chartex" xmlns:cx3="http://schemas.microsoft.com/office/drawing/2016/5/9/chartex" xmlns:cx4="http://schemas.microsoft.com/office/drawing/2016/5/10/chartex" xmlns:cx5="http://schemas.microsoft.com/office/drawing/2016/5/11/chartex" xmlns:cx6="http://schemas.microsoft.com/office/drawing/2016/5/12/chartex" xmlns:cx7="http://schemas.microsoft.com/office/drawing/2016/5/13/chartex" xmlns:cx8="http://schemas.microsoft.com/office/drawing/2016/5/14/chartex" xmlns:mc="http://schemas.openxmlformats.org/markup-compatibility/2006" xmlns:aink="http://schemas.microsoft.com/office/drawing/2016/ink" xmlns:am3d="http://schemas.microsoft.com/office/drawing/2017/model3d" xmlns:o="urn:schemas-microsoft-com:office:office" xmlns:r="http://schemas.openxmlformats.org/officeDocument/2006/relationships" xmlns:m="http://schemas.openxmlformats.org/officeDocument/2006/math" xmlns:v="urn:schemas-microsoft-com:vml" xmlns:wp14="http://schemas.microsoft.com/office/word/2010/wordprocessingDrawing" xmlns:wp="http://schemas.openxmlformats.org/drawingml/2006/wordprocessingDrawing" xmlns:w10="urn:schemas-microsoft-com:office:word" xmlns:w="http://schemas.openxmlformats.org/wordprocessingml/2006/main" xmlns:w14="http://schemas.microsoft.com/office/word/2010/wordml" xmlns:w15="http://schemas.microsoft.com/office/word/2012/wordml" xmlns:w16cid="http://schemas.microsoft.com/office/word/2016/wordml/cid" xmlns:w16se="http://schemas.microsoft.com/office/word/2015/wordml/symex" xmlns:wpg="http://schemas.microsoft.com/office/word/2010/wordprocessingGroup" xmlns:wpi="http://schemas.microsoft.com/office/word/2010/wordprocessingInk" xmlns:wne="http://schemas.microsoft.com/office/word/2006/wordml" xmlns:wps="http://schemas.microsoft.com/office/word/2010/wordprocessingShape" mc:Ignorable="w14 w15 w16se w16cid wp14">
+<w:numbering xmlns:wpc="http://schemas.microsoft.com/office/word/2010/wordprocessingCanvas" xmlns:cx="http://schemas.microsoft.com/office/drawing/2014/chartex" xmlns:cx1="http://schemas.microsoft.com/office/drawing/2015/9/8/chartex" xmlns:cx2="http://schemas.microsoft.com/office/drawing/2015/10/21/chartex" xmlns:cx3="http://schemas.microsoft.com/office/drawing/2016/5/9/chartex" xmlns:cx4="http://schemas.microsoft.com/office/drawing/2016/5/10/chartex" xmlns:cx5="http://schemas.microsoft.com/office/drawing/2016/5/11/chartex" xmlns:cx6="http://schemas.microsoft.com/office/drawing/2016/5/12/chartex" xmlns:cx7="http://schemas.microsoft.com/office/drawing/2016/5/13/chartex" xmlns:cx8="http://schemas.microsoft.com/office/drawing/2016/5/14/chartex" xmlns:mc="http://schemas.openxmlformats.org/markup-compatibility/2006" xmlns:aink="http://schemas.microsoft.com/office/drawing/2016/ink" xmlns:am3d="http://schemas.microsoft.com/office/drawing/2017/model3d" xmlns:o="urn:schemas-microsoft-com:office:office" xmlns:r="http://schemas.openxmlformats.org/officeDocument/2006/relationships" xmlns:m="http://schemas.openxmlformats.org/officeDocument/2006/math" xmlns:v="urn:schemas-microsoft-com:vml" xmlns:wp14="http://schemas.microsoft.com/office/word/2010/wordprocessingDrawing" xmlns:wp="http://schemas.openxmlformats.org/drawingml/2006/wordprocessingDrawing" xmlns:w10="urn:schemas-microsoft-com:office:word" xmlns:w="http://schemas.openxmlformats.org/wordprocessingml/2006/main" xmlns:w14="http://schemas.microsoft.com/office/word/2010/wordml" xmlns:w15="http://schemas.microsoft.com/office/word/2012/wordml" xmlns:w16cex="http://schemas.microsoft.com/office/word/2018/wordml/cex" xmlns:w16cid="http://schemas.microsoft.com/office/word/2016/wordml/cid" xmlns:w16="http://schemas.microsoft.com/office/word/2018/wordml" xmlns:w16se="http://schemas.microsoft.com/office/word/2015/wordml/symex" xmlns:wpg="http://schemas.microsoft.com/office/word/2010/wordprocessingGroup" xmlns:wpi="http://schemas.microsoft.com/office/word/2010/wordprocessingInk" xmlns:wne="http://schemas.microsoft.com/office/word/2006/wordml" xmlns:wps="http://schemas.microsoft.com/office/word/2010/wordprocessingShape" mc:Ignorable="w14 w15 w16se w16cid w16 w16cex wp14">
   <w:abstractNum w:abstractNumId="0" w15:restartNumberingAfterBreak="0">
     <w:nsid w:val="2BE23D45"/>
     <w:multiLevelType w:val="hybridMultilevel"/>
@@ -6478,7 +6581,7 @@
 </file>
 
 <file path=word/styles.xml><?xml version="1.0" encoding="utf-8"?>
-<w:styles xmlns:mc="http://schemas.openxmlformats.org/markup-compatibility/2006" xmlns:r="http://schemas.openxmlformats.org/officeDocument/2006/relationships" xmlns:w="http://schemas.openxmlformats.org/wordprocessingml/2006/main" xmlns:w14="http://schemas.microsoft.com/office/word/2010/wordml" xmlns:w15="http://schemas.microsoft.com/office/word/2012/wordml" xmlns:w16cid="http://schemas.microsoft.com/office/word/2016/wordml/cid" xmlns:w16se="http://schemas.microsoft.com/office/word/2015/wordml/symex" mc:Ignorable="w14 w15 w16se w16cid">
+<w:styles xmlns:mc="http://schemas.openxmlformats.org/markup-compatibility/2006" xmlns:r="http://schemas.openxmlformats.org/officeDocument/2006/relationships" xmlns:w="http://schemas.openxmlformats.org/wordprocessingml/2006/main" xmlns:w14="http://schemas.microsoft.com/office/word/2010/wordml" xmlns:w15="http://schemas.microsoft.com/office/word/2012/wordml" xmlns:w16cex="http://schemas.microsoft.com/office/word/2018/wordml/cex" xmlns:w16cid="http://schemas.microsoft.com/office/word/2016/wordml/cid" xmlns:w16="http://schemas.microsoft.com/office/word/2018/wordml" xmlns:w16se="http://schemas.microsoft.com/office/word/2015/wordml/symex" mc:Ignorable="w14 w15 w16se w16cid w16 w16cex">
   <w:docDefaults>
     <w:rPrDefault>
       <w:rPr>
@@ -6597,6 +6700,7 @@
     <w:lsdException w:name="HTML Sample" w:semiHidden="1" w:unhideWhenUsed="1"/>
     <w:lsdException w:name="HTML Typewriter" w:semiHidden="1" w:unhideWhenUsed="1"/>
     <w:lsdException w:name="HTML Variable" w:semiHidden="1" w:unhideWhenUsed="1"/>
+    <w:lsdException w:name="Normal Table" w:semiHidden="1" w:unhideWhenUsed="1"/>
     <w:lsdException w:name="annotation subject" w:semiHidden="1" w:unhideWhenUsed="1"/>
     <w:lsdException w:name="No List" w:semiHidden="1" w:unhideWhenUsed="1"/>
     <w:lsdException w:name="Outline List 1" w:semiHidden="1" w:unhideWhenUsed="1"/>
@@ -6639,8 +6743,11 @@
     <w:lsdException w:name="Table Contemporary" w:semiHidden="1" w:unhideWhenUsed="1"/>
     <w:lsdException w:name="Table Elegant" w:semiHidden="1" w:unhideWhenUsed="1"/>
     <w:lsdException w:name="Table Professional" w:semiHidden="1" w:unhideWhenUsed="1"/>
+    <w:lsdException w:name="Table Subtle 1" w:semiHidden="1" w:unhideWhenUsed="1"/>
     <w:lsdException w:name="Table Subtle 2" w:semiHidden="1" w:unhideWhenUsed="1"/>
     <w:lsdException w:name="Table Web 1" w:semiHidden="1" w:unhideWhenUsed="1"/>
+    <w:lsdException w:name="Table Web 2" w:semiHidden="1" w:unhideWhenUsed="1"/>
+    <w:lsdException w:name="Table Web 3" w:semiHidden="1" w:unhideWhenUsed="1"/>
     <w:lsdException w:name="Balloon Text" w:semiHidden="1" w:unhideWhenUsed="1"/>
     <w:lsdException w:name="Table Grid" w:uiPriority="39"/>
     <w:lsdException w:name="Table Theme" w:semiHidden="1" w:unhideWhenUsed="1"/>
@@ -7050,6 +7157,18 @@
       <w:ind w:firstLineChars="200" w:firstLine="420"/>
     </w:pPr>
   </w:style>
+  <w:style w:type="character" w:styleId="ac">
+    <w:name w:val="Unresolved Mention"/>
+    <w:basedOn w:val="a0"/>
+    <w:uiPriority w:val="99"/>
+    <w:semiHidden/>
+    <w:unhideWhenUsed/>
+    <w:rsid w:val="007934B1"/>
+    <w:rPr>
+      <w:color w:val="605E5C"/>
+      <w:shd w:val="clear" w:color="auto" w:fill="E1DFDD"/>
+    </w:rPr>
+  </w:style>
 </w:styles>
 </file>
 

</xml_diff>

<commit_message>
change static/templates file default folder and prepare deployed frontend pages and design backend to connect/docking
</commit_message>
<xml_diff>
--- a/demo介绍.docx
+++ b/demo介绍.docx
@@ -323,7 +323,31 @@
           <w:sz w:val="24"/>
           <w:szCs w:val="24"/>
         </w:rPr>
-        <w:t>可以理解为生物信息分析过程抽象的一个步骤，一个切面，一个基本单元。类似与F</w:t>
+        <w:t>可以理解为生物信息分析过程抽象的一个步骤，一个切面，一个基本单元</w:t>
+      </w:r>
+      <w:r>
+        <w:rPr>
+          <w:rFonts w:ascii="楷体" w:eastAsia="楷体" w:hAnsi="楷体" w:hint="eastAsia"/>
+          <w:sz w:val="24"/>
+          <w:szCs w:val="24"/>
+        </w:rPr>
+        <w:t>(输入输出之间不能再有输入和输出</w:t>
+      </w:r>
+      <w:r>
+        <w:rPr>
+          <w:rFonts w:ascii="楷体" w:eastAsia="楷体" w:hAnsi="楷体"/>
+          <w:sz w:val="24"/>
+          <w:szCs w:val="24"/>
+        </w:rPr>
+        <w:t>)</w:t>
+      </w:r>
+      <w:r>
+        <w:rPr>
+          <w:rFonts w:ascii="楷体" w:eastAsia="楷体" w:hAnsi="楷体" w:hint="eastAsia"/>
+          <w:sz w:val="24"/>
+          <w:szCs w:val="24"/>
+        </w:rPr>
+        <w:t>。类似与F</w:t>
       </w:r>
       <w:r>
         <w:rPr>
@@ -495,7 +519,7 @@
     <w:p>
       <w:pPr>
         <w:rPr>
-          <w:rFonts w:ascii="楷体" w:eastAsia="楷体" w:hAnsi="楷体" w:hint="eastAsia"/>
+          <w:rFonts w:ascii="楷体" w:eastAsia="楷体" w:hAnsi="楷体"/>
           <w:b/>
           <w:bCs/>
           <w:sz w:val="24"/>
@@ -557,6 +581,173 @@
       <w:pPr>
         <w:rPr>
           <w:rFonts w:ascii="楷体" w:eastAsia="楷体" w:hAnsi="楷体"/>
+          <w:b/>
+          <w:bCs/>
+          <w:sz w:val="24"/>
+          <w:szCs w:val="24"/>
+        </w:rPr>
+      </w:pPr>
+      <w:r>
+        <w:rPr>
+          <w:rFonts w:ascii="楷体" w:eastAsia="楷体" w:hAnsi="楷体" w:hint="eastAsia"/>
+          <w:b/>
+          <w:bCs/>
+          <w:sz w:val="24"/>
+          <w:szCs w:val="24"/>
+        </w:rPr>
+        <w:t>从应用的角度出发这个产品是在改变目前的工作方式，所以更多是需要类似这种动态的</w:t>
+      </w:r>
+      <w:r>
+        <w:rPr>
+          <w:rFonts w:ascii="楷体" w:eastAsia="楷体" w:hAnsi="楷体"/>
+          <w:b/>
+          <w:bCs/>
+          <w:sz w:val="24"/>
+          <w:szCs w:val="24"/>
+        </w:rPr>
+        <w:t xml:space="preserve"> 级联变化 这种级别的功能，使得界面舒适简明流畅，我想的理念是尽可能使得界面非常易于理解，将很多复杂的控制隐藏在联想功能后面，随着用户的逻辑逐渐呈现出这些控件，很多情况下直接沿用历史参数。 咱们可以互相发挥专业继续探讨，当然还是尽快见到哪怕0.1版本的产品可能更能明确后续的设计。</w:t>
+      </w:r>
+    </w:p>
+    <w:p>
+      <w:pPr>
+        <w:rPr>
+          <w:rFonts w:ascii="楷体" w:eastAsia="楷体" w:hAnsi="楷体"/>
+          <w:b/>
+          <w:bCs/>
+          <w:sz w:val="24"/>
+          <w:szCs w:val="24"/>
+        </w:rPr>
+      </w:pPr>
+      <w:r>
+        <w:rPr>
+          <w:rFonts w:ascii="楷体" w:eastAsia="楷体" w:hAnsi="楷体" w:hint="eastAsia"/>
+          <w:b/>
+          <w:bCs/>
+          <w:sz w:val="24"/>
+          <w:szCs w:val="24"/>
+        </w:rPr>
+        <w:t>流程划分，整理</w:t>
+      </w:r>
+    </w:p>
+    <w:p>
+      <w:pPr>
+        <w:rPr>
+          <w:rFonts w:ascii="楷体" w:eastAsia="楷体" w:hAnsi="楷体"/>
+          <w:b/>
+          <w:bCs/>
+          <w:sz w:val="24"/>
+          <w:szCs w:val="24"/>
+        </w:rPr>
+      </w:pPr>
+      <w:r>
+        <w:rPr>
+          <w:rFonts w:ascii="楷体" w:eastAsia="楷体" w:hAnsi="楷体" w:hint="eastAsia"/>
+          <w:b/>
+          <w:bCs/>
+          <w:sz w:val="24"/>
+          <w:szCs w:val="24"/>
+        </w:rPr>
+        <w:t>文件</w:t>
+      </w:r>
+      <w:r>
+        <w:rPr>
+          <w:rFonts w:ascii="楷体" w:eastAsia="楷体" w:hAnsi="楷体"/>
+          <w:b/>
+          <w:bCs/>
+          <w:sz w:val="24"/>
+          <w:szCs w:val="24"/>
+        </w:rPr>
+        <w:t xml:space="preserve"> </w:t>
+      </w:r>
+      <w:r>
+        <w:rPr>
+          <w:rFonts w:ascii="楷体" w:eastAsia="楷体" w:hAnsi="楷体" w:hint="eastAsia"/>
+          <w:b/>
+          <w:bCs/>
+          <w:sz w:val="24"/>
+          <w:szCs w:val="24"/>
+        </w:rPr>
+        <w:t>数据 按照逻辑重新组织，整理，成为新的数据集。</w:t>
+      </w:r>
+    </w:p>
+    <w:p>
+      <w:pPr>
+        <w:rPr>
+          <w:rFonts w:ascii="楷体" w:eastAsia="楷体" w:hAnsi="楷体"/>
+          <w:b/>
+          <w:bCs/>
+          <w:sz w:val="24"/>
+          <w:szCs w:val="24"/>
+        </w:rPr>
+      </w:pPr>
+      <w:r>
+        <w:rPr>
+          <w:rFonts w:ascii="楷体" w:eastAsia="楷体" w:hAnsi="楷体" w:hint="eastAsia"/>
+          <w:b/>
+          <w:bCs/>
+          <w:sz w:val="24"/>
+          <w:szCs w:val="24"/>
+        </w:rPr>
+        <w:t>算法、统计分析等方向的人员可以再流程上做贡献，那么就要有良好的沟通和对接，展示界面及方式方面的考量。</w:t>
+      </w:r>
+    </w:p>
+    <w:p>
+      <w:pPr>
+        <w:rPr>
+          <w:rFonts w:ascii="楷体" w:eastAsia="楷体" w:hAnsi="楷体"/>
+          <w:b/>
+          <w:bCs/>
+          <w:sz w:val="24"/>
+          <w:szCs w:val="24"/>
+        </w:rPr>
+      </w:pPr>
+      <w:r>
+        <w:rPr>
+          <w:rFonts w:ascii="楷体" w:eastAsia="楷体" w:hAnsi="楷体" w:hint="eastAsia"/>
+          <w:b/>
+          <w:bCs/>
+          <w:sz w:val="24"/>
+          <w:szCs w:val="24"/>
+        </w:rPr>
+        <w:t>非代码人员可以直接利用已有的代码模块。</w:t>
+      </w:r>
+    </w:p>
+    <w:p>
+      <w:pPr>
+        <w:rPr>
+          <w:rFonts w:ascii="楷体" w:eastAsia="楷体" w:hAnsi="楷体" w:hint="eastAsia"/>
+          <w:b/>
+          <w:bCs/>
+          <w:sz w:val="24"/>
+          <w:szCs w:val="24"/>
+        </w:rPr>
+      </w:pPr>
+      <w:r>
+        <w:rPr>
+          <w:rFonts w:ascii="楷体" w:eastAsia="楷体" w:hAnsi="楷体" w:hint="eastAsia"/>
+          <w:b/>
+          <w:bCs/>
+          <w:sz w:val="24"/>
+          <w:szCs w:val="24"/>
+        </w:rPr>
+        <w:t>搜索</w:t>
+      </w:r>
+    </w:p>
+    <w:p>
+      <w:pPr>
+        <w:rPr>
+          <w:rFonts w:ascii="楷体" w:eastAsia="楷体" w:hAnsi="楷体"/>
+          <w:b/>
+          <w:bCs/>
+          <w:sz w:val="24"/>
+          <w:szCs w:val="24"/>
+        </w:rPr>
+      </w:pPr>
+    </w:p>
+    <w:p>
+      <w:pPr>
+        <w:rPr>
+          <w:rFonts w:ascii="楷体" w:eastAsia="楷体" w:hAnsi="楷体"/>
           <w:sz w:val="24"/>
           <w:szCs w:val="24"/>
         </w:rPr>
@@ -592,7 +783,16 @@
           <w:sz w:val="24"/>
           <w:szCs w:val="24"/>
         </w:rPr>
-        <w:t xml:space="preserve"> 在 https://github.com/vitogump/life/tree/mergetocompass 中下载lifeWebBasedSystemUserGuide.pptx文件有个非常粗</w:t>
+        <w:t xml:space="preserve"> 在 https://github.com/vitogump/life/tree/mergetocompass 中下载</w:t>
+      </w:r>
+      <w:r>
+        <w:rPr>
+          <w:rFonts w:ascii="楷体" w:eastAsia="楷体" w:hAnsi="楷体"/>
+          <w:sz w:val="24"/>
+          <w:szCs w:val="24"/>
+        </w:rPr>
+        <w:lastRenderedPageBreak/>
+        <w:t>lifeWebBasedSystemUserGuide.pptx文件有个非常粗</w:t>
       </w:r>
       <w:r>
         <w:rPr>
@@ -856,7 +1056,6 @@
           <w:sz w:val="24"/>
           <w:szCs w:val="24"/>
         </w:rPr>
-        <w:lastRenderedPageBreak/>
         <w:t>假如原始数据存放的目录结构为：</w:t>
       </w:r>
     </w:p>
@@ -1445,6 +1644,7 @@
           <w:sz w:val="24"/>
           <w:szCs w:val="24"/>
         </w:rPr>
+        <w:lastRenderedPageBreak/>
         <w:drawing>
           <wp:inline distT="0" distB="0" distL="0" distR="0" wp14:anchorId="71F66564" wp14:editId="149CB267">
             <wp:extent cx="3400000" cy="761905"/>
@@ -1630,7 +1830,6 @@
           <w:sz w:val="24"/>
           <w:szCs w:val="24"/>
         </w:rPr>
-        <w:lastRenderedPageBreak/>
         <mc:AlternateContent>
           <mc:Choice Requires="wps">
             <w:drawing>
@@ -1991,7 +2190,17 @@
           <w:sz w:val="24"/>
           <w:szCs w:val="24"/>
         </w:rPr>
-        <w:t>）。提交就好，但是假如说我们只想运行一部分，比如只处理一级子目录为</w:t>
+        <w:t>）。提交就好，但是假</w:t>
+      </w:r>
+      <w:r>
+        <w:rPr>
+          <w:rFonts w:ascii="Times New Roman" w:eastAsia="楷体" w:hAnsi="Times New Roman" w:cs="Times New Roman" w:hint="eastAsia"/>
+          <w:color w:val="000000" w:themeColor="text1"/>
+          <w:sz w:val="24"/>
+          <w:szCs w:val="24"/>
+        </w:rPr>
+        <w:lastRenderedPageBreak/>
+        <w:t>如说我们只想运行一部分，比如只处理一级子目录为</w:t>
       </w:r>
       <w:r>
         <w:rPr>
@@ -2143,7 +2352,6 @@
           <w:sz w:val="24"/>
           <w:szCs w:val="24"/>
         </w:rPr>
-        <w:lastRenderedPageBreak/>
         <w:drawing>
           <wp:inline distT="0" distB="0" distL="0" distR="0" wp14:anchorId="434EBAFC" wp14:editId="3E682904">
             <wp:extent cx="4695238" cy="809524"/>
@@ -2439,6 +2647,7 @@
           <w:sz w:val="24"/>
           <w:szCs w:val="24"/>
         </w:rPr>
+        <w:lastRenderedPageBreak/>
         <w:drawing>
           <wp:inline distT="0" distB="0" distL="0" distR="0" wp14:anchorId="0D7DDF4D" wp14:editId="30EC513C">
             <wp:extent cx="5274310" cy="2660650"/>
@@ -2672,7 +2881,6 @@
           <w:sz w:val="24"/>
           <w:szCs w:val="24"/>
         </w:rPr>
-        <w:lastRenderedPageBreak/>
         <w:t>这里只是提供</w:t>
       </w:r>
       <w:r>
@@ -2954,6 +3162,7 @@
           <w:sz w:val="24"/>
           <w:szCs w:val="24"/>
         </w:rPr>
+        <w:lastRenderedPageBreak/>
         <w:drawing>
           <wp:inline distT="0" distB="0" distL="0" distR="0" wp14:anchorId="7055E845" wp14:editId="2ABCA02B">
             <wp:extent cx="2571750" cy="1442511"/>
@@ -3095,7 +3304,6 @@
           <w:sz w:val="24"/>
           <w:szCs w:val="24"/>
         </w:rPr>
-        <w:lastRenderedPageBreak/>
         <w:drawing>
           <wp:inline distT="0" distB="0" distL="0" distR="0" wp14:anchorId="21596A43" wp14:editId="7E4E619B">
             <wp:extent cx="5274310" cy="4286250"/>
@@ -3294,6 +3502,7 @@
           <w:sz w:val="24"/>
           <w:szCs w:val="24"/>
         </w:rPr>
+        <w:lastRenderedPageBreak/>
         <w:t>。。。。。。</w:t>
       </w:r>
     </w:p>
@@ -3357,16 +3566,7 @@
           <w:sz w:val="24"/>
           <w:szCs w:val="24"/>
         </w:rPr>
-        <w:t>针对数据分析实验的可重复性问题, Geir等人提出了十条简单的原则: 1) 对每一个结果, 保存得到这个结果的Track。2) 避免手工的数据处理。因为程序处理只要逻辑正确语法正确则结果就一定正确, 而手工处理的话出现各种各样的问题的可能性较大。3) 记录所有使用的软件的版本。4) 对所有自编脚本进行版本控制。可以采用标准的代码改进追踪解决方案, 比如Git、Subversion等。5) 尽可能保存中间结果, 至少在进行一项分析的时候保存这项分析的所有中间结果。6) 对包含随机数的分析保存该随机数。7) 总是保存画图所使用的数据。8) 生成层级分析结果, 使得每一增加细节的环节都可以被调查。9) 为每一个分析结果的产生注释一段文本的说明。使得研究者再回过头来看的时候, 可以快速明白这个分析的参数的设置过程中都考虑了哪些因素。10) 提供可公开访问的</w:t>
-      </w:r>
-      <w:r>
-        <w:rPr>
-          <w:rFonts w:ascii="楷体" w:eastAsia="楷体" w:hAnsi="楷体"/>
-          <w:sz w:val="24"/>
-          <w:szCs w:val="24"/>
-        </w:rPr>
-        <w:lastRenderedPageBreak/>
-        <w:t>输入数据, 脚本, 版本和参数等。</w:t>
+        <w:t>针对数据分析实验的可重复性问题, Geir等人提出了十条简单的原则: 1) 对每一个结果, 保存得到这个结果的Track。2) 避免手工的数据处理。因为程序处理只要逻辑正确语法正确则结果就一定正确, 而手工处理的话出现各种各样的问题的可能性较大。3) 记录所有使用的软件的版本。4) 对所有自编脚本进行版本控制。可以采用标准的代码改进追踪解决方案, 比如Git、Subversion等。5) 尽可能保存中间结果, 至少在进行一项分析的时候保存这项分析的所有中间结果。6) 对包含随机数的分析保存该随机数。7) 总是保存画图所使用的数据。8) 生成层级分析结果, 使得每一增加细节的环节都可以被调查。9) 为每一个分析结果的产生注释一段文本的说明。使得研究者再回过头来看的时候, 可以快速明白这个分析的参数的设置过程中都考虑了哪些因素。10) 提供可公开访问的输入数据, 脚本, 版本和参数等。</w:t>
       </w:r>
       <w:r>
         <w:rPr>
@@ -3921,6 +4121,7 @@
           <w:sz w:val="24"/>
           <w:szCs w:val="24"/>
         </w:rPr>
+        <w:lastRenderedPageBreak/>
         <w:drawing>
           <wp:inline distT="0" distB="0" distL="0" distR="0" wp14:anchorId="20036C46" wp14:editId="3E5D81BC">
             <wp:extent cx="5274310" cy="4142740"/>

</xml_diff>